<commit_message>
nmv 10 05 2026
</commit_message>
<xml_diff>
--- a/TS Jatai Ghanam Project/TS 1.6/TS 1.6 Ghanam Malayalam Corrections.docx
+++ b/TS Jatai Ghanam Project/TS 1.6/TS 1.6 Ghanam Malayalam Corrections.docx
@@ -1,7 +1,664 @@
 
 <file path=word/document.xml><?xml version="1.0" encoding="utf-8"?>
-<w:document xmlns:wpc="http://schemas.microsoft.com/office/word/2010/wordprocessingCanvas" xmlns:cx="http://schemas.microsoft.com/office/drawing/2014/chartex" xmlns:cx1="http://schemas.microsoft.com/office/drawing/2015/9/8/chartex" xmlns:cx2="http://schemas.microsoft.com/office/drawing/2015/10/21/chartex" xmlns:cx3="http://schemas.microsoft.com/office/drawing/2016/5/9/chartex" xmlns:cx4="http://schemas.microsoft.com/office/drawing/2016/5/10/chartex" xmlns:cx5="http://schemas.microsoft.com/office/drawing/2016/5/11/chartex" xmlns:cx6="http://schemas.microsoft.com/office/drawing/2016/5/12/chartex" xmlns:cx7="http://schemas.microsoft.com/office/drawing/2016/5/13/chartex" xmlns:cx8="http://schemas.microsoft.com/office/drawing/2016/5/14/chartex" xmlns:mc="http://schemas.openxmlformats.org/markup-compatibility/2006" xmlns:aink="http://schemas.microsoft.com/office/drawing/2016/ink" xmlns:am3d="http://schemas.microsoft.com/office/drawing/2017/model3d" xmlns:o="urn:schemas-microsoft-com:office:office" xmlns:oel="http://schemas.microsoft.com/office/2019/extlst" xmlns:r="http://schemas.openxmlformats.org/officeDocument/2006/relationships" xmlns:m="http://schemas.openxmlformats.org/officeDocument/2006/math" xmlns:v="urn:schemas-microsoft-com:vml" xmlns:wp14="http://schemas.microsoft.com/office/word/2010/wordprocessingDrawing" xmlns:wp="http://schemas.openxmlformats.org/drawingml/2006/wordprocessingDrawing" xmlns:w10="urn:schemas-microsoft-com:office:word" xmlns:w="http://schemas.openxmlformats.org/wordprocessingml/2006/main" xmlns:w14="http://schemas.microsoft.com/office/word/2010/wordml" xmlns:w15="http://schemas.microsoft.com/office/word/2012/wordml" xmlns:w16cex="http://schemas.microsoft.com/office/word/2018/wordml/cex" xmlns:w16cid="http://schemas.microsoft.com/office/word/2016/wordml/cid" xmlns:w16="http://schemas.microsoft.com/office/word/2018/wordml" xmlns:w16sdtdh="http://schemas.microsoft.com/office/word/2020/wordml/sdtdatahash" xmlns:w16se="http://schemas.microsoft.com/office/word/2015/wordml/symex" xmlns:wpg="http://schemas.microsoft.com/office/word/2010/wordprocessingGroup" xmlns:wpi="http://schemas.microsoft.com/office/word/2010/wordprocessingInk" xmlns:wne="http://schemas.microsoft.com/office/word/2006/wordml" xmlns:wps="http://schemas.microsoft.com/office/word/2010/wordprocessingShape" mc:Ignorable="w14 w15 w16se w16cid w16 w16cex w16sdtdh wp14">
+<w:document xmlns:wpc="http://schemas.microsoft.com/office/word/2010/wordprocessingCanvas" xmlns:cx="http://schemas.microsoft.com/office/drawing/2014/chartex" xmlns:cx1="http://schemas.microsoft.com/office/drawing/2015/9/8/chartex" xmlns:cx2="http://schemas.microsoft.com/office/drawing/2015/10/21/chartex" xmlns:cx3="http://schemas.microsoft.com/office/drawing/2016/5/9/chartex" xmlns:cx4="http://schemas.microsoft.com/office/drawing/2016/5/10/chartex" xmlns:cx5="http://schemas.microsoft.com/office/drawing/2016/5/11/chartex" xmlns:cx6="http://schemas.microsoft.com/office/drawing/2016/5/12/chartex" xmlns:cx7="http://schemas.microsoft.com/office/drawing/2016/5/13/chartex" xmlns:cx8="http://schemas.microsoft.com/office/drawing/2016/5/14/chartex" xmlns:mc="http://schemas.openxmlformats.org/markup-compatibility/2006" xmlns:aink="http://schemas.microsoft.com/office/drawing/2016/ink" xmlns:am3d="http://schemas.microsoft.com/office/drawing/2017/model3d" xmlns:o="urn:schemas-microsoft-com:office:office" xmlns:oel="http://schemas.microsoft.com/office/2019/extlst" xmlns:r="http://schemas.openxmlformats.org/officeDocument/2006/relationships" xmlns:m="http://schemas.openxmlformats.org/officeDocument/2006/math" xmlns:v="urn:schemas-microsoft-com:vml" xmlns:wp14="http://schemas.microsoft.com/office/word/2010/wordprocessingDrawing" xmlns:wp="http://schemas.openxmlformats.org/drawingml/2006/wordprocessingDrawing" xmlns:w10="urn:schemas-microsoft-com:office:word" xmlns:w="http://schemas.openxmlformats.org/wordprocessingml/2006/main" xmlns:w14="http://schemas.microsoft.com/office/word/2010/wordml" xmlns:w15="http://schemas.microsoft.com/office/word/2012/wordml" xmlns:w16cex="http://schemas.microsoft.com/office/word/2018/wordml/cex" xmlns:w16cid="http://schemas.microsoft.com/office/word/2016/wordml/cid" xmlns:w16="http://schemas.microsoft.com/office/word/2018/wordml" xmlns:w16du="http://schemas.microsoft.com/office/word/2023/wordml/word16du" xmlns:w16sdtdh="http://schemas.microsoft.com/office/word/2020/wordml/sdtdatahash" xmlns:w16sdtfl="http://schemas.microsoft.com/office/word/2024/wordml/sdtformatlock" xmlns:w16se="http://schemas.microsoft.com/office/word/2015/wordml/symex" xmlns:wpg="http://schemas.microsoft.com/office/word/2010/wordprocessingGroup" xmlns:wpi="http://schemas.microsoft.com/office/word/2010/wordprocessingInk" xmlns:wne="http://schemas.microsoft.com/office/word/2006/wordml" xmlns:wps="http://schemas.microsoft.com/office/word/2010/wordprocessingShape" mc:Ignorable="w14 w15 w16se w16cid w16 w16cex w16sdtdh w16sdtfl w16du wp14">
   <w:body>
+    <w:p>
+      <w:pPr>
+        <w:spacing w:before="0" w:line="240" w:lineRule="auto"/>
+        <w:jc w:val="center"/>
+        <w:rPr>
+          <w:b/>
+          <w:bCs/>
+          <w:sz w:val="32"/>
+          <w:szCs w:val="32"/>
+          <w:u w:val="single"/>
+        </w:rPr>
+      </w:pPr>
+      <w:r>
+        <w:rPr>
+          <w:b/>
+          <w:bCs/>
+          <w:sz w:val="32"/>
+          <w:szCs w:val="32"/>
+          <w:u w:val="single"/>
+        </w:rPr>
+        <w:t xml:space="preserve">TS Ghanam – TS 1.6 Malayalam Corrections – Observed </w:t>
+      </w:r>
+      <w:proofErr w:type="gramStart"/>
+      <w:r>
+        <w:rPr>
+          <w:b/>
+          <w:bCs/>
+          <w:sz w:val="32"/>
+          <w:szCs w:val="32"/>
+          <w:u w:val="single"/>
+        </w:rPr>
+        <w:t xml:space="preserve">till </w:t>
+      </w:r>
+      <w:r>
+        <w:rPr>
+          <w:b/>
+          <w:bCs/>
+          <w:sz w:val="32"/>
+          <w:szCs w:val="32"/>
+          <w:highlight w:val="red"/>
+          <w:u w:val="single"/>
+        </w:rPr>
+        <w:t>????</w:t>
+      </w:r>
+      <w:proofErr w:type="gramEnd"/>
+    </w:p>
+    <w:p>
+      <w:pPr>
+        <w:spacing w:before="0" w:line="240" w:lineRule="auto"/>
+        <w:jc w:val="center"/>
+        <w:rPr>
+          <w:b/>
+          <w:bCs/>
+          <w:sz w:val="28"/>
+          <w:szCs w:val="32"/>
+        </w:rPr>
+      </w:pPr>
+      <w:r>
+        <w:rPr>
+          <w:b/>
+          <w:bCs/>
+          <w:sz w:val="28"/>
+          <w:szCs w:val="32"/>
+        </w:rPr>
+        <w:t>(ignore those which are already incorporated in your book’s version and date)</w:t>
+      </w:r>
+    </w:p>
+    <w:tbl>
+      <w:tblPr>
+        <w:tblW w:w="14679" w:type="dxa"/>
+        <w:tblInd w:w="-792" w:type="dxa"/>
+        <w:tblBorders>
+          <w:top w:val="single" w:sz="4" w:space="0" w:color="000000"/>
+          <w:left w:val="single" w:sz="4" w:space="0" w:color="000000"/>
+          <w:bottom w:val="single" w:sz="4" w:space="0" w:color="000000"/>
+          <w:right w:val="single" w:sz="4" w:space="0" w:color="000000"/>
+          <w:insideH w:val="single" w:sz="4" w:space="0" w:color="000000"/>
+          <w:insideV w:val="single" w:sz="4" w:space="0" w:color="000000"/>
+        </w:tblBorders>
+        <w:tblLook w:val="04A0" w:firstRow="1" w:lastRow="0" w:firstColumn="1" w:lastColumn="0" w:noHBand="0" w:noVBand="1"/>
+      </w:tblPr>
+      <w:tblGrid>
+        <w:gridCol w:w="7308"/>
+        <w:gridCol w:w="7371"/>
+      </w:tblGrid>
+      <w:tr>
+        <w:tc>
+          <w:tcPr>
+            <w:tcW w:w="7308" w:type="dxa"/>
+          </w:tcPr>
+          <w:p>
+            <w:pPr>
+              <w:spacing w:before="0" w:line="240" w:lineRule="auto"/>
+              <w:jc w:val="center"/>
+              <w:rPr>
+                <w:b/>
+                <w:sz w:val="32"/>
+                <w:szCs w:val="32"/>
+              </w:rPr>
+            </w:pPr>
+            <w:r>
+              <w:rPr>
+                <w:b/>
+                <w:sz w:val="32"/>
+                <w:szCs w:val="32"/>
+              </w:rPr>
+              <w:t>As Printed</w:t>
+            </w:r>
+          </w:p>
+        </w:tc>
+        <w:tc>
+          <w:tcPr>
+            <w:tcW w:w="7371" w:type="dxa"/>
+          </w:tcPr>
+          <w:p>
+            <w:pPr>
+              <w:spacing w:before="0" w:line="240" w:lineRule="auto"/>
+              <w:ind w:right="-18"/>
+              <w:jc w:val="center"/>
+              <w:rPr>
+                <w:b/>
+                <w:sz w:val="32"/>
+                <w:szCs w:val="32"/>
+              </w:rPr>
+            </w:pPr>
+            <w:r>
+              <w:rPr>
+                <w:b/>
+                <w:sz w:val="32"/>
+                <w:szCs w:val="32"/>
+              </w:rPr>
+              <w:t xml:space="preserve">To be read as or corrected as </w:t>
+            </w:r>
+          </w:p>
+        </w:tc>
+      </w:tr>
+      <w:tr>
+        <w:trPr>
+          <w:trHeight w:val="1197"/>
+        </w:trPr>
+        <w:tc>
+          <w:tcPr>
+            <w:tcW w:w="7308" w:type="dxa"/>
+          </w:tcPr>
+          <w:p>
+            <w:pPr>
+              <w:widowControl w:val="0"/>
+              <w:autoSpaceDE w:val="0"/>
+              <w:autoSpaceDN w:val="0"/>
+              <w:adjustRightInd w:val="0"/>
+              <w:spacing w:before="0" w:line="240" w:lineRule="auto"/>
+              <w:rPr>
+                <w:rFonts w:ascii="BRH Malayalam Extra" w:hAnsi="BRH Malayalam Extra" w:cs="BRH Malayalam Extra"/>
+                <w:color w:val="000000"/>
+                <w:sz w:val="32"/>
+                <w:szCs w:val="40"/>
+                <w:lang w:val="it-IT"/>
+              </w:rPr>
+            </w:pPr>
+            <w:r>
+              <w:rPr>
+                <w:rFonts w:cs="BRH Malayalam Extra"/>
+                <w:color w:val="000000"/>
+                <w:szCs w:val="40"/>
+                <w:lang w:val="it-IT"/>
+              </w:rPr>
+              <w:t>48</w:t>
+            </w:r>
+            <w:r>
+              <w:rPr>
+                <w:rFonts w:ascii="BRH Malayalam Extra" w:hAnsi="BRH Malayalam Extra" w:cs="BRH Malayalam Extra"/>
+                <w:color w:val="000000"/>
+                <w:sz w:val="32"/>
+                <w:szCs w:val="40"/>
+                <w:lang w:val="it-IT"/>
+              </w:rPr>
+              <w:t>)</w:t>
+            </w:r>
+            <w:r>
+              <w:rPr>
+                <w:rFonts w:ascii="BRH Malayalam Extra" w:hAnsi="BRH Malayalam Extra" w:cs="BRH Malayalam Extra"/>
+                <w:color w:val="000000"/>
+                <w:sz w:val="32"/>
+                <w:szCs w:val="40"/>
+                <w:lang w:val="it-IT"/>
+              </w:rPr>
+              <w:tab/>
+            </w:r>
+            <w:r>
+              <w:rPr>
+                <w:rFonts w:cs="BRH Malayalam Extra"/>
+                <w:color w:val="000000"/>
+                <w:szCs w:val="40"/>
+                <w:lang w:val="it-IT"/>
+              </w:rPr>
+              <w:t>1</w:t>
+            </w:r>
+            <w:r>
+              <w:rPr>
+                <w:rFonts w:ascii="BRH Malayalam Extra" w:hAnsi="BRH Malayalam Extra" w:cs="BRH Malayalam Extra"/>
+                <w:color w:val="000000"/>
+                <w:sz w:val="32"/>
+                <w:szCs w:val="40"/>
+                <w:lang w:val="it-IT"/>
+              </w:rPr>
+              <w:t>.</w:t>
+            </w:r>
+            <w:r>
+              <w:rPr>
+                <w:rFonts w:cs="BRH Malayalam Extra"/>
+                <w:color w:val="000000"/>
+                <w:szCs w:val="40"/>
+                <w:lang w:val="it-IT"/>
+              </w:rPr>
+              <w:t>6</w:t>
+            </w:r>
+            <w:r>
+              <w:rPr>
+                <w:rFonts w:ascii="BRH Malayalam Extra" w:hAnsi="BRH Malayalam Extra" w:cs="BRH Malayalam Extra"/>
+                <w:color w:val="000000"/>
+                <w:sz w:val="32"/>
+                <w:szCs w:val="40"/>
+                <w:lang w:val="it-IT"/>
+              </w:rPr>
+              <w:t>.</w:t>
+            </w:r>
+            <w:r>
+              <w:rPr>
+                <w:rFonts w:cs="BRH Malayalam Extra"/>
+                <w:color w:val="000000"/>
+                <w:szCs w:val="40"/>
+                <w:lang w:val="it-IT"/>
+              </w:rPr>
+              <w:t>6</w:t>
+            </w:r>
+            <w:r>
+              <w:rPr>
+                <w:rFonts w:ascii="BRH Malayalam Extra" w:hAnsi="BRH Malayalam Extra" w:cs="BRH Malayalam Extra"/>
+                <w:color w:val="000000"/>
+                <w:sz w:val="32"/>
+                <w:szCs w:val="40"/>
+                <w:lang w:val="it-IT"/>
+              </w:rPr>
+              <w:t>.</w:t>
+            </w:r>
+            <w:r>
+              <w:rPr>
+                <w:rFonts w:cs="BRH Malayalam Extra"/>
+                <w:color w:val="000000"/>
+                <w:szCs w:val="40"/>
+                <w:lang w:val="it-IT"/>
+              </w:rPr>
+              <w:t>2</w:t>
+            </w:r>
+            <w:r>
+              <w:rPr>
+                <w:rFonts w:ascii="BRH Malayalam Extra" w:hAnsi="BRH Malayalam Extra" w:cs="BRH Malayalam Extra"/>
+                <w:color w:val="000000"/>
+                <w:sz w:val="32"/>
+                <w:szCs w:val="40"/>
+                <w:lang w:val="it-IT"/>
+              </w:rPr>
+              <w:t>(</w:t>
+            </w:r>
+            <w:r>
+              <w:rPr>
+                <w:rFonts w:cs="BRH Malayalam Extra"/>
+                <w:color w:val="000000"/>
+                <w:szCs w:val="40"/>
+                <w:lang w:val="it-IT"/>
+              </w:rPr>
+              <w:t>41</w:t>
+            </w:r>
+            <w:r>
+              <w:rPr>
+                <w:rFonts w:ascii="BRH Malayalam Extra" w:hAnsi="BRH Malayalam Extra" w:cs="BRH Malayalam Extra"/>
+                <w:color w:val="000000"/>
+                <w:sz w:val="32"/>
+                <w:szCs w:val="40"/>
+                <w:lang w:val="it-IT"/>
+              </w:rPr>
+              <w:t>)-  d</w:t>
+            </w:r>
+            <w:r>
+              <w:rPr>
+                <w:rFonts w:ascii="BRH Malayalam Extra" w:hAnsi="BRH Malayalam Extra" w:cs="BRH Malayalam Extra"/>
+                <w:color w:val="000000"/>
+                <w:sz w:val="28"/>
+                <w:szCs w:val="40"/>
+                <w:lang w:val="it-IT"/>
+              </w:rPr>
+              <w:t>–</w:t>
+            </w:r>
+            <w:r>
+              <w:rPr>
+                <w:rFonts w:ascii="BRH Malayalam Extra" w:hAnsi="BRH Malayalam Extra" w:cs="BRH Malayalam Extra"/>
+                <w:color w:val="000000"/>
+                <w:sz w:val="32"/>
+                <w:szCs w:val="40"/>
+                <w:lang w:val="it-IT"/>
+              </w:rPr>
+              <w:t>J ||</w:t>
+            </w:r>
+          </w:p>
+          <w:p>
+            <w:pPr>
+              <w:widowControl w:val="0"/>
+              <w:autoSpaceDE w:val="0"/>
+              <w:autoSpaceDN w:val="0"/>
+              <w:adjustRightInd w:val="0"/>
+              <w:spacing w:before="0" w:line="240" w:lineRule="auto"/>
+              <w:rPr>
+                <w:rFonts w:cs="Latha"/>
+                <w:b/>
+                <w:bCs/>
+                <w:szCs w:val="28"/>
+                <w:cs/>
+                <w:lang w:bidi="ta-IN"/>
+              </w:rPr>
+            </w:pPr>
+            <w:r>
+              <w:rPr>
+                <w:rFonts w:ascii="BRH Malayalam Extra" w:hAnsi="BRH Malayalam Extra" w:cs="BRH Malayalam Extra"/>
+                <w:color w:val="000000"/>
+                <w:sz w:val="32"/>
+                <w:szCs w:val="40"/>
+                <w:lang w:val="it-IT"/>
+              </w:rPr>
+              <w:t>d</w:t>
+            </w:r>
+            <w:r>
+              <w:rPr>
+                <w:rFonts w:ascii="BRH Malayalam Extra" w:hAnsi="BRH Malayalam Extra" w:cs="BRH Malayalam Extra"/>
+                <w:color w:val="000000"/>
+                <w:sz w:val="28"/>
+                <w:szCs w:val="40"/>
+                <w:lang w:val="it-IT"/>
+              </w:rPr>
+              <w:t>–</w:t>
+            </w:r>
+            <w:r>
+              <w:rPr>
+                <w:rFonts w:ascii="BRH Malayalam Extra" w:hAnsi="BRH Malayalam Extra" w:cs="BRH Malayalam Extra"/>
+                <w:color w:val="000000"/>
+                <w:sz w:val="32"/>
+                <w:szCs w:val="40"/>
+                <w:lang w:val="it-IT"/>
+              </w:rPr>
+              <w:t xml:space="preserve"> CZy— </w:t>
+            </w:r>
+            <w:r>
+              <w:rPr>
+                <w:rFonts w:ascii="BRH Malayalam Extra" w:hAnsi="BRH Malayalam Extra" w:cs="BRH Malayalam Extra"/>
+                <w:color w:val="000000"/>
+                <w:sz w:val="32"/>
+                <w:szCs w:val="40"/>
+                <w:highlight w:val="yellow"/>
+                <w:lang w:val="it-IT"/>
+              </w:rPr>
+              <w:t>d</w:t>
+            </w:r>
+            <w:r>
+              <w:rPr>
+                <w:rFonts w:ascii="BRH Malayalam Extra" w:hAnsi="BRH Malayalam Extra" w:cs="BRH Malayalam Extra"/>
+                <w:color w:val="000000"/>
+                <w:sz w:val="28"/>
+                <w:szCs w:val="40"/>
+                <w:lang w:val="it-IT"/>
+              </w:rPr>
+              <w:t>–</w:t>
+            </w:r>
+            <w:r>
+              <w:rPr>
+                <w:rFonts w:ascii="BRH Malayalam Extra" w:hAnsi="BRH Malayalam Extra" w:cs="BRH Malayalam Extra"/>
+                <w:color w:val="000000"/>
+                <w:sz w:val="32"/>
+                <w:szCs w:val="40"/>
+                <w:lang w:val="it-IT"/>
+              </w:rPr>
+              <w:t xml:space="preserve">J | </w:t>
+            </w:r>
+          </w:p>
+        </w:tc>
+        <w:tc>
+          <w:tcPr>
+            <w:tcW w:w="7371" w:type="dxa"/>
+          </w:tcPr>
+          <w:p>
+            <w:pPr>
+              <w:widowControl w:val="0"/>
+              <w:autoSpaceDE w:val="0"/>
+              <w:autoSpaceDN w:val="0"/>
+              <w:adjustRightInd w:val="0"/>
+              <w:spacing w:before="0" w:line="240" w:lineRule="auto"/>
+              <w:rPr>
+                <w:rFonts w:ascii="BRH Malayalam Extra" w:hAnsi="BRH Malayalam Extra" w:cs="BRH Malayalam Extra"/>
+                <w:color w:val="000000"/>
+                <w:sz w:val="32"/>
+                <w:szCs w:val="40"/>
+                <w:lang w:val="it-IT"/>
+              </w:rPr>
+            </w:pPr>
+            <w:r>
+              <w:rPr>
+                <w:rFonts w:cs="BRH Malayalam Extra"/>
+                <w:color w:val="000000"/>
+                <w:szCs w:val="40"/>
+                <w:lang w:val="it-IT"/>
+              </w:rPr>
+              <w:t>48</w:t>
+            </w:r>
+            <w:r>
+              <w:rPr>
+                <w:rFonts w:ascii="BRH Malayalam Extra" w:hAnsi="BRH Malayalam Extra" w:cs="BRH Malayalam Extra"/>
+                <w:color w:val="000000"/>
+                <w:sz w:val="32"/>
+                <w:szCs w:val="40"/>
+                <w:lang w:val="it-IT"/>
+              </w:rPr>
+              <w:t>)</w:t>
+            </w:r>
+            <w:r>
+              <w:rPr>
+                <w:rFonts w:ascii="BRH Malayalam Extra" w:hAnsi="BRH Malayalam Extra" w:cs="BRH Malayalam Extra"/>
+                <w:color w:val="000000"/>
+                <w:sz w:val="32"/>
+                <w:szCs w:val="40"/>
+                <w:lang w:val="it-IT"/>
+              </w:rPr>
+              <w:tab/>
+            </w:r>
+            <w:r>
+              <w:rPr>
+                <w:rFonts w:cs="BRH Malayalam Extra"/>
+                <w:color w:val="000000"/>
+                <w:szCs w:val="40"/>
+                <w:lang w:val="it-IT"/>
+              </w:rPr>
+              <w:t>1</w:t>
+            </w:r>
+            <w:r>
+              <w:rPr>
+                <w:rFonts w:ascii="BRH Malayalam Extra" w:hAnsi="BRH Malayalam Extra" w:cs="BRH Malayalam Extra"/>
+                <w:color w:val="000000"/>
+                <w:sz w:val="32"/>
+                <w:szCs w:val="40"/>
+                <w:lang w:val="it-IT"/>
+              </w:rPr>
+              <w:t>.</w:t>
+            </w:r>
+            <w:r>
+              <w:rPr>
+                <w:rFonts w:cs="BRH Malayalam Extra"/>
+                <w:color w:val="000000"/>
+                <w:szCs w:val="40"/>
+                <w:lang w:val="it-IT"/>
+              </w:rPr>
+              <w:t>6</w:t>
+            </w:r>
+            <w:r>
+              <w:rPr>
+                <w:rFonts w:ascii="BRH Malayalam Extra" w:hAnsi="BRH Malayalam Extra" w:cs="BRH Malayalam Extra"/>
+                <w:color w:val="000000"/>
+                <w:sz w:val="32"/>
+                <w:szCs w:val="40"/>
+                <w:lang w:val="it-IT"/>
+              </w:rPr>
+              <w:t>.</w:t>
+            </w:r>
+            <w:r>
+              <w:rPr>
+                <w:rFonts w:cs="BRH Malayalam Extra"/>
+                <w:color w:val="000000"/>
+                <w:szCs w:val="40"/>
+                <w:lang w:val="it-IT"/>
+              </w:rPr>
+              <w:t>6</w:t>
+            </w:r>
+            <w:r>
+              <w:rPr>
+                <w:rFonts w:ascii="BRH Malayalam Extra" w:hAnsi="BRH Malayalam Extra" w:cs="BRH Malayalam Extra"/>
+                <w:color w:val="000000"/>
+                <w:sz w:val="32"/>
+                <w:szCs w:val="40"/>
+                <w:lang w:val="it-IT"/>
+              </w:rPr>
+              <w:t>.</w:t>
+            </w:r>
+            <w:r>
+              <w:rPr>
+                <w:rFonts w:cs="BRH Malayalam Extra"/>
+                <w:color w:val="000000"/>
+                <w:szCs w:val="40"/>
+                <w:lang w:val="it-IT"/>
+              </w:rPr>
+              <w:t>2</w:t>
+            </w:r>
+            <w:r>
+              <w:rPr>
+                <w:rFonts w:ascii="BRH Malayalam Extra" w:hAnsi="BRH Malayalam Extra" w:cs="BRH Malayalam Extra"/>
+                <w:color w:val="000000"/>
+                <w:sz w:val="32"/>
+                <w:szCs w:val="40"/>
+                <w:lang w:val="it-IT"/>
+              </w:rPr>
+              <w:t>(</w:t>
+            </w:r>
+            <w:r>
+              <w:rPr>
+                <w:rFonts w:cs="BRH Malayalam Extra"/>
+                <w:color w:val="000000"/>
+                <w:szCs w:val="40"/>
+                <w:lang w:val="it-IT"/>
+              </w:rPr>
+              <w:t>41</w:t>
+            </w:r>
+            <w:r>
+              <w:rPr>
+                <w:rFonts w:ascii="BRH Malayalam Extra" w:hAnsi="BRH Malayalam Extra" w:cs="BRH Malayalam Extra"/>
+                <w:color w:val="000000"/>
+                <w:sz w:val="32"/>
+                <w:szCs w:val="40"/>
+                <w:lang w:val="it-IT"/>
+              </w:rPr>
+              <w:t>)-  d</w:t>
+            </w:r>
+            <w:r>
+              <w:rPr>
+                <w:rFonts w:ascii="BRH Malayalam Extra" w:hAnsi="BRH Malayalam Extra" w:cs="BRH Malayalam Extra"/>
+                <w:color w:val="000000"/>
+                <w:sz w:val="28"/>
+                <w:szCs w:val="40"/>
+                <w:lang w:val="it-IT"/>
+              </w:rPr>
+              <w:t>–</w:t>
+            </w:r>
+            <w:r>
+              <w:rPr>
+                <w:rFonts w:ascii="BRH Malayalam Extra" w:hAnsi="BRH Malayalam Extra" w:cs="BRH Malayalam Extra"/>
+                <w:color w:val="000000"/>
+                <w:sz w:val="32"/>
+                <w:szCs w:val="40"/>
+                <w:lang w:val="it-IT"/>
+              </w:rPr>
+              <w:t>J ||</w:t>
+            </w:r>
+          </w:p>
+          <w:p>
+            <w:pPr>
+              <w:widowControl w:val="0"/>
+              <w:autoSpaceDE w:val="0"/>
+              <w:autoSpaceDN w:val="0"/>
+              <w:adjustRightInd w:val="0"/>
+              <w:spacing w:before="0" w:line="240" w:lineRule="auto"/>
+              <w:rPr>
+                <w:rFonts w:cs="Latha"/>
+                <w:b/>
+                <w:bCs/>
+                <w:szCs w:val="28"/>
+                <w:cs/>
+                <w:lang w:bidi="ta-IN"/>
+              </w:rPr>
+            </w:pPr>
+            <w:r>
+              <w:rPr>
+                <w:rFonts w:ascii="BRH Malayalam Extra" w:hAnsi="BRH Malayalam Extra" w:cs="BRH Malayalam Extra"/>
+                <w:color w:val="000000"/>
+                <w:sz w:val="32"/>
+                <w:szCs w:val="40"/>
+                <w:lang w:val="it-IT"/>
+              </w:rPr>
+              <w:t>d</w:t>
+            </w:r>
+            <w:r>
+              <w:rPr>
+                <w:rFonts w:ascii="BRH Malayalam Extra" w:hAnsi="BRH Malayalam Extra" w:cs="BRH Malayalam Extra"/>
+                <w:color w:val="000000"/>
+                <w:sz w:val="28"/>
+                <w:szCs w:val="40"/>
+                <w:lang w:val="it-IT"/>
+              </w:rPr>
+              <w:t>–</w:t>
+            </w:r>
+            <w:r>
+              <w:rPr>
+                <w:rFonts w:ascii="BRH Malayalam Extra" w:hAnsi="BRH Malayalam Extra" w:cs="BRH Malayalam Extra"/>
+                <w:color w:val="000000"/>
+                <w:sz w:val="32"/>
+                <w:szCs w:val="40"/>
+                <w:lang w:val="it-IT"/>
+              </w:rPr>
+              <w:t xml:space="preserve"> CZy— </w:t>
+            </w:r>
+            <w:r>
+              <w:rPr>
+                <w:rFonts w:ascii="BRH Malayalam Extra" w:hAnsi="BRH Malayalam Extra" w:cs="BRH Malayalam Extra"/>
+                <w:color w:val="000000"/>
+                <w:sz w:val="32"/>
+                <w:szCs w:val="40"/>
+                <w:highlight w:val="green"/>
+                <w:lang w:val="it-IT"/>
+              </w:rPr>
+              <w:t>d</w:t>
+            </w:r>
+            <w:r>
+              <w:rPr>
+                <w:rFonts w:ascii="BRH Malayalam Extra" w:hAnsi="BRH Malayalam Extra" w:cs="BRH Malayalam Extra"/>
+                <w:color w:val="000000"/>
+                <w:sz w:val="32"/>
+                <w:szCs w:val="40"/>
+                <w:lang w:val="it-IT"/>
+              </w:rPr>
+              <w:t xml:space="preserve">J | </w:t>
+            </w:r>
+          </w:p>
+        </w:tc>
+      </w:tr>
+    </w:tbl>
+    <w:p>
+      <w:pPr>
+        <w:spacing w:before="0" w:line="240" w:lineRule="auto"/>
+        <w:jc w:val="center"/>
+        <w:rPr>
+          <w:b/>
+          <w:bCs/>
+          <w:sz w:val="32"/>
+          <w:szCs w:val="32"/>
+          <w:u w:val="single"/>
+        </w:rPr>
+      </w:pPr>
+    </w:p>
+    <w:p>
+      <w:pPr>
+        <w:spacing w:before="0" w:line="240" w:lineRule="auto"/>
+        <w:jc w:val="center"/>
+        <w:rPr>
+          <w:b/>
+          <w:bCs/>
+          <w:sz w:val="32"/>
+          <w:szCs w:val="32"/>
+          <w:u w:val="single"/>
+        </w:rPr>
+      </w:pPr>
+    </w:p>
+    <w:p>
+      <w:pPr>
+        <w:spacing w:before="0" w:line="240" w:lineRule="auto"/>
+        <w:jc w:val="center"/>
+        <w:rPr>
+          <w:b/>
+          <w:bCs/>
+          <w:sz w:val="32"/>
+          <w:szCs w:val="32"/>
+          <w:u w:val="single"/>
+        </w:rPr>
+      </w:pPr>
+    </w:p>
     <w:p>
       <w:pPr>
         <w:spacing w:before="0" w:line="240" w:lineRule="auto"/>
@@ -113,27 +770,7 @@
           <w:sz w:val="28"/>
           <w:szCs w:val="32"/>
         </w:rPr>
-        <w:t>(</w:t>
-      </w:r>
-      <w:proofErr w:type="gramStart"/>
-      <w:r>
-        <w:rPr>
-          <w:b/>
-          <w:bCs/>
-          <w:sz w:val="28"/>
-          <w:szCs w:val="32"/>
-        </w:rPr>
-        <w:t>ignore</w:t>
-      </w:r>
-      <w:proofErr w:type="gramEnd"/>
-      <w:r>
-        <w:rPr>
-          <w:b/>
-          <w:bCs/>
-          <w:sz w:val="28"/>
-          <w:szCs w:val="32"/>
-        </w:rPr>
-        <w:t xml:space="preserve"> those which are already incorporated in your book’s version and date)</w:t>
+        <w:t>(ignore those which are already incorporated in your book’s version and date)</w:t>
       </w:r>
     </w:p>
     <w:tbl>
@@ -758,6 +1395,7 @@
                 <w:rFonts w:cs="BRH Malayalam Extra"/>
                 <w:szCs w:val="40"/>
               </w:rPr>
+              <w:lastRenderedPageBreak/>
               <w:t>37</w:t>
             </w:r>
             <w:r>
@@ -2262,7 +2900,6 @@
                 <w:szCs w:val="40"/>
                 <w:lang w:val="it-IT"/>
               </w:rPr>
-              <w:lastRenderedPageBreak/>
               <w:t>c</w:t>
             </w:r>
             <w:r>
@@ -2799,6 +3436,7 @@
                 <w:szCs w:val="40"/>
                 <w:lang w:val="it-IT"/>
               </w:rPr>
+              <w:lastRenderedPageBreak/>
               <w:t>A</w:t>
             </w:r>
             <w:r>
@@ -3052,12 +3690,14 @@
                 <w:rFonts w:ascii="BRH Malayalam Extra" w:hAnsi="BRH Malayalam Extra" w:cs="BRH Malayalam Extra"/>
                 <w:sz w:val="32"/>
                 <w:szCs w:val="40"/>
+                <w:lang w:val="it-IT"/>
               </w:rPr>
             </w:pPr>
             <w:r>
               <w:rPr>
                 <w:rFonts w:cs="BRH Malayalam Extra"/>
                 <w:szCs w:val="40"/>
+                <w:lang w:val="it-IT"/>
               </w:rPr>
               <w:t>43</w:t>
             </w:r>
@@ -3066,6 +3706,7 @@
                 <w:rFonts w:ascii="BRH Malayalam Extra" w:hAnsi="BRH Malayalam Extra" w:cs="BRH Malayalam Extra"/>
                 <w:sz w:val="32"/>
                 <w:szCs w:val="40"/>
+                <w:lang w:val="it-IT"/>
               </w:rPr>
               <w:t>)</w:t>
             </w:r>
@@ -3074,6 +3715,7 @@
                 <w:rFonts w:ascii="BRH Malayalam Extra" w:hAnsi="BRH Malayalam Extra" w:cs="BRH Malayalam Extra"/>
                 <w:sz w:val="32"/>
                 <w:szCs w:val="40"/>
+                <w:lang w:val="it-IT"/>
               </w:rPr>
               <w:tab/>
             </w:r>
@@ -3081,6 +3723,7 @@
               <w:rPr>
                 <w:rFonts w:cs="BRH Malayalam Extra"/>
                 <w:szCs w:val="40"/>
+                <w:lang w:val="it-IT"/>
               </w:rPr>
               <w:t>1</w:t>
             </w:r>
@@ -3089,6 +3732,7 @@
                 <w:rFonts w:ascii="BRH Malayalam Extra" w:hAnsi="BRH Malayalam Extra" w:cs="BRH Malayalam Extra"/>
                 <w:sz w:val="32"/>
                 <w:szCs w:val="40"/>
+                <w:lang w:val="it-IT"/>
               </w:rPr>
               <w:t>.</w:t>
             </w:r>
@@ -3096,6 +3740,7 @@
               <w:rPr>
                 <w:rFonts w:cs="BRH Malayalam Extra"/>
                 <w:szCs w:val="40"/>
+                <w:lang w:val="it-IT"/>
               </w:rPr>
               <w:t>6</w:t>
             </w:r>
@@ -3104,6 +3749,7 @@
                 <w:rFonts w:ascii="BRH Malayalam Extra" w:hAnsi="BRH Malayalam Extra" w:cs="BRH Malayalam Extra"/>
                 <w:sz w:val="32"/>
                 <w:szCs w:val="40"/>
+                <w:lang w:val="it-IT"/>
               </w:rPr>
               <w:t>.</w:t>
             </w:r>
@@ -3111,6 +3757,7 @@
               <w:rPr>
                 <w:rFonts w:cs="BRH Malayalam Extra"/>
                 <w:szCs w:val="40"/>
+                <w:lang w:val="it-IT"/>
               </w:rPr>
               <w:t>2</w:t>
             </w:r>
@@ -3119,6 +3766,7 @@
                 <w:rFonts w:ascii="BRH Malayalam Extra" w:hAnsi="BRH Malayalam Extra" w:cs="BRH Malayalam Extra"/>
                 <w:sz w:val="32"/>
                 <w:szCs w:val="40"/>
+                <w:lang w:val="it-IT"/>
               </w:rPr>
               <w:t>.</w:t>
             </w:r>
@@ -3126,6 +3774,7 @@
               <w:rPr>
                 <w:rFonts w:cs="BRH Malayalam Extra"/>
                 <w:szCs w:val="40"/>
+                <w:lang w:val="it-IT"/>
               </w:rPr>
               <w:t>1</w:t>
             </w:r>
@@ -3134,6 +3783,7 @@
                 <w:rFonts w:ascii="BRH Malayalam Extra" w:hAnsi="BRH Malayalam Extra" w:cs="BRH Malayalam Extra"/>
                 <w:sz w:val="32"/>
                 <w:szCs w:val="40"/>
+                <w:lang w:val="it-IT"/>
               </w:rPr>
               <w:t>(</w:t>
             </w:r>
@@ -3141,6 +3791,7 @@
               <w:rPr>
                 <w:rFonts w:cs="BRH Malayalam Extra"/>
                 <w:szCs w:val="40"/>
+                <w:lang w:val="it-IT"/>
               </w:rPr>
               <w:t>34</w:t>
             </w:r>
@@ -3149,40 +3800,25 @@
                 <w:rFonts w:ascii="BRH Malayalam Extra" w:hAnsi="BRH Malayalam Extra" w:cs="BRH Malayalam Extra"/>
                 <w:sz w:val="32"/>
                 <w:szCs w:val="40"/>
-              </w:rPr>
-              <w:t>)</w:t>
-            </w:r>
-            <w:proofErr w:type="gramStart"/>
-            <w:r>
-              <w:rPr>
-                <w:rFonts w:ascii="BRH Malayalam Extra" w:hAnsi="BRH Malayalam Extra" w:cs="BRH Malayalam Extra"/>
-                <w:sz w:val="32"/>
-                <w:szCs w:val="40"/>
-              </w:rPr>
-              <w:t>-  ¥</w:t>
-            </w:r>
-            <w:proofErr w:type="gramEnd"/>
-            <w:r>
-              <w:rPr>
-                <w:rFonts w:ascii="BRH Malayalam Extra" w:hAnsi="BRH Malayalam Extra" w:cs="BRH Malayalam Extra"/>
-                <w:sz w:val="32"/>
-                <w:szCs w:val="40"/>
-              </w:rPr>
-              <w:t>pxX</w:t>
-            </w:r>
-            <w:r>
-              <w:rPr>
-                <w:rFonts w:ascii="BRH Malayalam Extra" w:hAnsi="BRH Malayalam Extra" w:cs="BRH Malayalam Extra"/>
-                <w:sz w:val="25"/>
-                <w:szCs w:val="40"/>
-              </w:rPr>
-              <w:t>–</w:t>
-            </w:r>
-            <w:r>
-              <w:rPr>
-                <w:rFonts w:ascii="BRH Malayalam Extra" w:hAnsi="BRH Malayalam Extra" w:cs="BRH Malayalam Extra"/>
-                <w:sz w:val="32"/>
-                <w:szCs w:val="40"/>
+                <w:lang w:val="it-IT"/>
+              </w:rPr>
+              <w:t>)-  ¥pxX</w:t>
+            </w:r>
+            <w:r>
+              <w:rPr>
+                <w:rFonts w:ascii="BRH Malayalam Extra" w:hAnsi="BRH Malayalam Extra" w:cs="BRH Malayalam Extra"/>
+                <w:sz w:val="25"/>
+                <w:szCs w:val="40"/>
+                <w:lang w:val="it-IT"/>
+              </w:rPr>
+              <w:t>–</w:t>
+            </w:r>
+            <w:r>
+              <w:rPr>
+                <w:rFonts w:ascii="BRH Malayalam Extra" w:hAnsi="BRH Malayalam Extra" w:cs="BRH Malayalam Extra"/>
+                <w:sz w:val="32"/>
+                <w:szCs w:val="40"/>
+                <w:lang w:val="it-IT"/>
               </w:rPr>
               <w:t>¥p | Rx</w:t>
             </w:r>
@@ -3191,14 +3827,16 @@
                 <w:rFonts w:ascii="BRH Malayalam Extra" w:hAnsi="BRH Malayalam Extra" w:cs="BRH Malayalam Extra"/>
                 <w:sz w:val="25"/>
                 <w:szCs w:val="40"/>
-              </w:rPr>
-              <w:t>–</w:t>
-            </w:r>
-            <w:r>
-              <w:rPr>
-                <w:rFonts w:ascii="BRH Malayalam Extra" w:hAnsi="BRH Malayalam Extra" w:cs="BRH Malayalam Extra"/>
-                <w:sz w:val="32"/>
-                <w:szCs w:val="40"/>
+                <w:lang w:val="it-IT"/>
+              </w:rPr>
+              <w:t>–</w:t>
+            </w:r>
+            <w:r>
+              <w:rPr>
+                <w:rFonts w:ascii="BRH Malayalam Extra" w:hAnsi="BRH Malayalam Extra" w:cs="BRH Malayalam Extra"/>
+                <w:sz w:val="32"/>
+                <w:szCs w:val="40"/>
+                <w:lang w:val="it-IT"/>
               </w:rPr>
               <w:t>Z</w:t>
             </w:r>
@@ -3207,14 +3845,16 @@
                 <w:rFonts w:ascii="BRH Malayalam Extra" w:hAnsi="BRH Malayalam Extra" w:cs="BRH Malayalam Extra"/>
                 <w:sz w:val="25"/>
                 <w:szCs w:val="40"/>
-              </w:rPr>
-              <w:t>–</w:t>
-            </w:r>
-            <w:r>
-              <w:rPr>
-                <w:rFonts w:ascii="BRH Malayalam Extra" w:hAnsi="BRH Malayalam Extra" w:cs="BRH Malayalam Extra"/>
-                <w:sz w:val="32"/>
-                <w:szCs w:val="40"/>
+                <w:lang w:val="it-IT"/>
+              </w:rPr>
+              <w:t>–</w:t>
+            </w:r>
+            <w:r>
+              <w:rPr>
+                <w:rFonts w:ascii="BRH Malayalam Extra" w:hAnsi="BRH Malayalam Extra" w:cs="BRH Malayalam Extra"/>
+                <w:sz w:val="32"/>
+                <w:szCs w:val="40"/>
+                <w:lang w:val="it-IT"/>
               </w:rPr>
               <w:t>¥p</w:t>
             </w:r>
@@ -3223,6 +3863,7 @@
                 <w:rFonts w:ascii="BRH Malayalam Extra" w:hAnsi="BRH Malayalam Extra" w:cs="BRH Malayalam Extra"/>
                 <w:sz w:val="25"/>
                 <w:szCs w:val="40"/>
+                <w:lang w:val="it-IT"/>
               </w:rPr>
               <w:t>–</w:t>
             </w:r>
@@ -3232,6 +3873,7 @@
                 <w:sz w:val="32"/>
                 <w:szCs w:val="40"/>
                 <w:highlight w:val="yellow"/>
+                <w:lang w:val="it-IT"/>
               </w:rPr>
               <w:t>b</w:t>
             </w:r>
@@ -3240,6 +3882,7 @@
                 <w:rFonts w:ascii="BRH Malayalam Extra" w:hAnsi="BRH Malayalam Extra" w:cs="BRH Malayalam Extra"/>
                 <w:sz w:val="32"/>
                 <w:szCs w:val="40"/>
+                <w:lang w:val="it-IT"/>
               </w:rPr>
               <w:t xml:space="preserve">J || </w:t>
             </w:r>
@@ -3255,6 +3898,7 @@
                 <w:rFonts w:ascii="BRH Malayalam Extra" w:hAnsi="BRH Malayalam Extra" w:cs="BRH Malayalam Extra"/>
                 <w:sz w:val="32"/>
                 <w:szCs w:val="40"/>
+                <w:lang w:val="it-IT"/>
               </w:rPr>
             </w:pPr>
             <w:r>
@@ -3262,6 +3906,7 @@
                 <w:rFonts w:ascii="BRH Malayalam Extra" w:hAnsi="BRH Malayalam Extra" w:cs="BRH Malayalam Extra"/>
                 <w:sz w:val="32"/>
                 <w:szCs w:val="40"/>
+                <w:lang w:val="it-IT"/>
               </w:rPr>
               <w:t>¥pxX</w:t>
             </w:r>
@@ -3270,14 +3915,16 @@
                 <w:rFonts w:ascii="BRH Malayalam Extra" w:hAnsi="BRH Malayalam Extra" w:cs="BRH Malayalam Extra"/>
                 <w:sz w:val="25"/>
                 <w:szCs w:val="40"/>
-              </w:rPr>
-              <w:t>–</w:t>
-            </w:r>
-            <w:r>
-              <w:rPr>
-                <w:rFonts w:ascii="BRH Malayalam Extra" w:hAnsi="BRH Malayalam Extra" w:cs="BRH Malayalam Extra"/>
-                <w:sz w:val="32"/>
-                <w:szCs w:val="40"/>
+                <w:lang w:val="it-IT"/>
+              </w:rPr>
+              <w:t>–</w:t>
+            </w:r>
+            <w:r>
+              <w:rPr>
+                <w:rFonts w:ascii="BRH Malayalam Extra" w:hAnsi="BRH Malayalam Extra" w:cs="BRH Malayalam Extra"/>
+                <w:sz w:val="32"/>
+                <w:szCs w:val="40"/>
+                <w:lang w:val="it-IT"/>
               </w:rPr>
               <w:t>¥p Rx—Z</w:t>
             </w:r>
@@ -3287,6 +3934,7 @@
                 <w:sz w:val="32"/>
                 <w:szCs w:val="40"/>
                 <w:highlight w:val="yellow"/>
+                <w:lang w:val="it-IT"/>
               </w:rPr>
               <w:t>¥p</w:t>
             </w:r>
@@ -3295,14 +3943,16 @@
                 <w:rFonts w:ascii="BRH Malayalam Extra" w:hAnsi="BRH Malayalam Extra" w:cs="BRH Malayalam Extra"/>
                 <w:sz w:val="25"/>
                 <w:szCs w:val="40"/>
-              </w:rPr>
-              <w:t>–</w:t>
-            </w:r>
-            <w:r>
-              <w:rPr>
-                <w:rFonts w:ascii="BRH Malayalam Extra" w:hAnsi="BRH Malayalam Extra" w:cs="BRH Malayalam Extra"/>
-                <w:sz w:val="32"/>
-                <w:szCs w:val="40"/>
+                <w:lang w:val="it-IT"/>
+              </w:rPr>
+              <w:t>–</w:t>
+            </w:r>
+            <w:r>
+              <w:rPr>
+                <w:rFonts w:ascii="BRH Malayalam Extra" w:hAnsi="BRH Malayalam Extra" w:cs="BRH Malayalam Extra"/>
+                <w:sz w:val="32"/>
+                <w:szCs w:val="40"/>
+                <w:lang w:val="it-IT"/>
               </w:rPr>
               <w:t xml:space="preserve">¥bx </w:t>
             </w:r>
@@ -3312,6 +3962,7 @@
                 <w:sz w:val="32"/>
                 <w:szCs w:val="40"/>
                 <w:highlight w:val="yellow"/>
+                <w:lang w:val="it-IT"/>
               </w:rPr>
               <w:t>Rx—</w:t>
             </w:r>
@@ -3320,6 +3971,7 @@
                 <w:rFonts w:ascii="BRH Malayalam Extra" w:hAnsi="BRH Malayalam Extra" w:cs="BRH Malayalam Extra"/>
                 <w:sz w:val="32"/>
                 <w:szCs w:val="40"/>
+                <w:lang w:val="it-IT"/>
               </w:rPr>
               <w:t>Z</w:t>
             </w:r>
@@ -3329,6 +3981,7 @@
                 <w:sz w:val="32"/>
                 <w:szCs w:val="40"/>
                 <w:highlight w:val="yellow"/>
+                <w:lang w:val="it-IT"/>
               </w:rPr>
               <w:t>¥p</w:t>
             </w:r>
@@ -3338,6 +3991,7 @@
                 <w:sz w:val="25"/>
                 <w:szCs w:val="40"/>
                 <w:highlight w:val="yellow"/>
+                <w:lang w:val="it-IT"/>
               </w:rPr>
               <w:t>–</w:t>
             </w:r>
@@ -3347,6 +4001,7 @@
                 <w:sz w:val="32"/>
                 <w:szCs w:val="40"/>
                 <w:highlight w:val="yellow"/>
+                <w:lang w:val="it-IT"/>
               </w:rPr>
               <w:t>¥bx</w:t>
             </w:r>
@@ -3355,6 +4010,7 @@
                 <w:rFonts w:ascii="BRH Malayalam Extra" w:hAnsi="BRH Malayalam Extra" w:cs="BRH Malayalam Extra"/>
                 <w:sz w:val="32"/>
                 <w:szCs w:val="40"/>
+                <w:lang w:val="it-IT"/>
               </w:rPr>
               <w:t xml:space="preserve"> ¥pxX</w:t>
             </w:r>
@@ -3363,14 +4019,16 @@
                 <w:rFonts w:ascii="BRH Malayalam Extra" w:hAnsi="BRH Malayalam Extra" w:cs="BRH Malayalam Extra"/>
                 <w:sz w:val="25"/>
                 <w:szCs w:val="40"/>
-              </w:rPr>
-              <w:t>–</w:t>
-            </w:r>
-            <w:r>
-              <w:rPr>
-                <w:rFonts w:ascii="BRH Malayalam Extra" w:hAnsi="BRH Malayalam Extra" w:cs="BRH Malayalam Extra"/>
-                <w:sz w:val="32"/>
-                <w:szCs w:val="40"/>
+                <w:lang w:val="it-IT"/>
+              </w:rPr>
+              <w:t>–</w:t>
+            </w:r>
+            <w:r>
+              <w:rPr>
+                <w:rFonts w:ascii="BRH Malayalam Extra" w:hAnsi="BRH Malayalam Extra" w:cs="BRH Malayalam Extra"/>
+                <w:sz w:val="32"/>
+                <w:szCs w:val="40"/>
+                <w:lang w:val="it-IT"/>
               </w:rPr>
               <w:t>¥p ¥pxX</w:t>
             </w:r>
@@ -3379,14 +4037,16 @@
                 <w:rFonts w:ascii="BRH Malayalam Extra" w:hAnsi="BRH Malayalam Extra" w:cs="BRH Malayalam Extra"/>
                 <w:sz w:val="25"/>
                 <w:szCs w:val="40"/>
-              </w:rPr>
-              <w:t>–</w:t>
-            </w:r>
-            <w:r>
-              <w:rPr>
-                <w:rFonts w:ascii="BRH Malayalam Extra" w:hAnsi="BRH Malayalam Extra" w:cs="BRH Malayalam Extra"/>
-                <w:sz w:val="32"/>
-                <w:szCs w:val="40"/>
+                <w:lang w:val="it-IT"/>
+              </w:rPr>
+              <w:t>–</w:t>
+            </w:r>
+            <w:r>
+              <w:rPr>
+                <w:rFonts w:ascii="BRH Malayalam Extra" w:hAnsi="BRH Malayalam Extra" w:cs="BRH Malayalam Extra"/>
+                <w:sz w:val="32"/>
+                <w:szCs w:val="40"/>
+                <w:lang w:val="it-IT"/>
               </w:rPr>
               <w:t>¥p Rx—Z¥</w:t>
             </w:r>
@@ -3396,6 +4056,7 @@
                 <w:sz w:val="32"/>
                 <w:szCs w:val="40"/>
                 <w:highlight w:val="yellow"/>
+                <w:lang w:val="it-IT"/>
               </w:rPr>
               <w:t>p</w:t>
             </w:r>
@@ -3404,14 +4065,16 @@
                 <w:rFonts w:ascii="BRH Malayalam Extra" w:hAnsi="BRH Malayalam Extra" w:cs="BRH Malayalam Extra"/>
                 <w:sz w:val="25"/>
                 <w:szCs w:val="40"/>
-              </w:rPr>
-              <w:t>–</w:t>
-            </w:r>
-            <w:r>
-              <w:rPr>
-                <w:rFonts w:ascii="BRH Malayalam Extra" w:hAnsi="BRH Malayalam Extra" w:cs="BRH Malayalam Extra"/>
-                <w:sz w:val="32"/>
-                <w:szCs w:val="40"/>
+                <w:lang w:val="it-IT"/>
+              </w:rPr>
+              <w:t>–</w:t>
+            </w:r>
+            <w:r>
+              <w:rPr>
+                <w:rFonts w:ascii="BRH Malayalam Extra" w:hAnsi="BRH Malayalam Extra" w:cs="BRH Malayalam Extra"/>
+                <w:sz w:val="32"/>
+                <w:szCs w:val="40"/>
+                <w:lang w:val="it-IT"/>
               </w:rPr>
               <w:t xml:space="preserve">bJ | </w:t>
             </w:r>
@@ -3427,12 +4090,14 @@
                 <w:rFonts w:ascii="BRH Malayalam Extra" w:hAnsi="BRH Malayalam Extra" w:cs="BRH Malayalam Extra"/>
                 <w:sz w:val="32"/>
                 <w:szCs w:val="40"/>
+                <w:lang w:val="it-IT"/>
               </w:rPr>
             </w:pPr>
             <w:r>
               <w:rPr>
                 <w:rFonts w:cs="BRH Malayalam Extra"/>
                 <w:szCs w:val="40"/>
+                <w:lang w:val="it-IT"/>
               </w:rPr>
               <w:t>44</w:t>
             </w:r>
@@ -3441,6 +4106,7 @@
                 <w:rFonts w:ascii="BRH Malayalam Extra" w:hAnsi="BRH Malayalam Extra" w:cs="BRH Malayalam Extra"/>
                 <w:sz w:val="32"/>
                 <w:szCs w:val="40"/>
+                <w:lang w:val="it-IT"/>
               </w:rPr>
               <w:t>)</w:t>
             </w:r>
@@ -3449,6 +4115,7 @@
                 <w:rFonts w:ascii="BRH Malayalam Extra" w:hAnsi="BRH Malayalam Extra" w:cs="BRH Malayalam Extra"/>
                 <w:sz w:val="32"/>
                 <w:szCs w:val="40"/>
+                <w:lang w:val="it-IT"/>
               </w:rPr>
               <w:tab/>
             </w:r>
@@ -3456,6 +4123,7 @@
               <w:rPr>
                 <w:rFonts w:cs="BRH Malayalam Extra"/>
                 <w:szCs w:val="40"/>
+                <w:lang w:val="it-IT"/>
               </w:rPr>
               <w:t>1</w:t>
             </w:r>
@@ -3464,6 +4132,7 @@
                 <w:rFonts w:ascii="BRH Malayalam Extra" w:hAnsi="BRH Malayalam Extra" w:cs="BRH Malayalam Extra"/>
                 <w:sz w:val="32"/>
                 <w:szCs w:val="40"/>
+                <w:lang w:val="it-IT"/>
               </w:rPr>
               <w:t>.</w:t>
             </w:r>
@@ -3471,6 +4140,7 @@
               <w:rPr>
                 <w:rFonts w:cs="BRH Malayalam Extra"/>
                 <w:szCs w:val="40"/>
+                <w:lang w:val="it-IT"/>
               </w:rPr>
               <w:t>6</w:t>
             </w:r>
@@ -3479,6 +4149,7 @@
                 <w:rFonts w:ascii="BRH Malayalam Extra" w:hAnsi="BRH Malayalam Extra" w:cs="BRH Malayalam Extra"/>
                 <w:sz w:val="32"/>
                 <w:szCs w:val="40"/>
+                <w:lang w:val="it-IT"/>
               </w:rPr>
               <w:t>.</w:t>
             </w:r>
@@ -3486,6 +4157,7 @@
               <w:rPr>
                 <w:rFonts w:cs="BRH Malayalam Extra"/>
                 <w:szCs w:val="40"/>
+                <w:lang w:val="it-IT"/>
               </w:rPr>
               <w:t>2</w:t>
             </w:r>
@@ -3494,6 +4166,7 @@
                 <w:rFonts w:ascii="BRH Malayalam Extra" w:hAnsi="BRH Malayalam Extra" w:cs="BRH Malayalam Extra"/>
                 <w:sz w:val="32"/>
                 <w:szCs w:val="40"/>
+                <w:lang w:val="it-IT"/>
               </w:rPr>
               <w:t>.</w:t>
             </w:r>
@@ -3501,6 +4174,7 @@
               <w:rPr>
                 <w:rFonts w:cs="BRH Malayalam Extra"/>
                 <w:szCs w:val="40"/>
+                <w:lang w:val="it-IT"/>
               </w:rPr>
               <w:t>1</w:t>
             </w:r>
@@ -3509,6 +4183,7 @@
                 <w:rFonts w:ascii="BRH Malayalam Extra" w:hAnsi="BRH Malayalam Extra" w:cs="BRH Malayalam Extra"/>
                 <w:sz w:val="32"/>
                 <w:szCs w:val="40"/>
+                <w:lang w:val="it-IT"/>
               </w:rPr>
               <w:t>(</w:t>
             </w:r>
@@ -3516,6 +4191,7 @@
               <w:rPr>
                 <w:rFonts w:cs="BRH Malayalam Extra"/>
                 <w:szCs w:val="40"/>
+                <w:lang w:val="it-IT"/>
               </w:rPr>
               <w:t>35</w:t>
             </w:r>
@@ -3524,32 +4200,25 @@
                 <w:rFonts w:ascii="BRH Malayalam Extra" w:hAnsi="BRH Malayalam Extra" w:cs="BRH Malayalam Extra"/>
                 <w:sz w:val="32"/>
                 <w:szCs w:val="40"/>
-              </w:rPr>
-              <w:t>)</w:t>
-            </w:r>
-            <w:proofErr w:type="gramStart"/>
-            <w:r>
-              <w:rPr>
-                <w:rFonts w:ascii="BRH Malayalam Extra" w:hAnsi="BRH Malayalam Extra" w:cs="BRH Malayalam Extra"/>
-                <w:sz w:val="32"/>
-                <w:szCs w:val="40"/>
-              </w:rPr>
-              <w:t>-  Rx</w:t>
-            </w:r>
-            <w:proofErr w:type="gramEnd"/>
-            <w:r>
-              <w:rPr>
-                <w:rFonts w:ascii="BRH Malayalam Extra" w:hAnsi="BRH Malayalam Extra" w:cs="BRH Malayalam Extra"/>
-                <w:sz w:val="25"/>
-                <w:szCs w:val="40"/>
-              </w:rPr>
-              <w:t>–</w:t>
-            </w:r>
-            <w:r>
-              <w:rPr>
-                <w:rFonts w:ascii="BRH Malayalam Extra" w:hAnsi="BRH Malayalam Extra" w:cs="BRH Malayalam Extra"/>
-                <w:sz w:val="32"/>
-                <w:szCs w:val="40"/>
+                <w:lang w:val="it-IT"/>
+              </w:rPr>
+              <w:t>)-  Rx</w:t>
+            </w:r>
+            <w:r>
+              <w:rPr>
+                <w:rFonts w:ascii="BRH Malayalam Extra" w:hAnsi="BRH Malayalam Extra" w:cs="BRH Malayalam Extra"/>
+                <w:sz w:val="25"/>
+                <w:szCs w:val="40"/>
+                <w:lang w:val="it-IT"/>
+              </w:rPr>
+              <w:t>–</w:t>
+            </w:r>
+            <w:r>
+              <w:rPr>
+                <w:rFonts w:ascii="BRH Malayalam Extra" w:hAnsi="BRH Malayalam Extra" w:cs="BRH Malayalam Extra"/>
+                <w:sz w:val="32"/>
+                <w:szCs w:val="40"/>
+                <w:lang w:val="it-IT"/>
               </w:rPr>
               <w:t>Z</w:t>
             </w:r>
@@ -3558,14 +4227,16 @@
                 <w:rFonts w:ascii="BRH Malayalam Extra" w:hAnsi="BRH Malayalam Extra" w:cs="BRH Malayalam Extra"/>
                 <w:sz w:val="25"/>
                 <w:szCs w:val="40"/>
-              </w:rPr>
-              <w:t>–</w:t>
-            </w:r>
-            <w:r>
-              <w:rPr>
-                <w:rFonts w:ascii="BRH Malayalam Extra" w:hAnsi="BRH Malayalam Extra" w:cs="BRH Malayalam Extra"/>
-                <w:sz w:val="32"/>
-                <w:szCs w:val="40"/>
+                <w:lang w:val="it-IT"/>
+              </w:rPr>
+              <w:t>–</w:t>
+            </w:r>
+            <w:r>
+              <w:rPr>
+                <w:rFonts w:ascii="BRH Malayalam Extra" w:hAnsi="BRH Malayalam Extra" w:cs="BRH Malayalam Extra"/>
+                <w:sz w:val="32"/>
+                <w:szCs w:val="40"/>
+                <w:lang w:val="it-IT"/>
               </w:rPr>
               <w:t>¥p</w:t>
             </w:r>
@@ -3574,6 +4245,7 @@
                 <w:rFonts w:ascii="BRH Malayalam Extra" w:hAnsi="BRH Malayalam Extra" w:cs="BRH Malayalam Extra"/>
                 <w:sz w:val="25"/>
                 <w:szCs w:val="40"/>
+                <w:lang w:val="it-IT"/>
               </w:rPr>
               <w:t>–</w:t>
             </w:r>
@@ -3583,6 +4255,7 @@
                 <w:sz w:val="32"/>
                 <w:szCs w:val="40"/>
                 <w:highlight w:val="yellow"/>
+                <w:lang w:val="it-IT"/>
               </w:rPr>
               <w:t>b</w:t>
             </w:r>
@@ -3591,6 +4264,7 @@
                 <w:rFonts w:ascii="BRH Malayalam Extra" w:hAnsi="BRH Malayalam Extra" w:cs="BRH Malayalam Extra"/>
                 <w:sz w:val="32"/>
                 <w:szCs w:val="40"/>
+                <w:lang w:val="it-IT"/>
               </w:rPr>
               <w:t xml:space="preserve">J || </w:t>
             </w:r>
@@ -3616,6 +4290,7 @@
                 <w:rFonts w:ascii="BRH Malayalam Extra" w:hAnsi="BRH Malayalam Extra" w:cs="BRH Malayalam Extra"/>
                 <w:sz w:val="32"/>
                 <w:szCs w:val="40"/>
+                <w:lang w:val="it-IT"/>
               </w:rPr>
               <w:t>Rx</w:t>
             </w:r>
@@ -3624,14 +4299,16 @@
                 <w:rFonts w:ascii="BRH Malayalam Extra" w:hAnsi="BRH Malayalam Extra" w:cs="BRH Malayalam Extra"/>
                 <w:sz w:val="25"/>
                 <w:szCs w:val="40"/>
-              </w:rPr>
-              <w:t>–</w:t>
-            </w:r>
-            <w:r>
-              <w:rPr>
-                <w:rFonts w:ascii="BRH Malayalam Extra" w:hAnsi="BRH Malayalam Extra" w:cs="BRH Malayalam Extra"/>
-                <w:sz w:val="32"/>
-                <w:szCs w:val="40"/>
+                <w:lang w:val="it-IT"/>
+              </w:rPr>
+              <w:t>–</w:t>
+            </w:r>
+            <w:r>
+              <w:rPr>
+                <w:rFonts w:ascii="BRH Malayalam Extra" w:hAnsi="BRH Malayalam Extra" w:cs="BRH Malayalam Extra"/>
+                <w:sz w:val="32"/>
+                <w:szCs w:val="40"/>
+                <w:lang w:val="it-IT"/>
               </w:rPr>
               <w:t>Z</w:t>
             </w:r>
@@ -3640,14 +4317,16 @@
                 <w:rFonts w:ascii="BRH Malayalam Extra" w:hAnsi="BRH Malayalam Extra" w:cs="BRH Malayalam Extra"/>
                 <w:sz w:val="25"/>
                 <w:szCs w:val="40"/>
-              </w:rPr>
-              <w:t>–</w:t>
-            </w:r>
-            <w:r>
-              <w:rPr>
-                <w:rFonts w:ascii="BRH Malayalam Extra" w:hAnsi="BRH Malayalam Extra" w:cs="BRH Malayalam Extra"/>
-                <w:sz w:val="32"/>
-                <w:szCs w:val="40"/>
+                <w:lang w:val="it-IT"/>
+              </w:rPr>
+              <w:t>–</w:t>
+            </w:r>
+            <w:r>
+              <w:rPr>
+                <w:rFonts w:ascii="BRH Malayalam Extra" w:hAnsi="BRH Malayalam Extra" w:cs="BRH Malayalam Extra"/>
+                <w:sz w:val="32"/>
+                <w:szCs w:val="40"/>
+                <w:lang w:val="it-IT"/>
               </w:rPr>
               <w:t>¥p</w:t>
             </w:r>
@@ -3656,14 +4335,16 @@
                 <w:rFonts w:ascii="BRH Malayalam Extra" w:hAnsi="BRH Malayalam Extra" w:cs="BRH Malayalam Extra"/>
                 <w:sz w:val="25"/>
                 <w:szCs w:val="40"/>
-              </w:rPr>
-              <w:t>–</w:t>
-            </w:r>
-            <w:r>
-              <w:rPr>
-                <w:rFonts w:ascii="BRH Malayalam Extra" w:hAnsi="BRH Malayalam Extra" w:cs="BRH Malayalam Extra"/>
-                <w:sz w:val="32"/>
-                <w:szCs w:val="40"/>
+                <w:lang w:val="it-IT"/>
+              </w:rPr>
+              <w:t>–</w:t>
+            </w:r>
+            <w:r>
+              <w:rPr>
+                <w:rFonts w:ascii="BRH Malayalam Extra" w:hAnsi="BRH Malayalam Extra" w:cs="BRH Malayalam Extra"/>
+                <w:sz w:val="32"/>
+                <w:szCs w:val="40"/>
+                <w:lang w:val="it-IT"/>
               </w:rPr>
               <w:t>b</w:t>
             </w:r>
@@ -3672,14 +4353,16 @@
                 <w:rFonts w:ascii="BRH Malayalam Extra" w:hAnsi="BRH Malayalam Extra" w:cs="BRH Malayalam Extra"/>
                 <w:sz w:val="25"/>
                 <w:szCs w:val="40"/>
-              </w:rPr>
-              <w:t>–</w:t>
-            </w:r>
-            <w:r>
-              <w:rPr>
-                <w:rFonts w:ascii="BRH Malayalam Extra" w:hAnsi="BRH Malayalam Extra" w:cs="BRH Malayalam Extra"/>
-                <w:sz w:val="32"/>
-                <w:szCs w:val="40"/>
+                <w:lang w:val="it-IT"/>
+              </w:rPr>
+              <w:t>–</w:t>
+            </w:r>
+            <w:r>
+              <w:rPr>
+                <w:rFonts w:ascii="BRH Malayalam Extra" w:hAnsi="BRH Malayalam Extra" w:cs="BRH Malayalam Extra"/>
+                <w:sz w:val="32"/>
+                <w:szCs w:val="40"/>
+                <w:lang w:val="it-IT"/>
               </w:rPr>
               <w:t xml:space="preserve"> CZy— RxZ - ¥p</w:t>
             </w:r>
@@ -3688,14 +4371,16 @@
                 <w:rFonts w:ascii="BRH Malayalam Extra" w:hAnsi="BRH Malayalam Extra" w:cs="BRH Malayalam Extra"/>
                 <w:sz w:val="25"/>
                 <w:szCs w:val="40"/>
-              </w:rPr>
-              <w:t>–</w:t>
-            </w:r>
-            <w:r>
-              <w:rPr>
-                <w:rFonts w:ascii="BRH Malayalam Extra" w:hAnsi="BRH Malayalam Extra" w:cs="BRH Malayalam Extra"/>
-                <w:sz w:val="32"/>
-                <w:szCs w:val="40"/>
+                <w:lang w:val="it-IT"/>
+              </w:rPr>
+              <w:t>–</w:t>
+            </w:r>
+            <w:r>
+              <w:rPr>
+                <w:rFonts w:ascii="BRH Malayalam Extra" w:hAnsi="BRH Malayalam Extra" w:cs="BRH Malayalam Extra"/>
+                <w:sz w:val="32"/>
+                <w:szCs w:val="40"/>
+                <w:lang w:val="it-IT"/>
               </w:rPr>
               <w:t>b</w:t>
             </w:r>
@@ -3704,14 +4389,16 @@
                 <w:rFonts w:ascii="BRH Malayalam Extra" w:hAnsi="BRH Malayalam Extra" w:cs="BRH Malayalam Extra"/>
                 <w:sz w:val="25"/>
                 <w:szCs w:val="40"/>
-              </w:rPr>
-              <w:t>–</w:t>
-            </w:r>
-            <w:r>
-              <w:rPr>
-                <w:rFonts w:ascii="BRH Malayalam Extra" w:hAnsi="BRH Malayalam Extra" w:cs="BRH Malayalam Extra"/>
-                <w:sz w:val="32"/>
-                <w:szCs w:val="40"/>
+                <w:lang w:val="it-IT"/>
+              </w:rPr>
+              <w:t>–</w:t>
+            </w:r>
+            <w:r>
+              <w:rPr>
+                <w:rFonts w:ascii="BRH Malayalam Extra" w:hAnsi="BRH Malayalam Extra" w:cs="BRH Malayalam Extra"/>
+                <w:sz w:val="32"/>
+                <w:szCs w:val="40"/>
+                <w:lang w:val="it-IT"/>
               </w:rPr>
               <w:t xml:space="preserve">J | </w:t>
             </w:r>
@@ -5196,7 +5883,6 @@
                 <w:szCs w:val="40"/>
                 <w:lang w:val="it-IT"/>
               </w:rPr>
-              <w:lastRenderedPageBreak/>
               <w:t>c</w:t>
             </w:r>
             <w:r>
@@ -5733,6 +6419,7 @@
                 <w:szCs w:val="40"/>
                 <w:lang w:val="it-IT"/>
               </w:rPr>
+              <w:lastRenderedPageBreak/>
               <w:t>A</w:t>
             </w:r>
             <w:r>
@@ -6885,8 +7572,18 @@
                 <w:sz w:val="32"/>
                 <w:szCs w:val="40"/>
               </w:rPr>
-              <w:t>Px | )</w:t>
-            </w:r>
+              <w:t xml:space="preserve">Px </w:t>
+            </w:r>
+            <w:proofErr w:type="gramStart"/>
+            <w:r>
+              <w:rPr>
+                <w:rFonts w:ascii="BRH Malayalam Extra" w:hAnsi="BRH Malayalam Extra" w:cs="BRH Malayalam Extra"/>
+                <w:sz w:val="32"/>
+                <w:szCs w:val="40"/>
+              </w:rPr>
+              <w:t>| )</w:t>
+            </w:r>
+            <w:proofErr w:type="gramEnd"/>
           </w:p>
           <w:p>
             <w:pPr>
@@ -7564,7 +8261,6 @@
                 <w:rFonts w:cs="BRH Malayalam Extra"/>
                 <w:szCs w:val="40"/>
               </w:rPr>
-              <w:lastRenderedPageBreak/>
               <w:t>9</w:t>
             </w:r>
             <w:r>
@@ -8146,6 +8842,7 @@
                 <w:rFonts w:cs="BRH Malayalam Extra"/>
                 <w:szCs w:val="40"/>
               </w:rPr>
+              <w:lastRenderedPageBreak/>
               <w:t>28</w:t>
             </w:r>
             <w:r>
@@ -10496,16 +11193,7 @@
                 <w:sz w:val="32"/>
                 <w:szCs w:val="40"/>
               </w:rPr>
-              <w:t xml:space="preserve">. </w:t>
-            </w:r>
-            <w:r>
-              <w:rPr>
-                <w:rFonts w:ascii="BRH Malayalam Extra" w:hAnsi="BRH Malayalam Extra" w:cs="BRH Malayalam Extra"/>
-                <w:sz w:val="32"/>
-                <w:szCs w:val="40"/>
-              </w:rPr>
-              <w:lastRenderedPageBreak/>
-              <w:t>py py py—r¢</w:t>
+              <w:t>. py py py—r¢</w:t>
             </w:r>
             <w:r>
               <w:rPr>
@@ -10922,7 +11610,16 @@
                 <w:sz w:val="32"/>
                 <w:szCs w:val="40"/>
               </w:rPr>
-              <w:t>© põ—sõZx isõZx</w:t>
+              <w:t xml:space="preserve">© </w:t>
+            </w:r>
+            <w:r>
+              <w:rPr>
+                <w:rFonts w:ascii="BRH Malayalam Extra" w:hAnsi="BRH Malayalam Extra" w:cs="BRH Malayalam Extra"/>
+                <w:sz w:val="32"/>
+                <w:szCs w:val="40"/>
+              </w:rPr>
+              <w:lastRenderedPageBreak/>
+              <w:t>põ—sõZx isõZx</w:t>
             </w:r>
             <w:r>
               <w:rPr>
@@ -11815,16 +12512,7 @@
                 <w:sz w:val="32"/>
                 <w:szCs w:val="40"/>
               </w:rPr>
-              <w:t xml:space="preserve">. </w:t>
-            </w:r>
-            <w:r>
-              <w:rPr>
-                <w:rFonts w:ascii="BRH Malayalam Extra" w:hAnsi="BRH Malayalam Extra" w:cs="BRH Malayalam Extra"/>
-                <w:sz w:val="32"/>
-                <w:szCs w:val="40"/>
-              </w:rPr>
-              <w:lastRenderedPageBreak/>
-              <w:t>py py py—r¢</w:t>
+              <w:t>. py py py—r¢</w:t>
             </w:r>
             <w:r>
               <w:rPr>
@@ -12241,7 +12929,16 @@
                 <w:sz w:val="32"/>
                 <w:szCs w:val="40"/>
               </w:rPr>
-              <w:t>© põ—sõZx isõZx</w:t>
+              <w:t xml:space="preserve">© </w:t>
+            </w:r>
+            <w:r>
+              <w:rPr>
+                <w:rFonts w:ascii="BRH Malayalam Extra" w:hAnsi="BRH Malayalam Extra" w:cs="BRH Malayalam Extra"/>
+                <w:sz w:val="32"/>
+                <w:szCs w:val="40"/>
+              </w:rPr>
+              <w:lastRenderedPageBreak/>
+              <w:t>põ—sõZx isõZx</w:t>
             </w:r>
             <w:r>
               <w:rPr>
@@ -13619,7 +14316,6 @@
                 <w:szCs w:val="40"/>
                 <w:lang w:val="it-IT"/>
               </w:rPr>
-              <w:lastRenderedPageBreak/>
               <w:t>19</w:t>
             </w:r>
             <w:r>
@@ -14047,6 +14743,7 @@
                 <w:sz w:val="32"/>
                 <w:szCs w:val="40"/>
               </w:rPr>
+              <w:lastRenderedPageBreak/>
               <w:t>sI</w:t>
             </w:r>
             <w:r>
@@ -15935,7 +16632,6 @@
                 <w:rFonts w:cs="BRH Malayalam Extra"/>
                 <w:szCs w:val="40"/>
               </w:rPr>
-              <w:lastRenderedPageBreak/>
               <w:t>19</w:t>
             </w:r>
             <w:r>
@@ -16373,6 +17069,7 @@
                 <w:szCs w:val="40"/>
                 <w:highlight w:val="green"/>
               </w:rPr>
+              <w:lastRenderedPageBreak/>
               <w:t>s—I</w:t>
             </w:r>
             <w:r>
@@ -18476,7 +19173,6 @@
                 <w:rFonts w:cs="BRH Malayalam Extra"/>
                 <w:szCs w:val="40"/>
               </w:rPr>
-              <w:lastRenderedPageBreak/>
               <w:t>41</w:t>
             </w:r>
             <w:r>
@@ -18776,7 +19472,6 @@
                 <w:rFonts w:cs="BRH Malayalam Extra"/>
                 <w:szCs w:val="40"/>
               </w:rPr>
-              <w:lastRenderedPageBreak/>
               <w:t>41</w:t>
             </w:r>
             <w:r>
@@ -21121,7 +21816,6 @@
                 <w:rFonts w:cs="BRH Malayalam Extra"/>
                 <w:szCs w:val="40"/>
               </w:rPr>
-              <w:lastRenderedPageBreak/>
               <w:t>5</w:t>
             </w:r>
             <w:r>
@@ -21520,7 +22214,16 @@
                 <w:sz w:val="32"/>
                 <w:szCs w:val="40"/>
               </w:rPr>
-              <w:t>hõ j</w:t>
+              <w:t xml:space="preserve">hõ </w:t>
+            </w:r>
+            <w:r>
+              <w:rPr>
+                <w:rFonts w:ascii="BRH Malayalam Extra" w:hAnsi="BRH Malayalam Extra" w:cs="BRH Malayalam Extra"/>
+                <w:sz w:val="32"/>
+                <w:szCs w:val="40"/>
+              </w:rPr>
+              <w:lastRenderedPageBreak/>
+              <w:t>j</w:t>
             </w:r>
             <w:r>
               <w:rPr>
@@ -22659,7 +23362,6 @@
                 <w:rFonts w:cs="BRH Malayalam Extra"/>
                 <w:szCs w:val="40"/>
               </w:rPr>
-              <w:lastRenderedPageBreak/>
               <w:t>5</w:t>
             </w:r>
             <w:r>
@@ -23025,7 +23727,16 @@
                 <w:sz w:val="32"/>
                 <w:szCs w:val="40"/>
               </w:rPr>
-              <w:t>hõ j</w:t>
+              <w:t xml:space="preserve">hõ </w:t>
+            </w:r>
+            <w:r>
+              <w:rPr>
+                <w:rFonts w:ascii="BRH Malayalam Extra" w:hAnsi="BRH Malayalam Extra" w:cs="BRH Malayalam Extra"/>
+                <w:sz w:val="32"/>
+                <w:szCs w:val="40"/>
+              </w:rPr>
+              <w:lastRenderedPageBreak/>
+              <w:t>j</w:t>
             </w:r>
             <w:r>
               <w:rPr>
@@ -25276,7 +25987,6 @@
                 <w:rFonts w:cs="BRH Malayalam Extra"/>
                 <w:szCs w:val="40"/>
               </w:rPr>
-              <w:lastRenderedPageBreak/>
               <w:t>53</w:t>
             </w:r>
             <w:r>
@@ -25657,7 +26367,6 @@
                 <w:rFonts w:cs="BRH Malayalam Extra"/>
                 <w:szCs w:val="40"/>
               </w:rPr>
-              <w:lastRenderedPageBreak/>
               <w:t>53</w:t>
             </w:r>
             <w:r>
@@ -27036,7 +27745,6 @@
                 <w:rFonts w:cs="BRH Malayalam Extra"/>
                 <w:szCs w:val="40"/>
               </w:rPr>
-              <w:lastRenderedPageBreak/>
               <w:t>33</w:t>
             </w:r>
             <w:r>
@@ -27433,7 +28141,16 @@
                 <w:sz w:val="32"/>
                 <w:szCs w:val="40"/>
               </w:rPr>
-              <w:t xml:space="preserve"> sxqz˜ª¥</w:t>
+              <w:t xml:space="preserve"> </w:t>
+            </w:r>
+            <w:r>
+              <w:rPr>
+                <w:rFonts w:ascii="BRH Malayalam Extra" w:hAnsi="BRH Malayalam Extra" w:cs="BRH Malayalam Extra"/>
+                <w:sz w:val="32"/>
+                <w:szCs w:val="40"/>
+              </w:rPr>
+              <w:lastRenderedPageBreak/>
+              <w:t>sxqz˜ª¥</w:t>
             </w:r>
             <w:r>
               <w:rPr>
@@ -28766,7 +29483,6 @@
                 <w:rFonts w:cs="BRH Malayalam Extra"/>
                 <w:szCs w:val="40"/>
               </w:rPr>
-              <w:lastRenderedPageBreak/>
               <w:t>33</w:t>
             </w:r>
             <w:r>
@@ -29138,7 +29854,16 @@
                 <w:sz w:val="32"/>
                 <w:szCs w:val="40"/>
               </w:rPr>
-              <w:t xml:space="preserve"> sxqz˜ª¥</w:t>
+              <w:t xml:space="preserve"> </w:t>
+            </w:r>
+            <w:r>
+              <w:rPr>
+                <w:rFonts w:ascii="BRH Malayalam Extra" w:hAnsi="BRH Malayalam Extra" w:cs="BRH Malayalam Extra"/>
+                <w:sz w:val="32"/>
+                <w:szCs w:val="40"/>
+              </w:rPr>
+              <w:lastRenderedPageBreak/>
+              <w:t>sxqz˜ª¥</w:t>
             </w:r>
             <w:r>
               <w:rPr>
@@ -31592,7 +32317,6 @@
                 <w:rFonts w:cs="BRH Malayalam Extra"/>
                 <w:szCs w:val="40"/>
               </w:rPr>
-              <w:lastRenderedPageBreak/>
               <w:t>50</w:t>
             </w:r>
             <w:r>
@@ -31684,7 +32408,25 @@
                 <w:sz w:val="32"/>
                 <w:szCs w:val="40"/>
               </w:rPr>
-              <w:t>)-  ¤¤p | s¢</w:t>
+              <w:t>)</w:t>
+            </w:r>
+            <w:proofErr w:type="gramStart"/>
+            <w:r>
+              <w:rPr>
+                <w:rFonts w:ascii="BRH Malayalam Extra" w:hAnsi="BRH Malayalam Extra" w:cs="BRH Malayalam Extra"/>
+                <w:sz w:val="32"/>
+                <w:szCs w:val="40"/>
+              </w:rPr>
+              <w:t>-  ¤</w:t>
+            </w:r>
+            <w:proofErr w:type="gramEnd"/>
+            <w:r>
+              <w:rPr>
+                <w:rFonts w:ascii="BRH Malayalam Extra" w:hAnsi="BRH Malayalam Extra" w:cs="BRH Malayalam Extra"/>
+                <w:sz w:val="32"/>
+                <w:szCs w:val="40"/>
+              </w:rPr>
+              <w:t>¤p | s¢</w:t>
             </w:r>
             <w:r>
               <w:rPr>
@@ -32220,6 +32962,7 @@
                 <w:rFonts w:cs="BRH Malayalam Extra"/>
                 <w:szCs w:val="40"/>
               </w:rPr>
+              <w:lastRenderedPageBreak/>
               <w:t>52</w:t>
             </w:r>
             <w:r>
@@ -35345,7 +36088,6 @@
                 <w:rFonts w:cs="BRH Malayalam Extra"/>
                 <w:szCs w:val="40"/>
               </w:rPr>
-              <w:lastRenderedPageBreak/>
               <w:t>2</w:t>
             </w:r>
             <w:r>
@@ -36592,6 +37334,7 @@
                 <w:rFonts w:cs="BRH Malayalam Extra"/>
                 <w:szCs w:val="40"/>
               </w:rPr>
+              <w:lastRenderedPageBreak/>
               <w:t>12</w:t>
             </w:r>
             <w:r>
@@ -36711,21 +37454,31 @@
               </w:rPr>
               <w:t>(³§</w:t>
             </w:r>
-            <w:r>
-              <w:rPr>
-                <w:rFonts w:ascii="BRH Malayalam Extra" w:hAnsi="BRH Malayalam Extra" w:cs="BRH Malayalam Extra"/>
-                <w:sz w:val="25"/>
-                <w:szCs w:val="40"/>
-              </w:rPr>
-              <w:t>–</w:t>
-            </w:r>
-            <w:r>
-              <w:rPr>
-                <w:rFonts w:ascii="BRH Malayalam Extra" w:hAnsi="BRH Malayalam Extra" w:cs="BRH Malayalam Extra"/>
-                <w:sz w:val="32"/>
-                <w:szCs w:val="40"/>
-              </w:rPr>
-              <w:t>)¥tx</w:t>
+            <w:proofErr w:type="gramStart"/>
+            <w:r>
+              <w:rPr>
+                <w:rFonts w:ascii="BRH Malayalam Extra" w:hAnsi="BRH Malayalam Extra" w:cs="BRH Malayalam Extra"/>
+                <w:sz w:val="25"/>
+                <w:szCs w:val="40"/>
+              </w:rPr>
+              <w:t>–</w:t>
+            </w:r>
+            <w:r>
+              <w:rPr>
+                <w:rFonts w:ascii="BRH Malayalam Extra" w:hAnsi="BRH Malayalam Extra" w:cs="BRH Malayalam Extra"/>
+                <w:sz w:val="32"/>
+                <w:szCs w:val="40"/>
+              </w:rPr>
+              <w:t>)¥</w:t>
+            </w:r>
+            <w:proofErr w:type="gramEnd"/>
+            <w:r>
+              <w:rPr>
+                <w:rFonts w:ascii="BRH Malayalam Extra" w:hAnsi="BRH Malayalam Extra" w:cs="BRH Malayalam Extra"/>
+                <w:sz w:val="32"/>
+                <w:szCs w:val="40"/>
+              </w:rPr>
+              <w:t>tx</w:t>
             </w:r>
             <w:r>
               <w:rPr>
@@ -36885,7 +37638,25 @@
                 <w:sz w:val="32"/>
                 <w:szCs w:val="40"/>
               </w:rPr>
-              <w:t xml:space="preserve"> öe öex(³§—)¥tx</w:t>
+              <w:t xml:space="preserve"> öe öex(³§</w:t>
+            </w:r>
+            <w:proofErr w:type="gramStart"/>
+            <w:r>
+              <w:rPr>
+                <w:rFonts w:ascii="BRH Malayalam Extra" w:hAnsi="BRH Malayalam Extra" w:cs="BRH Malayalam Extra"/>
+                <w:sz w:val="32"/>
+                <w:szCs w:val="40"/>
+              </w:rPr>
+              <w:t>—)¥</w:t>
+            </w:r>
+            <w:proofErr w:type="gramEnd"/>
+            <w:r>
+              <w:rPr>
+                <w:rFonts w:ascii="BRH Malayalam Extra" w:hAnsi="BRH Malayalam Extra" w:cs="BRH Malayalam Extra"/>
+                <w:sz w:val="32"/>
+                <w:szCs w:val="40"/>
+              </w:rPr>
+              <w:t>tx</w:t>
             </w:r>
             <w:r>
               <w:rPr>
@@ -36927,15 +37698,34 @@
                 <w:szCs w:val="40"/>
                 <w:highlight w:val="yellow"/>
               </w:rPr>
-              <w:t>³§</w:t>
-            </w:r>
-            <w:r>
-              <w:rPr>
-                <w:rFonts w:ascii="BRH Malayalam Extra" w:hAnsi="BRH Malayalam Extra" w:cs="BRH Malayalam Extra"/>
-                <w:sz w:val="32"/>
-                <w:szCs w:val="40"/>
-              </w:rPr>
-              <w:t>)¥tx</w:t>
+              <w:t>³</w:t>
+            </w:r>
+            <w:proofErr w:type="gramStart"/>
+            <w:r>
+              <w:rPr>
+                <w:rFonts w:ascii="BRH Malayalam Extra" w:hAnsi="BRH Malayalam Extra" w:cs="BRH Malayalam Extra"/>
+                <w:sz w:val="32"/>
+                <w:szCs w:val="40"/>
+                <w:highlight w:val="yellow"/>
+              </w:rPr>
+              <w:t>§</w:t>
+            </w:r>
+            <w:r>
+              <w:rPr>
+                <w:rFonts w:ascii="BRH Malayalam Extra" w:hAnsi="BRH Malayalam Extra" w:cs="BRH Malayalam Extra"/>
+                <w:sz w:val="32"/>
+                <w:szCs w:val="40"/>
+              </w:rPr>
+              <w:t>)¥</w:t>
+            </w:r>
+            <w:proofErr w:type="gramEnd"/>
+            <w:r>
+              <w:rPr>
+                <w:rFonts w:ascii="BRH Malayalam Extra" w:hAnsi="BRH Malayalam Extra" w:cs="BRH Malayalam Extra"/>
+                <w:sz w:val="32"/>
+                <w:szCs w:val="40"/>
+              </w:rPr>
+              <w:t>tx</w:t>
             </w:r>
             <w:r>
               <w:rPr>
@@ -36978,13 +37768,23 @@
               </w:rPr>
               <w:t>³</w:t>
             </w:r>
-            <w:r>
-              <w:rPr>
-                <w:rFonts w:ascii="BRH Malayalam Extra" w:hAnsi="BRH Malayalam Extra" w:cs="BRH Malayalam Extra"/>
-                <w:sz w:val="32"/>
-                <w:szCs w:val="40"/>
-              </w:rPr>
-              <w:t>§)¥tx</w:t>
+            <w:proofErr w:type="gramStart"/>
+            <w:r>
+              <w:rPr>
+                <w:rFonts w:ascii="BRH Malayalam Extra" w:hAnsi="BRH Malayalam Extra" w:cs="BRH Malayalam Extra"/>
+                <w:sz w:val="32"/>
+                <w:szCs w:val="40"/>
+              </w:rPr>
+              <w:t>§)¥</w:t>
+            </w:r>
+            <w:proofErr w:type="gramEnd"/>
+            <w:r>
+              <w:rPr>
+                <w:rFonts w:ascii="BRH Malayalam Extra" w:hAnsi="BRH Malayalam Extra" w:cs="BRH Malayalam Extra"/>
+                <w:sz w:val="32"/>
+                <w:szCs w:val="40"/>
+              </w:rPr>
+              <w:t>tx</w:t>
             </w:r>
             <w:r>
               <w:rPr>
@@ -37028,13 +37828,23 @@
               </w:rPr>
               <w:t>³</w:t>
             </w:r>
-            <w:r>
-              <w:rPr>
-                <w:rFonts w:ascii="BRH Malayalam Extra" w:hAnsi="BRH Malayalam Extra" w:cs="BRH Malayalam Extra"/>
-                <w:sz w:val="32"/>
-                <w:szCs w:val="40"/>
-              </w:rPr>
-              <w:t>§)¥tx</w:t>
+            <w:proofErr w:type="gramStart"/>
+            <w:r>
+              <w:rPr>
+                <w:rFonts w:ascii="BRH Malayalam Extra" w:hAnsi="BRH Malayalam Extra" w:cs="BRH Malayalam Extra"/>
+                <w:sz w:val="32"/>
+                <w:szCs w:val="40"/>
+              </w:rPr>
+              <w:t>§)¥</w:t>
+            </w:r>
+            <w:proofErr w:type="gramEnd"/>
+            <w:r>
+              <w:rPr>
+                <w:rFonts w:ascii="BRH Malayalam Extra" w:hAnsi="BRH Malayalam Extra" w:cs="BRH Malayalam Extra"/>
+                <w:sz w:val="32"/>
+                <w:szCs w:val="40"/>
+              </w:rPr>
+              <w:t>tx</w:t>
             </w:r>
             <w:r>
               <w:rPr>
@@ -37238,21 +38048,31 @@
               </w:rPr>
               <w:t>(³§</w:t>
             </w:r>
-            <w:r>
-              <w:rPr>
-                <w:rFonts w:ascii="BRH Malayalam Extra" w:hAnsi="BRH Malayalam Extra" w:cs="BRH Malayalam Extra"/>
-                <w:sz w:val="25"/>
-                <w:szCs w:val="40"/>
-              </w:rPr>
-              <w:t>–</w:t>
-            </w:r>
-            <w:r>
-              <w:rPr>
-                <w:rFonts w:ascii="BRH Malayalam Extra" w:hAnsi="BRH Malayalam Extra" w:cs="BRH Malayalam Extra"/>
-                <w:sz w:val="32"/>
-                <w:szCs w:val="40"/>
-              </w:rPr>
-              <w:t>)¥tx</w:t>
+            <w:proofErr w:type="gramStart"/>
+            <w:r>
+              <w:rPr>
+                <w:rFonts w:ascii="BRH Malayalam Extra" w:hAnsi="BRH Malayalam Extra" w:cs="BRH Malayalam Extra"/>
+                <w:sz w:val="25"/>
+                <w:szCs w:val="40"/>
+              </w:rPr>
+              <w:t>–</w:t>
+            </w:r>
+            <w:r>
+              <w:rPr>
+                <w:rFonts w:ascii="BRH Malayalam Extra" w:hAnsi="BRH Malayalam Extra" w:cs="BRH Malayalam Extra"/>
+                <w:sz w:val="32"/>
+                <w:szCs w:val="40"/>
+              </w:rPr>
+              <w:t>)¥</w:t>
+            </w:r>
+            <w:proofErr w:type="gramEnd"/>
+            <w:r>
+              <w:rPr>
+                <w:rFonts w:ascii="BRH Malayalam Extra" w:hAnsi="BRH Malayalam Extra" w:cs="BRH Malayalam Extra"/>
+                <w:sz w:val="32"/>
+                <w:szCs w:val="40"/>
+              </w:rPr>
+              <w:t>tx</w:t>
             </w:r>
             <w:r>
               <w:rPr>
@@ -37412,7 +38232,25 @@
                 <w:sz w:val="32"/>
                 <w:szCs w:val="40"/>
               </w:rPr>
-              <w:t xml:space="preserve"> öe öex(³§—)¥tx</w:t>
+              <w:t xml:space="preserve"> öe öex(³§</w:t>
+            </w:r>
+            <w:proofErr w:type="gramStart"/>
+            <w:r>
+              <w:rPr>
+                <w:rFonts w:ascii="BRH Malayalam Extra" w:hAnsi="BRH Malayalam Extra" w:cs="BRH Malayalam Extra"/>
+                <w:sz w:val="32"/>
+                <w:szCs w:val="40"/>
+              </w:rPr>
+              <w:t>—)¥</w:t>
+            </w:r>
+            <w:proofErr w:type="gramEnd"/>
+            <w:r>
+              <w:rPr>
+                <w:rFonts w:ascii="BRH Malayalam Extra" w:hAnsi="BRH Malayalam Extra" w:cs="BRH Malayalam Extra"/>
+                <w:sz w:val="32"/>
+                <w:szCs w:val="40"/>
+              </w:rPr>
+              <w:t>tx</w:t>
             </w:r>
             <w:r>
               <w:rPr>
@@ -38189,7 +39027,6 @@
           <w:szCs w:val="32"/>
           <w:u w:val="single"/>
         </w:rPr>
-        <w:lastRenderedPageBreak/>
         <w:t>TS Ghanam – TS 1.</w:t>
       </w:r>
       <w:r>
@@ -38251,27 +39088,7 @@
           <w:sz w:val="28"/>
           <w:szCs w:val="32"/>
         </w:rPr>
-        <w:t>(</w:t>
-      </w:r>
-      <w:proofErr w:type="gramStart"/>
-      <w:r>
-        <w:rPr>
-          <w:b/>
-          <w:bCs/>
-          <w:sz w:val="28"/>
-          <w:szCs w:val="32"/>
-        </w:rPr>
-        <w:t>ignore</w:t>
-      </w:r>
-      <w:proofErr w:type="gramEnd"/>
-      <w:r>
-        <w:rPr>
-          <w:b/>
-          <w:bCs/>
-          <w:sz w:val="28"/>
-          <w:szCs w:val="32"/>
-        </w:rPr>
-        <w:t xml:space="preserve"> those which are already incorporated in your book’s version and date)</w:t>
+        <w:t>(ignore those which are already incorporated in your book’s version and date)</w:t>
       </w:r>
     </w:p>
     <w:tbl>
@@ -38525,6 +39342,7 @@
           <w:szCs w:val="32"/>
           <w:u w:val="single"/>
         </w:rPr>
+        <w:lastRenderedPageBreak/>
         <w:t>=====================</w:t>
       </w:r>
     </w:p>
@@ -38551,7 +39369,7 @@
 </file>
 
 <file path=word/endnotes.xml><?xml version="1.0" encoding="utf-8"?>
-<w:endnotes xmlns:wpc="http://schemas.microsoft.com/office/word/2010/wordprocessingCanvas" xmlns:cx="http://schemas.microsoft.com/office/drawing/2014/chartex" xmlns:cx1="http://schemas.microsoft.com/office/drawing/2015/9/8/chartex" xmlns:cx2="http://schemas.microsoft.com/office/drawing/2015/10/21/chartex" xmlns:cx3="http://schemas.microsoft.com/office/drawing/2016/5/9/chartex" xmlns:cx4="http://schemas.microsoft.com/office/drawing/2016/5/10/chartex" xmlns:cx5="http://schemas.microsoft.com/office/drawing/2016/5/11/chartex" xmlns:cx6="http://schemas.microsoft.com/office/drawing/2016/5/12/chartex" xmlns:cx7="http://schemas.microsoft.com/office/drawing/2016/5/13/chartex" xmlns:cx8="http://schemas.microsoft.com/office/drawing/2016/5/14/chartex" xmlns:mc="http://schemas.openxmlformats.org/markup-compatibility/2006" xmlns:aink="http://schemas.microsoft.com/office/drawing/2016/ink" xmlns:am3d="http://schemas.microsoft.com/office/drawing/2017/model3d" xmlns:o="urn:schemas-microsoft-com:office:office" xmlns:oel="http://schemas.microsoft.com/office/2019/extlst" xmlns:r="http://schemas.openxmlformats.org/officeDocument/2006/relationships" xmlns:m="http://schemas.openxmlformats.org/officeDocument/2006/math" xmlns:v="urn:schemas-microsoft-com:vml" xmlns:wp14="http://schemas.microsoft.com/office/word/2010/wordprocessingDrawing" xmlns:wp="http://schemas.openxmlformats.org/drawingml/2006/wordprocessingDrawing" xmlns:w10="urn:schemas-microsoft-com:office:word" xmlns:w="http://schemas.openxmlformats.org/wordprocessingml/2006/main" xmlns:w14="http://schemas.microsoft.com/office/word/2010/wordml" xmlns:w15="http://schemas.microsoft.com/office/word/2012/wordml" xmlns:w16cex="http://schemas.microsoft.com/office/word/2018/wordml/cex" xmlns:w16cid="http://schemas.microsoft.com/office/word/2016/wordml/cid" xmlns:w16="http://schemas.microsoft.com/office/word/2018/wordml" xmlns:w16sdtdh="http://schemas.microsoft.com/office/word/2020/wordml/sdtdatahash" xmlns:w16se="http://schemas.microsoft.com/office/word/2015/wordml/symex" xmlns:wpg="http://schemas.microsoft.com/office/word/2010/wordprocessingGroup" xmlns:wpi="http://schemas.microsoft.com/office/word/2010/wordprocessingInk" xmlns:wne="http://schemas.microsoft.com/office/word/2006/wordml" xmlns:wps="http://schemas.microsoft.com/office/word/2010/wordprocessingShape" mc:Ignorable="w14 w15 w16se w16cid w16 w16cex w16sdtdh wp14">
+<w:endnotes xmlns:wpc="http://schemas.microsoft.com/office/word/2010/wordprocessingCanvas" xmlns:cx="http://schemas.microsoft.com/office/drawing/2014/chartex" xmlns:cx1="http://schemas.microsoft.com/office/drawing/2015/9/8/chartex" xmlns:cx2="http://schemas.microsoft.com/office/drawing/2015/10/21/chartex" xmlns:cx3="http://schemas.microsoft.com/office/drawing/2016/5/9/chartex" xmlns:cx4="http://schemas.microsoft.com/office/drawing/2016/5/10/chartex" xmlns:cx5="http://schemas.microsoft.com/office/drawing/2016/5/11/chartex" xmlns:cx6="http://schemas.microsoft.com/office/drawing/2016/5/12/chartex" xmlns:cx7="http://schemas.microsoft.com/office/drawing/2016/5/13/chartex" xmlns:cx8="http://schemas.microsoft.com/office/drawing/2016/5/14/chartex" xmlns:mc="http://schemas.openxmlformats.org/markup-compatibility/2006" xmlns:aink="http://schemas.microsoft.com/office/drawing/2016/ink" xmlns:am3d="http://schemas.microsoft.com/office/drawing/2017/model3d" xmlns:o="urn:schemas-microsoft-com:office:office" xmlns:oel="http://schemas.microsoft.com/office/2019/extlst" xmlns:r="http://schemas.openxmlformats.org/officeDocument/2006/relationships" xmlns:m="http://schemas.openxmlformats.org/officeDocument/2006/math" xmlns:v="urn:schemas-microsoft-com:vml" xmlns:wp14="http://schemas.microsoft.com/office/word/2010/wordprocessingDrawing" xmlns:wp="http://schemas.openxmlformats.org/drawingml/2006/wordprocessingDrawing" xmlns:w10="urn:schemas-microsoft-com:office:word" xmlns:w="http://schemas.openxmlformats.org/wordprocessingml/2006/main" xmlns:w14="http://schemas.microsoft.com/office/word/2010/wordml" xmlns:w15="http://schemas.microsoft.com/office/word/2012/wordml" xmlns:w16cex="http://schemas.microsoft.com/office/word/2018/wordml/cex" xmlns:w16cid="http://schemas.microsoft.com/office/word/2016/wordml/cid" xmlns:w16="http://schemas.microsoft.com/office/word/2018/wordml" xmlns:w16du="http://schemas.microsoft.com/office/word/2023/wordml/word16du" xmlns:w16sdtdh="http://schemas.microsoft.com/office/word/2020/wordml/sdtdatahash" xmlns:w16sdtfl="http://schemas.microsoft.com/office/word/2024/wordml/sdtformatlock" xmlns:w16se="http://schemas.microsoft.com/office/word/2015/wordml/symex" xmlns:wpg="http://schemas.microsoft.com/office/word/2010/wordprocessingGroup" xmlns:wpi="http://schemas.microsoft.com/office/word/2010/wordprocessingInk" xmlns:wne="http://schemas.microsoft.com/office/word/2006/wordml" xmlns:wps="http://schemas.microsoft.com/office/word/2010/wordprocessingShape" mc:Ignorable="w14 w15 w16se w16cid w16 w16cex w16sdtdh w16sdtfl w16du wp14">
   <w:endnote w:type="separator" w:id="-1">
     <w:p>
       <w:pPr>
@@ -38576,7 +39394,7 @@
 </file>
 
 <file path=word/footer1.xml><?xml version="1.0" encoding="utf-8"?>
-<w:ftr xmlns:wpc="http://schemas.microsoft.com/office/word/2010/wordprocessingCanvas" xmlns:cx="http://schemas.microsoft.com/office/drawing/2014/chartex" xmlns:cx1="http://schemas.microsoft.com/office/drawing/2015/9/8/chartex" xmlns:cx2="http://schemas.microsoft.com/office/drawing/2015/10/21/chartex" xmlns:cx3="http://schemas.microsoft.com/office/drawing/2016/5/9/chartex" xmlns:cx4="http://schemas.microsoft.com/office/drawing/2016/5/10/chartex" xmlns:cx5="http://schemas.microsoft.com/office/drawing/2016/5/11/chartex" xmlns:cx6="http://schemas.microsoft.com/office/drawing/2016/5/12/chartex" xmlns:cx7="http://schemas.microsoft.com/office/drawing/2016/5/13/chartex" xmlns:cx8="http://schemas.microsoft.com/office/drawing/2016/5/14/chartex" xmlns:mc="http://schemas.openxmlformats.org/markup-compatibility/2006" xmlns:aink="http://schemas.microsoft.com/office/drawing/2016/ink" xmlns:am3d="http://schemas.microsoft.com/office/drawing/2017/model3d" xmlns:o="urn:schemas-microsoft-com:office:office" xmlns:oel="http://schemas.microsoft.com/office/2019/extlst" xmlns:r="http://schemas.openxmlformats.org/officeDocument/2006/relationships" xmlns:m="http://schemas.openxmlformats.org/officeDocument/2006/math" xmlns:v="urn:schemas-microsoft-com:vml" xmlns:wp14="http://schemas.microsoft.com/office/word/2010/wordprocessingDrawing" xmlns:wp="http://schemas.openxmlformats.org/drawingml/2006/wordprocessingDrawing" xmlns:w10="urn:schemas-microsoft-com:office:word" xmlns:w="http://schemas.openxmlformats.org/wordprocessingml/2006/main" xmlns:w14="http://schemas.microsoft.com/office/word/2010/wordml" xmlns:w15="http://schemas.microsoft.com/office/word/2012/wordml" xmlns:w16cex="http://schemas.microsoft.com/office/word/2018/wordml/cex" xmlns:w16cid="http://schemas.microsoft.com/office/word/2016/wordml/cid" xmlns:w16="http://schemas.microsoft.com/office/word/2018/wordml" xmlns:w16sdtdh="http://schemas.microsoft.com/office/word/2020/wordml/sdtdatahash" xmlns:w16se="http://schemas.microsoft.com/office/word/2015/wordml/symex" xmlns:wpg="http://schemas.microsoft.com/office/word/2010/wordprocessingGroup" xmlns:wpi="http://schemas.microsoft.com/office/word/2010/wordprocessingInk" xmlns:wne="http://schemas.microsoft.com/office/word/2006/wordml" xmlns:wps="http://schemas.microsoft.com/office/word/2010/wordprocessingShape" mc:Ignorable="w14 w15 w16se w16cid w16 w16cex w16sdtdh wp14">
+<w:ftr xmlns:wpc="http://schemas.microsoft.com/office/word/2010/wordprocessingCanvas" xmlns:cx="http://schemas.microsoft.com/office/drawing/2014/chartex" xmlns:cx1="http://schemas.microsoft.com/office/drawing/2015/9/8/chartex" xmlns:cx2="http://schemas.microsoft.com/office/drawing/2015/10/21/chartex" xmlns:cx3="http://schemas.microsoft.com/office/drawing/2016/5/9/chartex" xmlns:cx4="http://schemas.microsoft.com/office/drawing/2016/5/10/chartex" xmlns:cx5="http://schemas.microsoft.com/office/drawing/2016/5/11/chartex" xmlns:cx6="http://schemas.microsoft.com/office/drawing/2016/5/12/chartex" xmlns:cx7="http://schemas.microsoft.com/office/drawing/2016/5/13/chartex" xmlns:cx8="http://schemas.microsoft.com/office/drawing/2016/5/14/chartex" xmlns:mc="http://schemas.openxmlformats.org/markup-compatibility/2006" xmlns:aink="http://schemas.microsoft.com/office/drawing/2016/ink" xmlns:am3d="http://schemas.microsoft.com/office/drawing/2017/model3d" xmlns:o="urn:schemas-microsoft-com:office:office" xmlns:oel="http://schemas.microsoft.com/office/2019/extlst" xmlns:r="http://schemas.openxmlformats.org/officeDocument/2006/relationships" xmlns:m="http://schemas.openxmlformats.org/officeDocument/2006/math" xmlns:v="urn:schemas-microsoft-com:vml" xmlns:wp14="http://schemas.microsoft.com/office/word/2010/wordprocessingDrawing" xmlns:wp="http://schemas.openxmlformats.org/drawingml/2006/wordprocessingDrawing" xmlns:w10="urn:schemas-microsoft-com:office:word" xmlns:w="http://schemas.openxmlformats.org/wordprocessingml/2006/main" xmlns:w14="http://schemas.microsoft.com/office/word/2010/wordml" xmlns:w15="http://schemas.microsoft.com/office/word/2012/wordml" xmlns:w16cex="http://schemas.microsoft.com/office/word/2018/wordml/cex" xmlns:w16cid="http://schemas.microsoft.com/office/word/2016/wordml/cid" xmlns:w16="http://schemas.microsoft.com/office/word/2018/wordml" xmlns:w16du="http://schemas.microsoft.com/office/word/2023/wordml/word16du" xmlns:w16sdtdh="http://schemas.microsoft.com/office/word/2020/wordml/sdtdatahash" xmlns:w16sdtfl="http://schemas.microsoft.com/office/word/2024/wordml/sdtformatlock" xmlns:w16se="http://schemas.microsoft.com/office/word/2015/wordml/symex" xmlns:wpg="http://schemas.microsoft.com/office/word/2010/wordprocessingGroup" xmlns:wpi="http://schemas.microsoft.com/office/word/2010/wordprocessingInk" xmlns:wne="http://schemas.microsoft.com/office/word/2006/wordml" xmlns:wps="http://schemas.microsoft.com/office/word/2010/wordprocessingShape" mc:Ignorable="w14 w15 w16se w16cid w16 w16cex w16sdtdh w16sdtfl w16du wp14">
   <w:p>
     <w:pPr>
       <w:pBdr>
@@ -38758,7 +39576,7 @@
 </file>
 
 <file path=word/footer2.xml><?xml version="1.0" encoding="utf-8"?>
-<w:ftr xmlns:wpc="http://schemas.microsoft.com/office/word/2010/wordprocessingCanvas" xmlns:cx="http://schemas.microsoft.com/office/drawing/2014/chartex" xmlns:cx1="http://schemas.microsoft.com/office/drawing/2015/9/8/chartex" xmlns:cx2="http://schemas.microsoft.com/office/drawing/2015/10/21/chartex" xmlns:cx3="http://schemas.microsoft.com/office/drawing/2016/5/9/chartex" xmlns:cx4="http://schemas.microsoft.com/office/drawing/2016/5/10/chartex" xmlns:cx5="http://schemas.microsoft.com/office/drawing/2016/5/11/chartex" xmlns:cx6="http://schemas.microsoft.com/office/drawing/2016/5/12/chartex" xmlns:cx7="http://schemas.microsoft.com/office/drawing/2016/5/13/chartex" xmlns:cx8="http://schemas.microsoft.com/office/drawing/2016/5/14/chartex" xmlns:mc="http://schemas.openxmlformats.org/markup-compatibility/2006" xmlns:aink="http://schemas.microsoft.com/office/drawing/2016/ink" xmlns:am3d="http://schemas.microsoft.com/office/drawing/2017/model3d" xmlns:o="urn:schemas-microsoft-com:office:office" xmlns:oel="http://schemas.microsoft.com/office/2019/extlst" xmlns:r="http://schemas.openxmlformats.org/officeDocument/2006/relationships" xmlns:m="http://schemas.openxmlformats.org/officeDocument/2006/math" xmlns:v="urn:schemas-microsoft-com:vml" xmlns:wp14="http://schemas.microsoft.com/office/word/2010/wordprocessingDrawing" xmlns:wp="http://schemas.openxmlformats.org/drawingml/2006/wordprocessingDrawing" xmlns:w10="urn:schemas-microsoft-com:office:word" xmlns:w="http://schemas.openxmlformats.org/wordprocessingml/2006/main" xmlns:w14="http://schemas.microsoft.com/office/word/2010/wordml" xmlns:w15="http://schemas.microsoft.com/office/word/2012/wordml" xmlns:w16cex="http://schemas.microsoft.com/office/word/2018/wordml/cex" xmlns:w16cid="http://schemas.microsoft.com/office/word/2016/wordml/cid" xmlns:w16="http://schemas.microsoft.com/office/word/2018/wordml" xmlns:w16sdtdh="http://schemas.microsoft.com/office/word/2020/wordml/sdtdatahash" xmlns:w16se="http://schemas.microsoft.com/office/word/2015/wordml/symex" xmlns:wpg="http://schemas.microsoft.com/office/word/2010/wordprocessingGroup" xmlns:wpi="http://schemas.microsoft.com/office/word/2010/wordprocessingInk" xmlns:wne="http://schemas.microsoft.com/office/word/2006/wordml" xmlns:wps="http://schemas.microsoft.com/office/word/2010/wordprocessingShape" mc:Ignorable="w14 w15 w16se w16cid w16 w16cex w16sdtdh wp14">
+<w:ftr xmlns:wpc="http://schemas.microsoft.com/office/word/2010/wordprocessingCanvas" xmlns:cx="http://schemas.microsoft.com/office/drawing/2014/chartex" xmlns:cx1="http://schemas.microsoft.com/office/drawing/2015/9/8/chartex" xmlns:cx2="http://schemas.microsoft.com/office/drawing/2015/10/21/chartex" xmlns:cx3="http://schemas.microsoft.com/office/drawing/2016/5/9/chartex" xmlns:cx4="http://schemas.microsoft.com/office/drawing/2016/5/10/chartex" xmlns:cx5="http://schemas.microsoft.com/office/drawing/2016/5/11/chartex" xmlns:cx6="http://schemas.microsoft.com/office/drawing/2016/5/12/chartex" xmlns:cx7="http://schemas.microsoft.com/office/drawing/2016/5/13/chartex" xmlns:cx8="http://schemas.microsoft.com/office/drawing/2016/5/14/chartex" xmlns:mc="http://schemas.openxmlformats.org/markup-compatibility/2006" xmlns:aink="http://schemas.microsoft.com/office/drawing/2016/ink" xmlns:am3d="http://schemas.microsoft.com/office/drawing/2017/model3d" xmlns:o="urn:schemas-microsoft-com:office:office" xmlns:oel="http://schemas.microsoft.com/office/2019/extlst" xmlns:r="http://schemas.openxmlformats.org/officeDocument/2006/relationships" xmlns:m="http://schemas.openxmlformats.org/officeDocument/2006/math" xmlns:v="urn:schemas-microsoft-com:vml" xmlns:wp14="http://schemas.microsoft.com/office/word/2010/wordprocessingDrawing" xmlns:wp="http://schemas.openxmlformats.org/drawingml/2006/wordprocessingDrawing" xmlns:w10="urn:schemas-microsoft-com:office:word" xmlns:w="http://schemas.openxmlformats.org/wordprocessingml/2006/main" xmlns:w14="http://schemas.microsoft.com/office/word/2010/wordml" xmlns:w15="http://schemas.microsoft.com/office/word/2012/wordml" xmlns:w16cex="http://schemas.microsoft.com/office/word/2018/wordml/cex" xmlns:w16cid="http://schemas.microsoft.com/office/word/2016/wordml/cid" xmlns:w16="http://schemas.microsoft.com/office/word/2018/wordml" xmlns:w16du="http://schemas.microsoft.com/office/word/2023/wordml/word16du" xmlns:w16sdtdh="http://schemas.microsoft.com/office/word/2020/wordml/sdtdatahash" xmlns:w16sdtfl="http://schemas.microsoft.com/office/word/2024/wordml/sdtformatlock" xmlns:w16se="http://schemas.microsoft.com/office/word/2015/wordml/symex" xmlns:wpg="http://schemas.microsoft.com/office/word/2010/wordprocessingGroup" xmlns:wpi="http://schemas.microsoft.com/office/word/2010/wordprocessingInk" xmlns:wne="http://schemas.microsoft.com/office/word/2006/wordml" xmlns:wps="http://schemas.microsoft.com/office/word/2010/wordprocessingShape" mc:Ignorable="w14 w15 w16se w16cid w16 w16cex w16sdtdh w16sdtfl w16du wp14">
   <w:p>
     <w:pPr>
       <w:pBdr>
@@ -38964,7 +39782,7 @@
 </file>
 
 <file path=word/footnotes.xml><?xml version="1.0" encoding="utf-8"?>
-<w:footnotes xmlns:wpc="http://schemas.microsoft.com/office/word/2010/wordprocessingCanvas" xmlns:cx="http://schemas.microsoft.com/office/drawing/2014/chartex" xmlns:cx1="http://schemas.microsoft.com/office/drawing/2015/9/8/chartex" xmlns:cx2="http://schemas.microsoft.com/office/drawing/2015/10/21/chartex" xmlns:cx3="http://schemas.microsoft.com/office/drawing/2016/5/9/chartex" xmlns:cx4="http://schemas.microsoft.com/office/drawing/2016/5/10/chartex" xmlns:cx5="http://schemas.microsoft.com/office/drawing/2016/5/11/chartex" xmlns:cx6="http://schemas.microsoft.com/office/drawing/2016/5/12/chartex" xmlns:cx7="http://schemas.microsoft.com/office/drawing/2016/5/13/chartex" xmlns:cx8="http://schemas.microsoft.com/office/drawing/2016/5/14/chartex" xmlns:mc="http://schemas.openxmlformats.org/markup-compatibility/2006" xmlns:aink="http://schemas.microsoft.com/office/drawing/2016/ink" xmlns:am3d="http://schemas.microsoft.com/office/drawing/2017/model3d" xmlns:o="urn:schemas-microsoft-com:office:office" xmlns:oel="http://schemas.microsoft.com/office/2019/extlst" xmlns:r="http://schemas.openxmlformats.org/officeDocument/2006/relationships" xmlns:m="http://schemas.openxmlformats.org/officeDocument/2006/math" xmlns:v="urn:schemas-microsoft-com:vml" xmlns:wp14="http://schemas.microsoft.com/office/word/2010/wordprocessingDrawing" xmlns:wp="http://schemas.openxmlformats.org/drawingml/2006/wordprocessingDrawing" xmlns:w10="urn:schemas-microsoft-com:office:word" xmlns:w="http://schemas.openxmlformats.org/wordprocessingml/2006/main" xmlns:w14="http://schemas.microsoft.com/office/word/2010/wordml" xmlns:w15="http://schemas.microsoft.com/office/word/2012/wordml" xmlns:w16cex="http://schemas.microsoft.com/office/word/2018/wordml/cex" xmlns:w16cid="http://schemas.microsoft.com/office/word/2016/wordml/cid" xmlns:w16="http://schemas.microsoft.com/office/word/2018/wordml" xmlns:w16sdtdh="http://schemas.microsoft.com/office/word/2020/wordml/sdtdatahash" xmlns:w16se="http://schemas.microsoft.com/office/word/2015/wordml/symex" xmlns:wpg="http://schemas.microsoft.com/office/word/2010/wordprocessingGroup" xmlns:wpi="http://schemas.microsoft.com/office/word/2010/wordprocessingInk" xmlns:wne="http://schemas.microsoft.com/office/word/2006/wordml" xmlns:wps="http://schemas.microsoft.com/office/word/2010/wordprocessingShape" mc:Ignorable="w14 w15 w16se w16cid w16 w16cex w16sdtdh wp14">
+<w:footnotes xmlns:wpc="http://schemas.microsoft.com/office/word/2010/wordprocessingCanvas" xmlns:cx="http://schemas.microsoft.com/office/drawing/2014/chartex" xmlns:cx1="http://schemas.microsoft.com/office/drawing/2015/9/8/chartex" xmlns:cx2="http://schemas.microsoft.com/office/drawing/2015/10/21/chartex" xmlns:cx3="http://schemas.microsoft.com/office/drawing/2016/5/9/chartex" xmlns:cx4="http://schemas.microsoft.com/office/drawing/2016/5/10/chartex" xmlns:cx5="http://schemas.microsoft.com/office/drawing/2016/5/11/chartex" xmlns:cx6="http://schemas.microsoft.com/office/drawing/2016/5/12/chartex" xmlns:cx7="http://schemas.microsoft.com/office/drawing/2016/5/13/chartex" xmlns:cx8="http://schemas.microsoft.com/office/drawing/2016/5/14/chartex" xmlns:mc="http://schemas.openxmlformats.org/markup-compatibility/2006" xmlns:aink="http://schemas.microsoft.com/office/drawing/2016/ink" xmlns:am3d="http://schemas.microsoft.com/office/drawing/2017/model3d" xmlns:o="urn:schemas-microsoft-com:office:office" xmlns:oel="http://schemas.microsoft.com/office/2019/extlst" xmlns:r="http://schemas.openxmlformats.org/officeDocument/2006/relationships" xmlns:m="http://schemas.openxmlformats.org/officeDocument/2006/math" xmlns:v="urn:schemas-microsoft-com:vml" xmlns:wp14="http://schemas.microsoft.com/office/word/2010/wordprocessingDrawing" xmlns:wp="http://schemas.openxmlformats.org/drawingml/2006/wordprocessingDrawing" xmlns:w10="urn:schemas-microsoft-com:office:word" xmlns:w="http://schemas.openxmlformats.org/wordprocessingml/2006/main" xmlns:w14="http://schemas.microsoft.com/office/word/2010/wordml" xmlns:w15="http://schemas.microsoft.com/office/word/2012/wordml" xmlns:w16cex="http://schemas.microsoft.com/office/word/2018/wordml/cex" xmlns:w16cid="http://schemas.microsoft.com/office/word/2016/wordml/cid" xmlns:w16="http://schemas.microsoft.com/office/word/2018/wordml" xmlns:w16du="http://schemas.microsoft.com/office/word/2023/wordml/word16du" xmlns:w16sdtdh="http://schemas.microsoft.com/office/word/2020/wordml/sdtdatahash" xmlns:w16sdtfl="http://schemas.microsoft.com/office/word/2024/wordml/sdtformatlock" xmlns:w16se="http://schemas.microsoft.com/office/word/2015/wordml/symex" xmlns:wpg="http://schemas.microsoft.com/office/word/2010/wordprocessingGroup" xmlns:wpi="http://schemas.microsoft.com/office/word/2010/wordprocessingInk" xmlns:wne="http://schemas.microsoft.com/office/word/2006/wordml" xmlns:wps="http://schemas.microsoft.com/office/word/2010/wordprocessingShape" mc:Ignorable="w14 w15 w16se w16cid w16 w16cex w16sdtdh w16sdtfl w16du wp14">
   <w:footnote w:type="separator" w:id="-1">
     <w:p>
       <w:pPr>
@@ -38989,7 +39807,7 @@
 </file>
 
 <file path=word/header1.xml><?xml version="1.0" encoding="utf-8"?>
-<w:hdr xmlns:wpc="http://schemas.microsoft.com/office/word/2010/wordprocessingCanvas" xmlns:cx="http://schemas.microsoft.com/office/drawing/2014/chartex" xmlns:cx1="http://schemas.microsoft.com/office/drawing/2015/9/8/chartex" xmlns:cx2="http://schemas.microsoft.com/office/drawing/2015/10/21/chartex" xmlns:cx3="http://schemas.microsoft.com/office/drawing/2016/5/9/chartex" xmlns:cx4="http://schemas.microsoft.com/office/drawing/2016/5/10/chartex" xmlns:cx5="http://schemas.microsoft.com/office/drawing/2016/5/11/chartex" xmlns:cx6="http://schemas.microsoft.com/office/drawing/2016/5/12/chartex" xmlns:cx7="http://schemas.microsoft.com/office/drawing/2016/5/13/chartex" xmlns:cx8="http://schemas.microsoft.com/office/drawing/2016/5/14/chartex" xmlns:mc="http://schemas.openxmlformats.org/markup-compatibility/2006" xmlns:aink="http://schemas.microsoft.com/office/drawing/2016/ink" xmlns:am3d="http://schemas.microsoft.com/office/drawing/2017/model3d" xmlns:o="urn:schemas-microsoft-com:office:office" xmlns:oel="http://schemas.microsoft.com/office/2019/extlst" xmlns:r="http://schemas.openxmlformats.org/officeDocument/2006/relationships" xmlns:m="http://schemas.openxmlformats.org/officeDocument/2006/math" xmlns:v="urn:schemas-microsoft-com:vml" xmlns:wp14="http://schemas.microsoft.com/office/word/2010/wordprocessingDrawing" xmlns:wp="http://schemas.openxmlformats.org/drawingml/2006/wordprocessingDrawing" xmlns:w10="urn:schemas-microsoft-com:office:word" xmlns:w="http://schemas.openxmlformats.org/wordprocessingml/2006/main" xmlns:w14="http://schemas.microsoft.com/office/word/2010/wordml" xmlns:w15="http://schemas.microsoft.com/office/word/2012/wordml" xmlns:w16cex="http://schemas.microsoft.com/office/word/2018/wordml/cex" xmlns:w16cid="http://schemas.microsoft.com/office/word/2016/wordml/cid" xmlns:w16="http://schemas.microsoft.com/office/word/2018/wordml" xmlns:w16sdtdh="http://schemas.microsoft.com/office/word/2020/wordml/sdtdatahash" xmlns:w16se="http://schemas.microsoft.com/office/word/2015/wordml/symex" xmlns:wpg="http://schemas.microsoft.com/office/word/2010/wordprocessingGroup" xmlns:wpi="http://schemas.microsoft.com/office/word/2010/wordprocessingInk" xmlns:wne="http://schemas.microsoft.com/office/word/2006/wordml" xmlns:wps="http://schemas.microsoft.com/office/word/2010/wordprocessingShape" mc:Ignorable="w14 w15 w16se w16cid w16 w16cex w16sdtdh wp14">
+<w:hdr xmlns:wpc="http://schemas.microsoft.com/office/word/2010/wordprocessingCanvas" xmlns:cx="http://schemas.microsoft.com/office/drawing/2014/chartex" xmlns:cx1="http://schemas.microsoft.com/office/drawing/2015/9/8/chartex" xmlns:cx2="http://schemas.microsoft.com/office/drawing/2015/10/21/chartex" xmlns:cx3="http://schemas.microsoft.com/office/drawing/2016/5/9/chartex" xmlns:cx4="http://schemas.microsoft.com/office/drawing/2016/5/10/chartex" xmlns:cx5="http://schemas.microsoft.com/office/drawing/2016/5/11/chartex" xmlns:cx6="http://schemas.microsoft.com/office/drawing/2016/5/12/chartex" xmlns:cx7="http://schemas.microsoft.com/office/drawing/2016/5/13/chartex" xmlns:cx8="http://schemas.microsoft.com/office/drawing/2016/5/14/chartex" xmlns:mc="http://schemas.openxmlformats.org/markup-compatibility/2006" xmlns:aink="http://schemas.microsoft.com/office/drawing/2016/ink" xmlns:am3d="http://schemas.microsoft.com/office/drawing/2017/model3d" xmlns:o="urn:schemas-microsoft-com:office:office" xmlns:oel="http://schemas.microsoft.com/office/2019/extlst" xmlns:r="http://schemas.openxmlformats.org/officeDocument/2006/relationships" xmlns:m="http://schemas.openxmlformats.org/officeDocument/2006/math" xmlns:v="urn:schemas-microsoft-com:vml" xmlns:wp14="http://schemas.microsoft.com/office/word/2010/wordprocessingDrawing" xmlns:wp="http://schemas.openxmlformats.org/drawingml/2006/wordprocessingDrawing" xmlns:w10="urn:schemas-microsoft-com:office:word" xmlns:w="http://schemas.openxmlformats.org/wordprocessingml/2006/main" xmlns:w14="http://schemas.microsoft.com/office/word/2010/wordml" xmlns:w15="http://schemas.microsoft.com/office/word/2012/wordml" xmlns:w16cex="http://schemas.microsoft.com/office/word/2018/wordml/cex" xmlns:w16cid="http://schemas.microsoft.com/office/word/2016/wordml/cid" xmlns:w16="http://schemas.microsoft.com/office/word/2018/wordml" xmlns:w16du="http://schemas.microsoft.com/office/word/2023/wordml/word16du" xmlns:w16sdtdh="http://schemas.microsoft.com/office/word/2020/wordml/sdtdatahash" xmlns:w16sdtfl="http://schemas.microsoft.com/office/word/2024/wordml/sdtformatlock" xmlns:w16se="http://schemas.microsoft.com/office/word/2015/wordml/symex" xmlns:wpg="http://schemas.microsoft.com/office/word/2010/wordprocessingGroup" xmlns:wpi="http://schemas.microsoft.com/office/word/2010/wordprocessingInk" xmlns:wne="http://schemas.microsoft.com/office/word/2006/wordml" xmlns:wps="http://schemas.microsoft.com/office/word/2010/wordprocessingShape" mc:Ignorable="w14 w15 w16se w16cid w16 w16cex w16sdtdh w16sdtfl w16du wp14">
   <w:p>
     <w:pPr>
       <w:pStyle w:val="Header"/>
@@ -39010,7 +39828,7 @@
 </file>
 
 <file path=word/header2.xml><?xml version="1.0" encoding="utf-8"?>
-<w:hdr xmlns:wpc="http://schemas.microsoft.com/office/word/2010/wordprocessingCanvas" xmlns:cx="http://schemas.microsoft.com/office/drawing/2014/chartex" xmlns:cx1="http://schemas.microsoft.com/office/drawing/2015/9/8/chartex" xmlns:cx2="http://schemas.microsoft.com/office/drawing/2015/10/21/chartex" xmlns:cx3="http://schemas.microsoft.com/office/drawing/2016/5/9/chartex" xmlns:cx4="http://schemas.microsoft.com/office/drawing/2016/5/10/chartex" xmlns:cx5="http://schemas.microsoft.com/office/drawing/2016/5/11/chartex" xmlns:cx6="http://schemas.microsoft.com/office/drawing/2016/5/12/chartex" xmlns:cx7="http://schemas.microsoft.com/office/drawing/2016/5/13/chartex" xmlns:cx8="http://schemas.microsoft.com/office/drawing/2016/5/14/chartex" xmlns:mc="http://schemas.openxmlformats.org/markup-compatibility/2006" xmlns:aink="http://schemas.microsoft.com/office/drawing/2016/ink" xmlns:am3d="http://schemas.microsoft.com/office/drawing/2017/model3d" xmlns:o="urn:schemas-microsoft-com:office:office" xmlns:oel="http://schemas.microsoft.com/office/2019/extlst" xmlns:r="http://schemas.openxmlformats.org/officeDocument/2006/relationships" xmlns:m="http://schemas.openxmlformats.org/officeDocument/2006/math" xmlns:v="urn:schemas-microsoft-com:vml" xmlns:wp14="http://schemas.microsoft.com/office/word/2010/wordprocessingDrawing" xmlns:wp="http://schemas.openxmlformats.org/drawingml/2006/wordprocessingDrawing" xmlns:w10="urn:schemas-microsoft-com:office:word" xmlns:w="http://schemas.openxmlformats.org/wordprocessingml/2006/main" xmlns:w14="http://schemas.microsoft.com/office/word/2010/wordml" xmlns:w15="http://schemas.microsoft.com/office/word/2012/wordml" xmlns:w16cex="http://schemas.microsoft.com/office/word/2018/wordml/cex" xmlns:w16cid="http://schemas.microsoft.com/office/word/2016/wordml/cid" xmlns:w16="http://schemas.microsoft.com/office/word/2018/wordml" xmlns:w16sdtdh="http://schemas.microsoft.com/office/word/2020/wordml/sdtdatahash" xmlns:w16se="http://schemas.microsoft.com/office/word/2015/wordml/symex" xmlns:wpg="http://schemas.microsoft.com/office/word/2010/wordprocessingGroup" xmlns:wpi="http://schemas.microsoft.com/office/word/2010/wordprocessingInk" xmlns:wne="http://schemas.microsoft.com/office/word/2006/wordml" xmlns:wps="http://schemas.microsoft.com/office/word/2010/wordprocessingShape" mc:Ignorable="w14 w15 w16se w16cid w16 w16cex w16sdtdh wp14">
+<w:hdr xmlns:wpc="http://schemas.microsoft.com/office/word/2010/wordprocessingCanvas" xmlns:cx="http://schemas.microsoft.com/office/drawing/2014/chartex" xmlns:cx1="http://schemas.microsoft.com/office/drawing/2015/9/8/chartex" xmlns:cx2="http://schemas.microsoft.com/office/drawing/2015/10/21/chartex" xmlns:cx3="http://schemas.microsoft.com/office/drawing/2016/5/9/chartex" xmlns:cx4="http://schemas.microsoft.com/office/drawing/2016/5/10/chartex" xmlns:cx5="http://schemas.microsoft.com/office/drawing/2016/5/11/chartex" xmlns:cx6="http://schemas.microsoft.com/office/drawing/2016/5/12/chartex" xmlns:cx7="http://schemas.microsoft.com/office/drawing/2016/5/13/chartex" xmlns:cx8="http://schemas.microsoft.com/office/drawing/2016/5/14/chartex" xmlns:mc="http://schemas.openxmlformats.org/markup-compatibility/2006" xmlns:aink="http://schemas.microsoft.com/office/drawing/2016/ink" xmlns:am3d="http://schemas.microsoft.com/office/drawing/2017/model3d" xmlns:o="urn:schemas-microsoft-com:office:office" xmlns:oel="http://schemas.microsoft.com/office/2019/extlst" xmlns:r="http://schemas.openxmlformats.org/officeDocument/2006/relationships" xmlns:m="http://schemas.openxmlformats.org/officeDocument/2006/math" xmlns:v="urn:schemas-microsoft-com:vml" xmlns:wp14="http://schemas.microsoft.com/office/word/2010/wordprocessingDrawing" xmlns:wp="http://schemas.openxmlformats.org/drawingml/2006/wordprocessingDrawing" xmlns:w10="urn:schemas-microsoft-com:office:word" xmlns:w="http://schemas.openxmlformats.org/wordprocessingml/2006/main" xmlns:w14="http://schemas.microsoft.com/office/word/2010/wordml" xmlns:w15="http://schemas.microsoft.com/office/word/2012/wordml" xmlns:w16cex="http://schemas.microsoft.com/office/word/2018/wordml/cex" xmlns:w16cid="http://schemas.microsoft.com/office/word/2016/wordml/cid" xmlns:w16="http://schemas.microsoft.com/office/word/2018/wordml" xmlns:w16du="http://schemas.microsoft.com/office/word/2023/wordml/word16du" xmlns:w16sdtdh="http://schemas.microsoft.com/office/word/2020/wordml/sdtdatahash" xmlns:w16sdtfl="http://schemas.microsoft.com/office/word/2024/wordml/sdtformatlock" xmlns:w16se="http://schemas.microsoft.com/office/word/2015/wordml/symex" xmlns:wpg="http://schemas.microsoft.com/office/word/2010/wordprocessingGroup" xmlns:wpi="http://schemas.microsoft.com/office/word/2010/wordprocessingInk" xmlns:wne="http://schemas.microsoft.com/office/word/2006/wordml" xmlns:wps="http://schemas.microsoft.com/office/word/2010/wordprocessingShape" mc:Ignorable="w14 w15 w16se w16cid w16 w16cex w16sdtdh w16sdtfl w16du wp14">
   <w:p>
     <w:pPr>
       <w:pStyle w:val="Header"/>
@@ -39023,7 +39841,7 @@
 </file>
 
 <file path=word/styles.xml><?xml version="1.0" encoding="utf-8"?>
-<w:styles xmlns:mc="http://schemas.openxmlformats.org/markup-compatibility/2006" xmlns:r="http://schemas.openxmlformats.org/officeDocument/2006/relationships" xmlns:w="http://schemas.openxmlformats.org/wordprocessingml/2006/main" xmlns:w14="http://schemas.microsoft.com/office/word/2010/wordml" xmlns:w15="http://schemas.microsoft.com/office/word/2012/wordml" xmlns:w16cex="http://schemas.microsoft.com/office/word/2018/wordml/cex" xmlns:w16cid="http://schemas.microsoft.com/office/word/2016/wordml/cid" xmlns:w16="http://schemas.microsoft.com/office/word/2018/wordml" xmlns:w16sdtdh="http://schemas.microsoft.com/office/word/2020/wordml/sdtdatahash" xmlns:w16se="http://schemas.microsoft.com/office/word/2015/wordml/symex" mc:Ignorable="w14 w15 w16se w16cid w16 w16cex w16sdtdh">
+<w:styles xmlns:mc="http://schemas.openxmlformats.org/markup-compatibility/2006" xmlns:r="http://schemas.openxmlformats.org/officeDocument/2006/relationships" xmlns:w="http://schemas.openxmlformats.org/wordprocessingml/2006/main" xmlns:w14="http://schemas.microsoft.com/office/word/2010/wordml" xmlns:w15="http://schemas.microsoft.com/office/word/2012/wordml" xmlns:w16cex="http://schemas.microsoft.com/office/word/2018/wordml/cex" xmlns:w16cid="http://schemas.microsoft.com/office/word/2016/wordml/cid" xmlns:w16="http://schemas.microsoft.com/office/word/2018/wordml" xmlns:w16du="http://schemas.microsoft.com/office/word/2023/wordml/word16du" xmlns:w16sdtdh="http://schemas.microsoft.com/office/word/2020/wordml/sdtdatahash" xmlns:w16sdtfl="http://schemas.microsoft.com/office/word/2024/wordml/sdtformatlock" xmlns:w16se="http://schemas.microsoft.com/office/word/2015/wordml/symex" mc:Ignorable="w14 w15 w16se w16cid w16 w16cex w16sdtdh w16sdtfl w16du">
   <w:docDefaults>
     <w:rPrDefault>
       <w:rPr>

</xml_diff>

<commit_message>
nmv 15 05 2026
</commit_message>
<xml_diff>
--- a/TS Jatai Ghanam Project/TS 1.6/TS 1.6 Ghanam Malayalam Corrections.docx
+++ b/TS Jatai Ghanam Project/TS 1.6/TS 1.6 Ghanam Malayalam Corrections.docx
@@ -616,6 +616,490 @@
               </w:rPr>
               <w:t xml:space="preserve">J | </w:t>
             </w:r>
+          </w:p>
+        </w:tc>
+      </w:tr>
+      <w:tr>
+        <w:trPr>
+          <w:trHeight w:val="1197"/>
+        </w:trPr>
+        <w:tc>
+          <w:tcPr>
+            <w:tcW w:w="7308" w:type="dxa"/>
+          </w:tcPr>
+          <w:p>
+            <w:pPr>
+              <w:widowControl w:val="0"/>
+              <w:autoSpaceDE w:val="0"/>
+              <w:autoSpaceDN w:val="0"/>
+              <w:adjustRightInd w:val="0"/>
+              <w:spacing w:before="0" w:line="240" w:lineRule="auto"/>
+              <w:rPr>
+                <w:rFonts w:ascii="BRH Malayalam Extra" w:hAnsi="BRH Malayalam Extra" w:cs="BRH Malayalam Extra"/>
+                <w:color w:val="000000"/>
+                <w:sz w:val="32"/>
+                <w:szCs w:val="40"/>
+              </w:rPr>
+            </w:pPr>
+            <w:r>
+              <w:rPr>
+                <w:rFonts w:cs="BRH Malayalam Extra"/>
+                <w:color w:val="000000"/>
+                <w:szCs w:val="40"/>
+              </w:rPr>
+              <w:t>26</w:t>
+            </w:r>
+            <w:r>
+              <w:rPr>
+                <w:rFonts w:ascii="BRH Malayalam Extra" w:hAnsi="BRH Malayalam Extra" w:cs="BRH Malayalam Extra"/>
+                <w:color w:val="000000"/>
+                <w:sz w:val="32"/>
+                <w:szCs w:val="40"/>
+              </w:rPr>
+              <w:t>)</w:t>
+            </w:r>
+            <w:r>
+              <w:rPr>
+                <w:rFonts w:ascii="BRH Malayalam Extra" w:hAnsi="BRH Malayalam Extra" w:cs="BRH Malayalam Extra"/>
+                <w:color w:val="000000"/>
+                <w:sz w:val="32"/>
+                <w:szCs w:val="40"/>
+              </w:rPr>
+              <w:tab/>
+            </w:r>
+            <w:r>
+              <w:rPr>
+                <w:rFonts w:cs="BRH Malayalam Extra"/>
+                <w:color w:val="000000"/>
+                <w:szCs w:val="40"/>
+              </w:rPr>
+              <w:t>1</w:t>
+            </w:r>
+            <w:r>
+              <w:rPr>
+                <w:rFonts w:ascii="BRH Malayalam Extra" w:hAnsi="BRH Malayalam Extra" w:cs="BRH Malayalam Extra"/>
+                <w:color w:val="000000"/>
+                <w:sz w:val="32"/>
+                <w:szCs w:val="40"/>
+              </w:rPr>
+              <w:t>.</w:t>
+            </w:r>
+            <w:r>
+              <w:rPr>
+                <w:rFonts w:cs="BRH Malayalam Extra"/>
+                <w:color w:val="000000"/>
+                <w:szCs w:val="40"/>
+              </w:rPr>
+              <w:t>6</w:t>
+            </w:r>
+            <w:r>
+              <w:rPr>
+                <w:rFonts w:ascii="BRH Malayalam Extra" w:hAnsi="BRH Malayalam Extra" w:cs="BRH Malayalam Extra"/>
+                <w:color w:val="000000"/>
+                <w:sz w:val="32"/>
+                <w:szCs w:val="40"/>
+              </w:rPr>
+              <w:t>.</w:t>
+            </w:r>
+            <w:r>
+              <w:rPr>
+                <w:rFonts w:cs="BRH Malayalam Extra"/>
+                <w:color w:val="000000"/>
+                <w:szCs w:val="40"/>
+              </w:rPr>
+              <w:t>8</w:t>
+            </w:r>
+            <w:r>
+              <w:rPr>
+                <w:rFonts w:ascii="BRH Malayalam Extra" w:hAnsi="BRH Malayalam Extra" w:cs="BRH Malayalam Extra"/>
+                <w:color w:val="000000"/>
+                <w:sz w:val="32"/>
+                <w:szCs w:val="40"/>
+              </w:rPr>
+              <w:t>.</w:t>
+            </w:r>
+            <w:r>
+              <w:rPr>
+                <w:rFonts w:cs="BRH Malayalam Extra"/>
+                <w:color w:val="000000"/>
+                <w:szCs w:val="40"/>
+              </w:rPr>
+              <w:t>4</w:t>
+            </w:r>
+            <w:r>
+              <w:rPr>
+                <w:rFonts w:ascii="BRH Malayalam Extra" w:hAnsi="BRH Malayalam Extra" w:cs="BRH Malayalam Extra"/>
+                <w:color w:val="000000"/>
+                <w:sz w:val="32"/>
+                <w:szCs w:val="40"/>
+              </w:rPr>
+              <w:t>(</w:t>
+            </w:r>
+            <w:r>
+              <w:rPr>
+                <w:rFonts w:cs="BRH Malayalam Extra"/>
+                <w:color w:val="000000"/>
+                <w:szCs w:val="40"/>
+              </w:rPr>
+              <w:t>24</w:t>
+            </w:r>
+            <w:r>
+              <w:rPr>
+                <w:rFonts w:ascii="BRH Malayalam Extra" w:hAnsi="BRH Malayalam Extra" w:cs="BRH Malayalam Extra"/>
+                <w:color w:val="000000"/>
+                <w:sz w:val="32"/>
+                <w:szCs w:val="40"/>
+              </w:rPr>
+              <w:t>)</w:t>
+            </w:r>
+            <w:proofErr w:type="gramStart"/>
+            <w:r>
+              <w:rPr>
+                <w:rFonts w:ascii="BRH Malayalam Extra" w:hAnsi="BRH Malayalam Extra" w:cs="BRH Malayalam Extra"/>
+                <w:color w:val="000000"/>
+                <w:sz w:val="32"/>
+                <w:szCs w:val="40"/>
+              </w:rPr>
+              <w:t>-  A</w:t>
+            </w:r>
+            <w:proofErr w:type="gramEnd"/>
+            <w:r>
+              <w:rPr>
+                <w:rFonts w:ascii="BRH Malayalam Extra" w:hAnsi="BRH Malayalam Extra" w:cs="BRH Malayalam Extra"/>
+                <w:color w:val="000000"/>
+                <w:sz w:val="32"/>
+                <w:szCs w:val="40"/>
+              </w:rPr>
+              <w:t>¥ax˜ |</w:t>
+            </w:r>
+          </w:p>
+          <w:p>
+            <w:pPr>
+              <w:widowControl w:val="0"/>
+              <w:autoSpaceDE w:val="0"/>
+              <w:autoSpaceDN w:val="0"/>
+              <w:adjustRightInd w:val="0"/>
+              <w:spacing w:before="0" w:line="240" w:lineRule="auto"/>
+              <w:rPr>
+                <w:rFonts w:cs="BRH Malayalam Extra"/>
+                <w:color w:val="000000"/>
+                <w:szCs w:val="40"/>
+                <w:lang w:val="it-IT"/>
+              </w:rPr>
+            </w:pPr>
+            <w:r>
+              <w:rPr>
+                <w:rFonts w:ascii="BRH Malayalam Extra" w:hAnsi="BRH Malayalam Extra" w:cs="BRH Malayalam Extra"/>
+                <w:color w:val="000000"/>
+                <w:sz w:val="32"/>
+                <w:szCs w:val="40"/>
+              </w:rPr>
+              <w:t>A¥ax</w:t>
+            </w:r>
+            <w:r>
+              <w:rPr>
+                <w:rFonts w:ascii="BRH Malayalam Extra" w:hAnsi="BRH Malayalam Extra" w:cs="BRH Malayalam Extra"/>
+                <w:color w:val="000000"/>
+                <w:sz w:val="28"/>
+                <w:szCs w:val="40"/>
+              </w:rPr>
+              <w:t>–</w:t>
+            </w:r>
+            <w:r>
+              <w:rPr>
+                <w:rFonts w:ascii="BRH Malayalam Extra" w:hAnsi="BRH Malayalam Extra" w:cs="BRH Malayalam Extra"/>
+                <w:color w:val="000000"/>
+                <w:sz w:val="32"/>
+                <w:szCs w:val="40"/>
+              </w:rPr>
+              <w:t xml:space="preserve"> C</w:t>
+            </w:r>
+            <w:r>
+              <w:rPr>
+                <w:rFonts w:ascii="BRH Malayalam Extra" w:hAnsi="BRH Malayalam Extra" w:cs="BRH Malayalam Extra"/>
+                <w:color w:val="000000"/>
+                <w:sz w:val="32"/>
+                <w:szCs w:val="40"/>
+                <w:highlight w:val="yellow"/>
+              </w:rPr>
+              <w:t>Zõ</w:t>
+            </w:r>
+            <w:r>
+              <w:rPr>
+                <w:rFonts w:ascii="BRH Malayalam Extra" w:hAnsi="BRH Malayalam Extra" w:cs="BRH Malayalam Extra"/>
+                <w:color w:val="000000"/>
+                <w:sz w:val="28"/>
+                <w:szCs w:val="40"/>
+                <w:highlight w:val="yellow"/>
+              </w:rPr>
+              <w:t>–</w:t>
+            </w:r>
+            <w:r>
+              <w:rPr>
+                <w:rFonts w:ascii="BRH Malayalam Extra" w:hAnsi="BRH Malayalam Extra" w:cs="BRH Malayalam Extra"/>
+                <w:color w:val="000000"/>
+                <w:sz w:val="32"/>
+                <w:szCs w:val="40"/>
+              </w:rPr>
+              <w:t xml:space="preserve">¥ax˜ | </w:t>
+            </w:r>
+          </w:p>
+        </w:tc>
+        <w:tc>
+          <w:tcPr>
+            <w:tcW w:w="7371" w:type="dxa"/>
+          </w:tcPr>
+          <w:p>
+            <w:pPr>
+              <w:widowControl w:val="0"/>
+              <w:autoSpaceDE w:val="0"/>
+              <w:autoSpaceDN w:val="0"/>
+              <w:adjustRightInd w:val="0"/>
+              <w:spacing w:before="0" w:line="240" w:lineRule="auto"/>
+              <w:rPr>
+                <w:rFonts w:ascii="BRH Malayalam Extra" w:hAnsi="BRH Malayalam Extra" w:cs="BRH Malayalam Extra"/>
+                <w:color w:val="000000"/>
+                <w:sz w:val="32"/>
+                <w:szCs w:val="40"/>
+              </w:rPr>
+            </w:pPr>
+            <w:r>
+              <w:rPr>
+                <w:rFonts w:cs="BRH Malayalam Extra"/>
+                <w:color w:val="000000"/>
+                <w:szCs w:val="40"/>
+              </w:rPr>
+              <w:t>26</w:t>
+            </w:r>
+            <w:r>
+              <w:rPr>
+                <w:rFonts w:ascii="BRH Malayalam Extra" w:hAnsi="BRH Malayalam Extra" w:cs="BRH Malayalam Extra"/>
+                <w:color w:val="000000"/>
+                <w:sz w:val="32"/>
+                <w:szCs w:val="40"/>
+              </w:rPr>
+              <w:t>)</w:t>
+            </w:r>
+            <w:r>
+              <w:rPr>
+                <w:rFonts w:ascii="BRH Malayalam Extra" w:hAnsi="BRH Malayalam Extra" w:cs="BRH Malayalam Extra"/>
+                <w:color w:val="000000"/>
+                <w:sz w:val="32"/>
+                <w:szCs w:val="40"/>
+              </w:rPr>
+              <w:tab/>
+            </w:r>
+            <w:r>
+              <w:rPr>
+                <w:rFonts w:cs="BRH Malayalam Extra"/>
+                <w:color w:val="000000"/>
+                <w:szCs w:val="40"/>
+              </w:rPr>
+              <w:t>1</w:t>
+            </w:r>
+            <w:r>
+              <w:rPr>
+                <w:rFonts w:ascii="BRH Malayalam Extra" w:hAnsi="BRH Malayalam Extra" w:cs="BRH Malayalam Extra"/>
+                <w:color w:val="000000"/>
+                <w:sz w:val="32"/>
+                <w:szCs w:val="40"/>
+              </w:rPr>
+              <w:t>.</w:t>
+            </w:r>
+            <w:r>
+              <w:rPr>
+                <w:rFonts w:cs="BRH Malayalam Extra"/>
+                <w:color w:val="000000"/>
+                <w:szCs w:val="40"/>
+              </w:rPr>
+              <w:t>6</w:t>
+            </w:r>
+            <w:r>
+              <w:rPr>
+                <w:rFonts w:ascii="BRH Malayalam Extra" w:hAnsi="BRH Malayalam Extra" w:cs="BRH Malayalam Extra"/>
+                <w:color w:val="000000"/>
+                <w:sz w:val="32"/>
+                <w:szCs w:val="40"/>
+              </w:rPr>
+              <w:t>.</w:t>
+            </w:r>
+            <w:r>
+              <w:rPr>
+                <w:rFonts w:cs="BRH Malayalam Extra"/>
+                <w:color w:val="000000"/>
+                <w:szCs w:val="40"/>
+              </w:rPr>
+              <w:t>8</w:t>
+            </w:r>
+            <w:r>
+              <w:rPr>
+                <w:rFonts w:ascii="BRH Malayalam Extra" w:hAnsi="BRH Malayalam Extra" w:cs="BRH Malayalam Extra"/>
+                <w:color w:val="000000"/>
+                <w:sz w:val="32"/>
+                <w:szCs w:val="40"/>
+              </w:rPr>
+              <w:t>.</w:t>
+            </w:r>
+            <w:r>
+              <w:rPr>
+                <w:rFonts w:cs="BRH Malayalam Extra"/>
+                <w:color w:val="000000"/>
+                <w:szCs w:val="40"/>
+              </w:rPr>
+              <w:t>4</w:t>
+            </w:r>
+            <w:r>
+              <w:rPr>
+                <w:rFonts w:ascii="BRH Malayalam Extra" w:hAnsi="BRH Malayalam Extra" w:cs="BRH Malayalam Extra"/>
+                <w:color w:val="000000"/>
+                <w:sz w:val="32"/>
+                <w:szCs w:val="40"/>
+              </w:rPr>
+              <w:t>(</w:t>
+            </w:r>
+            <w:r>
+              <w:rPr>
+                <w:rFonts w:cs="BRH Malayalam Extra"/>
+                <w:color w:val="000000"/>
+                <w:szCs w:val="40"/>
+              </w:rPr>
+              <w:t>24</w:t>
+            </w:r>
+            <w:r>
+              <w:rPr>
+                <w:rFonts w:ascii="BRH Malayalam Extra" w:hAnsi="BRH Malayalam Extra" w:cs="BRH Malayalam Extra"/>
+                <w:color w:val="000000"/>
+                <w:sz w:val="32"/>
+                <w:szCs w:val="40"/>
+              </w:rPr>
+              <w:t>)</w:t>
+            </w:r>
+            <w:proofErr w:type="gramStart"/>
+            <w:r>
+              <w:rPr>
+                <w:rFonts w:ascii="BRH Malayalam Extra" w:hAnsi="BRH Malayalam Extra" w:cs="BRH Malayalam Extra"/>
+                <w:color w:val="000000"/>
+                <w:sz w:val="32"/>
+                <w:szCs w:val="40"/>
+              </w:rPr>
+              <w:t>-  A</w:t>
+            </w:r>
+            <w:proofErr w:type="gramEnd"/>
+            <w:r>
+              <w:rPr>
+                <w:rFonts w:ascii="BRH Malayalam Extra" w:hAnsi="BRH Malayalam Extra" w:cs="BRH Malayalam Extra"/>
+                <w:color w:val="000000"/>
+                <w:sz w:val="32"/>
+                <w:szCs w:val="40"/>
+              </w:rPr>
+              <w:t>¥ax˜ |</w:t>
+            </w:r>
+          </w:p>
+          <w:p>
+            <w:pPr>
+              <w:widowControl w:val="0"/>
+              <w:autoSpaceDE w:val="0"/>
+              <w:autoSpaceDN w:val="0"/>
+              <w:adjustRightInd w:val="0"/>
+              <w:spacing w:before="0" w:line="240" w:lineRule="auto"/>
+              <w:rPr>
+                <w:rFonts w:cs="BRH Malayalam Extra"/>
+                <w:color w:val="000000"/>
+                <w:szCs w:val="40"/>
+                <w:lang w:val="it-IT"/>
+              </w:rPr>
+            </w:pPr>
+            <w:r>
+              <w:rPr>
+                <w:rFonts w:ascii="BRH Malayalam Extra" w:hAnsi="BRH Malayalam Extra" w:cs="BRH Malayalam Extra"/>
+                <w:color w:val="000000"/>
+                <w:sz w:val="32"/>
+                <w:szCs w:val="40"/>
+              </w:rPr>
+              <w:t>A¥ax</w:t>
+            </w:r>
+            <w:r>
+              <w:rPr>
+                <w:rFonts w:ascii="BRH Malayalam Extra" w:hAnsi="BRH Malayalam Extra" w:cs="BRH Malayalam Extra"/>
+                <w:color w:val="000000"/>
+                <w:sz w:val="28"/>
+                <w:szCs w:val="40"/>
+              </w:rPr>
+              <w:t>–</w:t>
+            </w:r>
+            <w:r>
+              <w:rPr>
+                <w:rFonts w:ascii="BRH Malayalam Extra" w:hAnsi="BRH Malayalam Extra" w:cs="BRH Malayalam Extra"/>
+                <w:color w:val="000000"/>
+                <w:sz w:val="32"/>
+                <w:szCs w:val="40"/>
+              </w:rPr>
+              <w:t xml:space="preserve"> C</w:t>
+            </w:r>
+            <w:r>
+              <w:rPr>
+                <w:rFonts w:ascii="BRH Malayalam Extra" w:hAnsi="BRH Malayalam Extra" w:cs="BRH Malayalam Extra"/>
+                <w:color w:val="000000"/>
+                <w:sz w:val="32"/>
+                <w:szCs w:val="40"/>
+                <w:highlight w:val="green"/>
+              </w:rPr>
+              <w:t>Zõ</w:t>
+            </w:r>
+            <w:r>
+              <w:rPr>
+                <w:rFonts w:ascii="BRH Malayalam Extra" w:hAnsi="BRH Malayalam Extra" w:cs="BRH Malayalam Extra"/>
+                <w:color w:val="000000"/>
+                <w:sz w:val="32"/>
+                <w:szCs w:val="40"/>
+              </w:rPr>
+              <w:t xml:space="preserve">¥ax˜ | </w:t>
+            </w:r>
+          </w:p>
+        </w:tc>
+      </w:tr>
+      <w:tr>
+        <w:trPr>
+          <w:trHeight w:val="1197"/>
+        </w:trPr>
+        <w:tc>
+          <w:tcPr>
+            <w:tcW w:w="7308" w:type="dxa"/>
+          </w:tcPr>
+          <w:p>
+            <w:pPr>
+              <w:widowControl w:val="0"/>
+              <w:autoSpaceDE w:val="0"/>
+              <w:autoSpaceDN w:val="0"/>
+              <w:adjustRightInd w:val="0"/>
+              <w:spacing w:before="0" w:line="240" w:lineRule="auto"/>
+              <w:rPr>
+                <w:rFonts w:cs="BRH Malayalam Extra"/>
+                <w:color w:val="000000"/>
+                <w:szCs w:val="40"/>
+                <w:lang w:val="it-IT"/>
+              </w:rPr>
+            </w:pPr>
+          </w:p>
+        </w:tc>
+        <w:tc>
+          <w:tcPr>
+            <w:tcW w:w="7371" w:type="dxa"/>
+          </w:tcPr>
+          <w:p>
+            <w:pPr>
+              <w:widowControl w:val="0"/>
+              <w:autoSpaceDE w:val="0"/>
+              <w:autoSpaceDN w:val="0"/>
+              <w:adjustRightInd w:val="0"/>
+              <w:spacing w:before="0" w:line="240" w:lineRule="auto"/>
+              <w:rPr>
+                <w:rFonts w:cs="BRH Malayalam Extra"/>
+                <w:color w:val="000000"/>
+                <w:szCs w:val="40"/>
+                <w:lang w:val="it-IT"/>
+              </w:rPr>
+            </w:pPr>
           </w:p>
         </w:tc>
       </w:tr>

</xml_diff>

<commit_message>
nmv 06 05 2026
</commit_message>
<xml_diff>
--- a/TS Jatai Ghanam Project/TS 1.6/TS 1.6 Ghanam Malayalam Corrections.docx
+++ b/TS Jatai Ghanam Project/TS 1.6/TS 1.6 Ghanam Malayalam Corrections.docx
@@ -1041,6 +1041,1192 @@
                 <w:szCs w:val="40"/>
               </w:rPr>
               <w:t xml:space="preserve">¥ax˜ | </w:t>
+            </w:r>
+          </w:p>
+        </w:tc>
+      </w:tr>
+      <w:tr>
+        <w:trPr>
+          <w:trHeight w:val="1197"/>
+        </w:trPr>
+        <w:tc>
+          <w:tcPr>
+            <w:tcW w:w="7308" w:type="dxa"/>
+          </w:tcPr>
+          <w:p>
+            <w:pPr>
+              <w:widowControl w:val="0"/>
+              <w:autoSpaceDE w:val="0"/>
+              <w:autoSpaceDN w:val="0"/>
+              <w:adjustRightInd w:val="0"/>
+              <w:spacing w:before="0" w:line="240" w:lineRule="auto"/>
+              <w:rPr>
+                <w:rFonts w:ascii="BRH Malayalam Extra" w:hAnsi="BRH Malayalam Extra" w:cs="BRH Malayalam Extra"/>
+                <w:color w:val="000000"/>
+                <w:sz w:val="32"/>
+                <w:szCs w:val="40"/>
+                <w:lang w:val="it-IT"/>
+              </w:rPr>
+            </w:pPr>
+            <w:r>
+              <w:rPr>
+                <w:rFonts w:cs="BRH Malayalam Extra"/>
+                <w:color w:val="000000"/>
+                <w:szCs w:val="40"/>
+                <w:lang w:val="it-IT"/>
+              </w:rPr>
+              <w:t>1</w:t>
+            </w:r>
+            <w:r>
+              <w:rPr>
+                <w:rFonts w:ascii="BRH Malayalam Extra" w:hAnsi="BRH Malayalam Extra" w:cs="BRH Malayalam Extra"/>
+                <w:color w:val="000000"/>
+                <w:sz w:val="32"/>
+                <w:szCs w:val="40"/>
+                <w:lang w:val="it-IT"/>
+              </w:rPr>
+              <w:t>)</w:t>
+            </w:r>
+            <w:r>
+              <w:rPr>
+                <w:rFonts w:ascii="BRH Malayalam Extra" w:hAnsi="BRH Malayalam Extra" w:cs="BRH Malayalam Extra"/>
+                <w:color w:val="000000"/>
+                <w:sz w:val="32"/>
+                <w:szCs w:val="40"/>
+                <w:lang w:val="it-IT"/>
+              </w:rPr>
+              <w:tab/>
+            </w:r>
+            <w:r>
+              <w:rPr>
+                <w:rFonts w:cs="BRH Malayalam Extra"/>
+                <w:color w:val="000000"/>
+                <w:szCs w:val="40"/>
+                <w:lang w:val="it-IT"/>
+              </w:rPr>
+              <w:t>1</w:t>
+            </w:r>
+            <w:r>
+              <w:rPr>
+                <w:rFonts w:ascii="BRH Malayalam Extra" w:hAnsi="BRH Malayalam Extra" w:cs="BRH Malayalam Extra"/>
+                <w:color w:val="000000"/>
+                <w:sz w:val="32"/>
+                <w:szCs w:val="40"/>
+                <w:lang w:val="it-IT"/>
+              </w:rPr>
+              <w:t>.</w:t>
+            </w:r>
+            <w:r>
+              <w:rPr>
+                <w:rFonts w:cs="BRH Malayalam Extra"/>
+                <w:color w:val="000000"/>
+                <w:szCs w:val="40"/>
+                <w:lang w:val="it-IT"/>
+              </w:rPr>
+              <w:t>6</w:t>
+            </w:r>
+            <w:r>
+              <w:rPr>
+                <w:rFonts w:ascii="BRH Malayalam Extra" w:hAnsi="BRH Malayalam Extra" w:cs="BRH Malayalam Extra"/>
+                <w:color w:val="000000"/>
+                <w:sz w:val="32"/>
+                <w:szCs w:val="40"/>
+                <w:lang w:val="it-IT"/>
+              </w:rPr>
+              <w:t>.</w:t>
+            </w:r>
+            <w:r>
+              <w:rPr>
+                <w:rFonts w:cs="BRH Malayalam Extra"/>
+                <w:color w:val="000000"/>
+                <w:szCs w:val="40"/>
+                <w:lang w:val="it-IT"/>
+              </w:rPr>
+              <w:t>11</w:t>
+            </w:r>
+            <w:r>
+              <w:rPr>
+                <w:rFonts w:ascii="BRH Malayalam Extra" w:hAnsi="BRH Malayalam Extra" w:cs="BRH Malayalam Extra"/>
+                <w:color w:val="000000"/>
+                <w:sz w:val="32"/>
+                <w:szCs w:val="40"/>
+                <w:lang w:val="it-IT"/>
+              </w:rPr>
+              <w:t>.</w:t>
+            </w:r>
+            <w:r>
+              <w:rPr>
+                <w:rFonts w:cs="BRH Malayalam Extra"/>
+                <w:color w:val="000000"/>
+                <w:szCs w:val="40"/>
+                <w:lang w:val="it-IT"/>
+              </w:rPr>
+              <w:t>4</w:t>
+            </w:r>
+            <w:r>
+              <w:rPr>
+                <w:rFonts w:ascii="BRH Malayalam Extra" w:hAnsi="BRH Malayalam Extra" w:cs="BRH Malayalam Extra"/>
+                <w:color w:val="000000"/>
+                <w:sz w:val="32"/>
+                <w:szCs w:val="40"/>
+                <w:lang w:val="it-IT"/>
+              </w:rPr>
+              <w:t>(</w:t>
+            </w:r>
+            <w:r>
+              <w:rPr>
+                <w:rFonts w:cs="BRH Malayalam Extra"/>
+                <w:color w:val="000000"/>
+                <w:szCs w:val="40"/>
+                <w:lang w:val="it-IT"/>
+              </w:rPr>
+              <w:t>1</w:t>
+            </w:r>
+            <w:r>
+              <w:rPr>
+                <w:rFonts w:ascii="BRH Malayalam Extra" w:hAnsi="BRH Malayalam Extra" w:cs="BRH Malayalam Extra"/>
+                <w:color w:val="000000"/>
+                <w:sz w:val="32"/>
+                <w:szCs w:val="40"/>
+                <w:lang w:val="it-IT"/>
+              </w:rPr>
+              <w:t>)-  A</w:t>
+            </w:r>
+            <w:r>
+              <w:rPr>
+                <w:rFonts w:ascii="BRH Malayalam Extra" w:hAnsi="BRH Malayalam Extra" w:cs="BRH Malayalam Extra"/>
+                <w:color w:val="000000"/>
+                <w:sz w:val="25"/>
+                <w:szCs w:val="40"/>
+                <w:lang w:val="it-IT"/>
+              </w:rPr>
+              <w:t>–</w:t>
+            </w:r>
+            <w:r>
+              <w:rPr>
+                <w:rFonts w:ascii="BRH Malayalam Extra" w:hAnsi="BRH Malayalam Extra" w:cs="BRH Malayalam Extra"/>
+                <w:color w:val="000000"/>
+                <w:sz w:val="32"/>
+                <w:szCs w:val="40"/>
+                <w:lang w:val="it-IT"/>
+              </w:rPr>
+              <w:t>R</w:t>
+            </w:r>
+            <w:r>
+              <w:rPr>
+                <w:rFonts w:ascii="BRH Malayalam Extra" w:hAnsi="BRH Malayalam Extra" w:cs="BRH Malayalam Extra"/>
+                <w:color w:val="000000"/>
+                <w:sz w:val="25"/>
+                <w:szCs w:val="40"/>
+                <w:lang w:val="it-IT"/>
+              </w:rPr>
+              <w:t>–</w:t>
+            </w:r>
+            <w:r>
+              <w:rPr>
+                <w:rFonts w:ascii="BRH Malayalam Extra" w:hAnsi="BRH Malayalam Extra" w:cs="BRH Malayalam Extra"/>
+                <w:color w:val="000000"/>
+                <w:sz w:val="32"/>
+                <w:szCs w:val="40"/>
+                <w:highlight w:val="yellow"/>
+                <w:lang w:val="it-IT"/>
+              </w:rPr>
+              <w:t>d</w:t>
+            </w:r>
+            <w:r>
+              <w:rPr>
+                <w:rFonts w:ascii="BRH Malayalam Extra" w:hAnsi="BRH Malayalam Extra" w:cs="BRH Malayalam Extra"/>
+                <w:color w:val="000000"/>
+                <w:sz w:val="32"/>
+                <w:szCs w:val="40"/>
+                <w:lang w:val="it-IT"/>
+              </w:rPr>
+              <w:t>j</w:t>
+            </w:r>
+            <w:r>
+              <w:rPr>
+                <w:rFonts w:ascii="BRH Malayalam Extra" w:hAnsi="BRH Malayalam Extra" w:cs="BRH Malayalam Extra"/>
+                <w:color w:val="000000"/>
+                <w:sz w:val="25"/>
+                <w:szCs w:val="40"/>
+                <w:lang w:val="it-IT"/>
+              </w:rPr>
+              <w:t>–</w:t>
+            </w:r>
+            <w:r>
+              <w:rPr>
+                <w:rFonts w:ascii="BRH Malayalam Extra" w:hAnsi="BRH Malayalam Extra" w:cs="BRH Malayalam Extra"/>
+                <w:color w:val="000000"/>
+                <w:sz w:val="32"/>
+                <w:szCs w:val="40"/>
+                <w:lang w:val="it-IT"/>
+              </w:rPr>
+              <w:t>Ë§ | ¥j | jRx—i¥t |</w:t>
+            </w:r>
+          </w:p>
+          <w:p>
+            <w:pPr>
+              <w:widowControl w:val="0"/>
+              <w:autoSpaceDE w:val="0"/>
+              <w:autoSpaceDN w:val="0"/>
+              <w:adjustRightInd w:val="0"/>
+              <w:spacing w:before="0" w:line="240" w:lineRule="auto"/>
+              <w:rPr>
+                <w:rFonts w:ascii="BRH Malayalam Extra" w:hAnsi="BRH Malayalam Extra" w:cs="BRH Malayalam Extra"/>
+                <w:color w:val="000000"/>
+                <w:sz w:val="32"/>
+                <w:szCs w:val="40"/>
+                <w:lang w:val="it-IT"/>
+              </w:rPr>
+            </w:pPr>
+            <w:r>
+              <w:rPr>
+                <w:rFonts w:ascii="BRH Malayalam Extra" w:hAnsi="BRH Malayalam Extra" w:cs="BRH Malayalam Extra"/>
+                <w:color w:val="000000"/>
+                <w:sz w:val="32"/>
+                <w:szCs w:val="40"/>
+                <w:lang w:val="it-IT"/>
+              </w:rPr>
+              <w:t>A</w:t>
+            </w:r>
+            <w:r>
+              <w:rPr>
+                <w:rFonts w:ascii="BRH Malayalam Extra" w:hAnsi="BRH Malayalam Extra" w:cs="BRH Malayalam Extra"/>
+                <w:color w:val="000000"/>
+                <w:sz w:val="25"/>
+                <w:szCs w:val="40"/>
+                <w:lang w:val="it-IT"/>
+              </w:rPr>
+              <w:t>–</w:t>
+            </w:r>
+            <w:r>
+              <w:rPr>
+                <w:rFonts w:ascii="BRH Malayalam Extra" w:hAnsi="BRH Malayalam Extra" w:cs="BRH Malayalam Extra"/>
+                <w:color w:val="000000"/>
+                <w:sz w:val="32"/>
+                <w:szCs w:val="40"/>
+                <w:lang w:val="it-IT"/>
+              </w:rPr>
+              <w:t>R</w:t>
+            </w:r>
+            <w:r>
+              <w:rPr>
+                <w:rFonts w:ascii="BRH Malayalam Extra" w:hAnsi="BRH Malayalam Extra" w:cs="BRH Malayalam Extra"/>
+                <w:color w:val="000000"/>
+                <w:sz w:val="25"/>
+                <w:szCs w:val="40"/>
+                <w:lang w:val="it-IT"/>
+              </w:rPr>
+              <w:t>–</w:t>
+            </w:r>
+            <w:r>
+              <w:rPr>
+                <w:rFonts w:ascii="BRH Malayalam Extra" w:hAnsi="BRH Malayalam Extra" w:cs="BRH Malayalam Extra"/>
+                <w:color w:val="000000"/>
+                <w:sz w:val="32"/>
+                <w:szCs w:val="40"/>
+                <w:highlight w:val="yellow"/>
+                <w:lang w:val="it-IT"/>
+              </w:rPr>
+              <w:t>d</w:t>
+            </w:r>
+            <w:r>
+              <w:rPr>
+                <w:rFonts w:ascii="BRH Malayalam Extra" w:hAnsi="BRH Malayalam Extra" w:cs="BRH Malayalam Extra"/>
+                <w:color w:val="000000"/>
+                <w:sz w:val="32"/>
+                <w:szCs w:val="40"/>
+                <w:lang w:val="it-IT"/>
+              </w:rPr>
+              <w:t>j</w:t>
+            </w:r>
+            <w:r>
+              <w:rPr>
+                <w:rFonts w:ascii="BRH Malayalam Extra" w:hAnsi="BRH Malayalam Extra" w:cs="BRH Malayalam Extra"/>
+                <w:color w:val="000000"/>
+                <w:sz w:val="25"/>
+                <w:szCs w:val="40"/>
+                <w:lang w:val="it-IT"/>
+              </w:rPr>
+              <w:t>–</w:t>
+            </w:r>
+            <w:r>
+              <w:rPr>
+                <w:rFonts w:ascii="BRH Malayalam Extra" w:hAnsi="BRH Malayalam Extra" w:cs="BRH Malayalam Extra"/>
+                <w:color w:val="000000"/>
+                <w:sz w:val="32"/>
+                <w:szCs w:val="40"/>
+                <w:lang w:val="it-IT"/>
+              </w:rPr>
+              <w:t>©</w:t>
+            </w:r>
+            <w:r>
+              <w:rPr>
+                <w:rFonts w:ascii="BRH Malayalam Extra" w:hAnsi="BRH Malayalam Extra" w:cs="BRH Malayalam Extra"/>
+                <w:color w:val="000000"/>
+                <w:sz w:val="25"/>
+                <w:szCs w:val="40"/>
+                <w:lang w:val="it-IT"/>
+              </w:rPr>
+              <w:t>–</w:t>
+            </w:r>
+            <w:r>
+              <w:rPr>
+                <w:rFonts w:ascii="BRH Malayalam Extra" w:hAnsi="BRH Malayalam Extra" w:cs="BRH Malayalam Extra"/>
+                <w:color w:val="000000"/>
+                <w:sz w:val="32"/>
+                <w:szCs w:val="40"/>
+                <w:lang w:val="it-IT"/>
+              </w:rPr>
+              <w:t>. ¥j ¥j— „</w:t>
+            </w:r>
+            <w:r>
+              <w:rPr>
+                <w:rFonts w:ascii="BRH Malayalam Extra" w:hAnsi="BRH Malayalam Extra" w:cs="BRH Malayalam Extra"/>
+                <w:color w:val="000000"/>
+                <w:sz w:val="32"/>
+                <w:szCs w:val="40"/>
+                <w:highlight w:val="yellow"/>
+                <w:lang w:val="it-IT"/>
+              </w:rPr>
+              <w:t>R</w:t>
+            </w:r>
+            <w:r>
+              <w:rPr>
+                <w:rFonts w:ascii="BRH Malayalam Extra" w:hAnsi="BRH Malayalam Extra" w:cs="BRH Malayalam Extra"/>
+                <w:color w:val="000000"/>
+                <w:sz w:val="25"/>
+                <w:szCs w:val="40"/>
+                <w:highlight w:val="yellow"/>
+                <w:lang w:val="it-IT"/>
+              </w:rPr>
+              <w:t>–</w:t>
+            </w:r>
+            <w:r>
+              <w:rPr>
+                <w:rFonts w:ascii="BRH Malayalam Extra" w:hAnsi="BRH Malayalam Extra" w:cs="BRH Malayalam Extra"/>
+                <w:color w:val="000000"/>
+                <w:sz w:val="32"/>
+                <w:szCs w:val="40"/>
+                <w:highlight w:val="yellow"/>
+                <w:lang w:val="it-IT"/>
+              </w:rPr>
+              <w:t>dj</w:t>
+            </w:r>
+            <w:r>
+              <w:rPr>
+                <w:rFonts w:ascii="BRH Malayalam Extra" w:hAnsi="BRH Malayalam Extra" w:cs="BRH Malayalam Extra"/>
+                <w:color w:val="000000"/>
+                <w:sz w:val="25"/>
+                <w:szCs w:val="40"/>
+                <w:lang w:val="it-IT"/>
+              </w:rPr>
+              <w:t>–</w:t>
+            </w:r>
+            <w:r>
+              <w:rPr>
+                <w:rFonts w:ascii="BRH Malayalam Extra" w:hAnsi="BRH Malayalam Extra" w:cs="BRH Malayalam Extra"/>
+                <w:color w:val="000000"/>
+                <w:sz w:val="32"/>
+                <w:szCs w:val="40"/>
+                <w:lang w:val="it-IT"/>
+              </w:rPr>
+              <w:t xml:space="preserve">© </w:t>
+            </w:r>
+            <w:r>
+              <w:rPr>
+                <w:rFonts w:ascii="BRH Malayalam Extra" w:hAnsi="BRH Malayalam Extra" w:cs="BRH Malayalam Extra"/>
+                <w:color w:val="000000"/>
+                <w:sz w:val="32"/>
+                <w:szCs w:val="40"/>
+                <w:highlight w:val="yellow"/>
+                <w:lang w:val="it-IT"/>
+              </w:rPr>
+              <w:t>dR</w:t>
+            </w:r>
+            <w:r>
+              <w:rPr>
+                <w:rFonts w:ascii="BRH Malayalam Extra" w:hAnsi="BRH Malayalam Extra" w:cs="BRH Malayalam Extra"/>
+                <w:color w:val="000000"/>
+                <w:sz w:val="25"/>
+                <w:szCs w:val="40"/>
+                <w:highlight w:val="yellow"/>
+                <w:lang w:val="it-IT"/>
+              </w:rPr>
+              <w:t>–</w:t>
+            </w:r>
+            <w:r>
+              <w:rPr>
+                <w:rFonts w:ascii="BRH Malayalam Extra" w:hAnsi="BRH Malayalam Extra" w:cs="BRH Malayalam Extra"/>
+                <w:color w:val="000000"/>
+                <w:sz w:val="32"/>
+                <w:szCs w:val="40"/>
+                <w:highlight w:val="yellow"/>
+                <w:lang w:val="it-IT"/>
+              </w:rPr>
+              <w:t>d</w:t>
+            </w:r>
+            <w:r>
+              <w:rPr>
+                <w:rFonts w:ascii="BRH Malayalam Extra" w:hAnsi="BRH Malayalam Extra" w:cs="BRH Malayalam Extra"/>
+                <w:color w:val="000000"/>
+                <w:sz w:val="32"/>
+                <w:szCs w:val="40"/>
+                <w:lang w:val="it-IT"/>
+              </w:rPr>
+              <w:t>j</w:t>
+            </w:r>
+            <w:r>
+              <w:rPr>
+                <w:rFonts w:ascii="BRH Malayalam Extra" w:hAnsi="BRH Malayalam Extra" w:cs="BRH Malayalam Extra"/>
+                <w:color w:val="000000"/>
+                <w:sz w:val="25"/>
+                <w:szCs w:val="40"/>
+                <w:lang w:val="it-IT"/>
+              </w:rPr>
+              <w:t>–</w:t>
+            </w:r>
+            <w:r>
+              <w:rPr>
+                <w:rFonts w:ascii="BRH Malayalam Extra" w:hAnsi="BRH Malayalam Extra" w:cs="BRH Malayalam Extra"/>
+                <w:color w:val="000000"/>
+                <w:sz w:val="32"/>
+                <w:szCs w:val="40"/>
+                <w:lang w:val="it-IT"/>
+              </w:rPr>
+              <w:t>©</w:t>
+            </w:r>
+            <w:r>
+              <w:rPr>
+                <w:rFonts w:ascii="BRH Malayalam Extra" w:hAnsi="BRH Malayalam Extra" w:cs="BRH Malayalam Extra"/>
+                <w:color w:val="000000"/>
+                <w:sz w:val="25"/>
+                <w:szCs w:val="40"/>
+                <w:lang w:val="it-IT"/>
+              </w:rPr>
+              <w:t>–</w:t>
+            </w:r>
+            <w:r>
+              <w:rPr>
+                <w:rFonts w:ascii="BRH Malayalam Extra" w:hAnsi="BRH Malayalam Extra" w:cs="BRH Malayalam Extra"/>
+                <w:color w:val="000000"/>
+                <w:sz w:val="32"/>
+                <w:szCs w:val="40"/>
+                <w:lang w:val="it-IT"/>
+              </w:rPr>
+              <w:t xml:space="preserve">. ¥j </w:t>
+            </w:r>
+          </w:p>
+          <w:p>
+            <w:pPr>
+              <w:widowControl w:val="0"/>
+              <w:autoSpaceDE w:val="0"/>
+              <w:autoSpaceDN w:val="0"/>
+              <w:adjustRightInd w:val="0"/>
+              <w:spacing w:before="0" w:line="240" w:lineRule="auto"/>
+              <w:rPr>
+                <w:rFonts w:cs="BRH Malayalam Extra"/>
+                <w:color w:val="000000"/>
+                <w:szCs w:val="40"/>
+                <w:lang w:val="it-IT"/>
+              </w:rPr>
+            </w:pPr>
+            <w:r>
+              <w:rPr>
+                <w:rFonts w:ascii="BRH Malayalam Extra" w:hAnsi="BRH Malayalam Extra" w:cs="BRH Malayalam Extra"/>
+                <w:color w:val="000000"/>
+                <w:sz w:val="32"/>
+                <w:szCs w:val="40"/>
+                <w:lang w:val="it-IT"/>
+              </w:rPr>
+              <w:t>jRx—i¥t</w:t>
+            </w:r>
+            <w:r>
+              <w:rPr>
+                <w:rFonts w:ascii="BRH Malayalam Extra" w:hAnsi="BRH Malayalam Extra" w:cs="BRH Malayalam Extra"/>
+                <w:color w:val="000000"/>
+                <w:sz w:val="25"/>
+                <w:szCs w:val="40"/>
+                <w:lang w:val="it-IT"/>
+              </w:rPr>
+              <w:t>–</w:t>
+            </w:r>
+            <w:r>
+              <w:rPr>
+                <w:rFonts w:ascii="BRH Malayalam Extra" w:hAnsi="BRH Malayalam Extra" w:cs="BRH Malayalam Extra"/>
+                <w:color w:val="000000"/>
+                <w:sz w:val="32"/>
+                <w:szCs w:val="40"/>
+                <w:lang w:val="it-IT"/>
+              </w:rPr>
+              <w:t xml:space="preserve"> jRx—i¥t ¥j— „R</w:t>
+            </w:r>
+            <w:r>
+              <w:rPr>
+                <w:rFonts w:ascii="BRH Malayalam Extra" w:hAnsi="BRH Malayalam Extra" w:cs="BRH Malayalam Extra"/>
+                <w:color w:val="000000"/>
+                <w:sz w:val="25"/>
+                <w:szCs w:val="40"/>
+                <w:lang w:val="it-IT"/>
+              </w:rPr>
+              <w:t>–</w:t>
+            </w:r>
+            <w:r>
+              <w:rPr>
+                <w:rFonts w:ascii="BRH Malayalam Extra" w:hAnsi="BRH Malayalam Extra" w:cs="BRH Malayalam Extra"/>
+                <w:color w:val="000000"/>
+                <w:sz w:val="32"/>
+                <w:szCs w:val="40"/>
+                <w:highlight w:val="yellow"/>
+                <w:lang w:val="it-IT"/>
+              </w:rPr>
+              <w:t>dj</w:t>
+            </w:r>
+            <w:r>
+              <w:rPr>
+                <w:rFonts w:ascii="BRH Malayalam Extra" w:hAnsi="BRH Malayalam Extra" w:cs="BRH Malayalam Extra"/>
+                <w:color w:val="000000"/>
+                <w:sz w:val="25"/>
+                <w:szCs w:val="40"/>
+                <w:highlight w:val="yellow"/>
+                <w:lang w:val="it-IT"/>
+              </w:rPr>
+              <w:t>–</w:t>
+            </w:r>
+            <w:r>
+              <w:rPr>
+                <w:rFonts w:ascii="BRH Malayalam Extra" w:hAnsi="BRH Malayalam Extra" w:cs="BRH Malayalam Extra"/>
+                <w:color w:val="000000"/>
+                <w:sz w:val="32"/>
+                <w:szCs w:val="40"/>
+                <w:highlight w:val="yellow"/>
+                <w:lang w:val="it-IT"/>
+              </w:rPr>
+              <w:t>© dR</w:t>
+            </w:r>
+            <w:r>
+              <w:rPr>
+                <w:rFonts w:ascii="BRH Malayalam Extra" w:hAnsi="BRH Malayalam Extra" w:cs="BRH Malayalam Extra"/>
+                <w:color w:val="000000"/>
+                <w:sz w:val="25"/>
+                <w:szCs w:val="40"/>
+                <w:highlight w:val="yellow"/>
+                <w:lang w:val="it-IT"/>
+              </w:rPr>
+              <w:t>–</w:t>
+            </w:r>
+            <w:r>
+              <w:rPr>
+                <w:rFonts w:ascii="BRH Malayalam Extra" w:hAnsi="BRH Malayalam Extra" w:cs="BRH Malayalam Extra"/>
+                <w:color w:val="000000"/>
+                <w:sz w:val="32"/>
+                <w:szCs w:val="40"/>
+                <w:highlight w:val="yellow"/>
+                <w:lang w:val="it-IT"/>
+              </w:rPr>
+              <w:t>d</w:t>
+            </w:r>
+            <w:r>
+              <w:rPr>
+                <w:rFonts w:ascii="BRH Malayalam Extra" w:hAnsi="BRH Malayalam Extra" w:cs="BRH Malayalam Extra"/>
+                <w:color w:val="000000"/>
+                <w:sz w:val="32"/>
+                <w:szCs w:val="40"/>
+                <w:lang w:val="it-IT"/>
+              </w:rPr>
+              <w:t>j</w:t>
+            </w:r>
+            <w:r>
+              <w:rPr>
+                <w:rFonts w:ascii="BRH Malayalam Extra" w:hAnsi="BRH Malayalam Extra" w:cs="BRH Malayalam Extra"/>
+                <w:color w:val="000000"/>
+                <w:sz w:val="25"/>
+                <w:szCs w:val="40"/>
+                <w:lang w:val="it-IT"/>
+              </w:rPr>
+              <w:t>–</w:t>
+            </w:r>
+            <w:r>
+              <w:rPr>
+                <w:rFonts w:ascii="BRH Malayalam Extra" w:hAnsi="BRH Malayalam Extra" w:cs="BRH Malayalam Extra"/>
+                <w:color w:val="000000"/>
+                <w:sz w:val="32"/>
+                <w:szCs w:val="40"/>
+                <w:lang w:val="it-IT"/>
+              </w:rPr>
+              <w:t>©</w:t>
+            </w:r>
+            <w:r>
+              <w:rPr>
+                <w:rFonts w:ascii="BRH Malayalam Extra" w:hAnsi="BRH Malayalam Extra" w:cs="BRH Malayalam Extra"/>
+                <w:color w:val="000000"/>
+                <w:sz w:val="25"/>
+                <w:szCs w:val="40"/>
+                <w:lang w:val="it-IT"/>
+              </w:rPr>
+              <w:t>–</w:t>
+            </w:r>
+            <w:r>
+              <w:rPr>
+                <w:rFonts w:ascii="BRH Malayalam Extra" w:hAnsi="BRH Malayalam Extra" w:cs="BRH Malayalam Extra"/>
+                <w:color w:val="000000"/>
+                <w:sz w:val="32"/>
+                <w:szCs w:val="40"/>
+                <w:lang w:val="it-IT"/>
+              </w:rPr>
+              <w:t xml:space="preserve">. ¥j jRx—i¥t | </w:t>
+            </w:r>
+          </w:p>
+        </w:tc>
+        <w:tc>
+          <w:tcPr>
+            <w:tcW w:w="7371" w:type="dxa"/>
+          </w:tcPr>
+          <w:p>
+            <w:pPr>
+              <w:widowControl w:val="0"/>
+              <w:autoSpaceDE w:val="0"/>
+              <w:autoSpaceDN w:val="0"/>
+              <w:adjustRightInd w:val="0"/>
+              <w:spacing w:before="0" w:line="240" w:lineRule="auto"/>
+              <w:rPr>
+                <w:rFonts w:ascii="BRH Malayalam Extra" w:hAnsi="BRH Malayalam Extra" w:cs="BRH Malayalam Extra"/>
+                <w:color w:val="000000"/>
+                <w:sz w:val="32"/>
+                <w:szCs w:val="40"/>
+                <w:lang w:val="it-IT"/>
+              </w:rPr>
+            </w:pPr>
+            <w:r>
+              <w:rPr>
+                <w:rFonts w:cs="BRH Malayalam Extra"/>
+                <w:color w:val="000000"/>
+                <w:szCs w:val="40"/>
+                <w:lang w:val="it-IT"/>
+              </w:rPr>
+              <w:t>1</w:t>
+            </w:r>
+            <w:r>
+              <w:rPr>
+                <w:rFonts w:ascii="BRH Malayalam Extra" w:hAnsi="BRH Malayalam Extra" w:cs="BRH Malayalam Extra"/>
+                <w:color w:val="000000"/>
+                <w:sz w:val="32"/>
+                <w:szCs w:val="40"/>
+                <w:lang w:val="it-IT"/>
+              </w:rPr>
+              <w:t>)</w:t>
+            </w:r>
+            <w:r>
+              <w:rPr>
+                <w:rFonts w:ascii="BRH Malayalam Extra" w:hAnsi="BRH Malayalam Extra" w:cs="BRH Malayalam Extra"/>
+                <w:color w:val="000000"/>
+                <w:sz w:val="32"/>
+                <w:szCs w:val="40"/>
+                <w:lang w:val="it-IT"/>
+              </w:rPr>
+              <w:tab/>
+            </w:r>
+            <w:r>
+              <w:rPr>
+                <w:rFonts w:cs="BRH Malayalam Extra"/>
+                <w:color w:val="000000"/>
+                <w:szCs w:val="40"/>
+                <w:lang w:val="it-IT"/>
+              </w:rPr>
+              <w:t>1</w:t>
+            </w:r>
+            <w:r>
+              <w:rPr>
+                <w:rFonts w:ascii="BRH Malayalam Extra" w:hAnsi="BRH Malayalam Extra" w:cs="BRH Malayalam Extra"/>
+                <w:color w:val="000000"/>
+                <w:sz w:val="32"/>
+                <w:szCs w:val="40"/>
+                <w:lang w:val="it-IT"/>
+              </w:rPr>
+              <w:t>.</w:t>
+            </w:r>
+            <w:r>
+              <w:rPr>
+                <w:rFonts w:cs="BRH Malayalam Extra"/>
+                <w:color w:val="000000"/>
+                <w:szCs w:val="40"/>
+                <w:lang w:val="it-IT"/>
+              </w:rPr>
+              <w:t>6</w:t>
+            </w:r>
+            <w:r>
+              <w:rPr>
+                <w:rFonts w:ascii="BRH Malayalam Extra" w:hAnsi="BRH Malayalam Extra" w:cs="BRH Malayalam Extra"/>
+                <w:color w:val="000000"/>
+                <w:sz w:val="32"/>
+                <w:szCs w:val="40"/>
+                <w:lang w:val="it-IT"/>
+              </w:rPr>
+              <w:t>.</w:t>
+            </w:r>
+            <w:r>
+              <w:rPr>
+                <w:rFonts w:cs="BRH Malayalam Extra"/>
+                <w:color w:val="000000"/>
+                <w:szCs w:val="40"/>
+                <w:lang w:val="it-IT"/>
+              </w:rPr>
+              <w:t>11</w:t>
+            </w:r>
+            <w:r>
+              <w:rPr>
+                <w:rFonts w:ascii="BRH Malayalam Extra" w:hAnsi="BRH Malayalam Extra" w:cs="BRH Malayalam Extra"/>
+                <w:color w:val="000000"/>
+                <w:sz w:val="32"/>
+                <w:szCs w:val="40"/>
+                <w:lang w:val="it-IT"/>
+              </w:rPr>
+              <w:t>.</w:t>
+            </w:r>
+            <w:r>
+              <w:rPr>
+                <w:rFonts w:cs="BRH Malayalam Extra"/>
+                <w:color w:val="000000"/>
+                <w:szCs w:val="40"/>
+                <w:lang w:val="it-IT"/>
+              </w:rPr>
+              <w:t>4</w:t>
+            </w:r>
+            <w:r>
+              <w:rPr>
+                <w:rFonts w:ascii="BRH Malayalam Extra" w:hAnsi="BRH Malayalam Extra" w:cs="BRH Malayalam Extra"/>
+                <w:color w:val="000000"/>
+                <w:sz w:val="32"/>
+                <w:szCs w:val="40"/>
+                <w:lang w:val="it-IT"/>
+              </w:rPr>
+              <w:t>(</w:t>
+            </w:r>
+            <w:r>
+              <w:rPr>
+                <w:rFonts w:cs="BRH Malayalam Extra"/>
+                <w:color w:val="000000"/>
+                <w:szCs w:val="40"/>
+                <w:lang w:val="it-IT"/>
+              </w:rPr>
+              <w:t>1</w:t>
+            </w:r>
+            <w:r>
+              <w:rPr>
+                <w:rFonts w:ascii="BRH Malayalam Extra" w:hAnsi="BRH Malayalam Extra" w:cs="BRH Malayalam Extra"/>
+                <w:color w:val="000000"/>
+                <w:sz w:val="32"/>
+                <w:szCs w:val="40"/>
+                <w:lang w:val="it-IT"/>
+              </w:rPr>
+              <w:t>)-  A</w:t>
+            </w:r>
+            <w:r>
+              <w:rPr>
+                <w:rFonts w:ascii="BRH Malayalam Extra" w:hAnsi="BRH Malayalam Extra" w:cs="BRH Malayalam Extra"/>
+                <w:color w:val="000000"/>
+                <w:sz w:val="25"/>
+                <w:szCs w:val="40"/>
+                <w:lang w:val="it-IT"/>
+              </w:rPr>
+              <w:t>–</w:t>
+            </w:r>
+            <w:r>
+              <w:rPr>
+                <w:rFonts w:ascii="BRH Malayalam Extra" w:hAnsi="BRH Malayalam Extra" w:cs="BRH Malayalam Extra"/>
+                <w:color w:val="000000"/>
+                <w:sz w:val="32"/>
+                <w:szCs w:val="40"/>
+                <w:lang w:val="it-IT"/>
+              </w:rPr>
+              <w:t>R</w:t>
+            </w:r>
+            <w:r>
+              <w:rPr>
+                <w:rFonts w:ascii="BRH Malayalam Extra" w:hAnsi="BRH Malayalam Extra" w:cs="BRH Malayalam Extra"/>
+                <w:color w:val="000000"/>
+                <w:sz w:val="25"/>
+                <w:szCs w:val="40"/>
+                <w:lang w:val="it-IT"/>
+              </w:rPr>
+              <w:t>–</w:t>
+            </w:r>
+            <w:r>
+              <w:rPr>
+                <w:rFonts w:ascii="BRH Malayalam Extra" w:hAnsi="BRH Malayalam Extra" w:cs="BRH Malayalam Extra"/>
+                <w:color w:val="000000"/>
+                <w:sz w:val="32"/>
+                <w:szCs w:val="40"/>
+                <w:highlight w:val="green"/>
+                <w:lang w:val="it-IT"/>
+              </w:rPr>
+              <w:t>d</w:t>
+            </w:r>
+            <w:r>
+              <w:rPr>
+                <w:rFonts w:ascii="BRH Malayalam Extra" w:hAnsi="BRH Malayalam Extra" w:cs="BRH Malayalam Extra"/>
+                <w:color w:val="000000"/>
+                <w:sz w:val="25"/>
+                <w:szCs w:val="40"/>
+                <w:lang w:val="it-IT"/>
+              </w:rPr>
+              <w:t>–</w:t>
+            </w:r>
+            <w:r>
+              <w:rPr>
+                <w:rFonts w:ascii="BRH Malayalam Extra" w:hAnsi="BRH Malayalam Extra" w:cs="BRH Malayalam Extra"/>
+                <w:color w:val="000000"/>
+                <w:sz w:val="32"/>
+                <w:szCs w:val="40"/>
+                <w:lang w:val="it-IT"/>
+              </w:rPr>
+              <w:t>j</w:t>
+            </w:r>
+            <w:r>
+              <w:rPr>
+                <w:rFonts w:ascii="BRH Malayalam Extra" w:hAnsi="BRH Malayalam Extra" w:cs="BRH Malayalam Extra"/>
+                <w:color w:val="000000"/>
+                <w:sz w:val="25"/>
+                <w:szCs w:val="40"/>
+                <w:lang w:val="it-IT"/>
+              </w:rPr>
+              <w:t>–</w:t>
+            </w:r>
+            <w:r>
+              <w:rPr>
+                <w:rFonts w:ascii="BRH Malayalam Extra" w:hAnsi="BRH Malayalam Extra" w:cs="BRH Malayalam Extra"/>
+                <w:color w:val="000000"/>
+                <w:sz w:val="32"/>
+                <w:szCs w:val="40"/>
+                <w:lang w:val="it-IT"/>
+              </w:rPr>
+              <w:t>Ë§ | ¥j | jRx—i¥t |</w:t>
+            </w:r>
+          </w:p>
+          <w:p>
+            <w:pPr>
+              <w:widowControl w:val="0"/>
+              <w:autoSpaceDE w:val="0"/>
+              <w:autoSpaceDN w:val="0"/>
+              <w:adjustRightInd w:val="0"/>
+              <w:spacing w:before="0" w:line="240" w:lineRule="auto"/>
+              <w:rPr>
+                <w:rFonts w:ascii="BRH Malayalam Extra" w:hAnsi="BRH Malayalam Extra" w:cs="BRH Malayalam Extra"/>
+                <w:color w:val="000000"/>
+                <w:sz w:val="32"/>
+                <w:szCs w:val="40"/>
+                <w:lang w:val="it-IT"/>
+              </w:rPr>
+            </w:pPr>
+            <w:r>
+              <w:rPr>
+                <w:rFonts w:ascii="BRH Malayalam Extra" w:hAnsi="BRH Malayalam Extra" w:cs="BRH Malayalam Extra"/>
+                <w:color w:val="000000"/>
+                <w:sz w:val="32"/>
+                <w:szCs w:val="40"/>
+                <w:lang w:val="it-IT"/>
+              </w:rPr>
+              <w:t>A</w:t>
+            </w:r>
+            <w:r>
+              <w:rPr>
+                <w:rFonts w:ascii="BRH Malayalam Extra" w:hAnsi="BRH Malayalam Extra" w:cs="BRH Malayalam Extra"/>
+                <w:color w:val="000000"/>
+                <w:sz w:val="25"/>
+                <w:szCs w:val="40"/>
+                <w:lang w:val="it-IT"/>
+              </w:rPr>
+              <w:t>–</w:t>
+            </w:r>
+            <w:r>
+              <w:rPr>
+                <w:rFonts w:ascii="BRH Malayalam Extra" w:hAnsi="BRH Malayalam Extra" w:cs="BRH Malayalam Extra"/>
+                <w:color w:val="000000"/>
+                <w:sz w:val="32"/>
+                <w:szCs w:val="40"/>
+                <w:lang w:val="it-IT"/>
+              </w:rPr>
+              <w:t>R</w:t>
+            </w:r>
+            <w:r>
+              <w:rPr>
+                <w:rFonts w:ascii="BRH Malayalam Extra" w:hAnsi="BRH Malayalam Extra" w:cs="BRH Malayalam Extra"/>
+                <w:color w:val="000000"/>
+                <w:sz w:val="25"/>
+                <w:szCs w:val="40"/>
+                <w:highlight w:val="green"/>
+                <w:lang w:val="it-IT"/>
+              </w:rPr>
+              <w:t>–</w:t>
+            </w:r>
+            <w:r>
+              <w:rPr>
+                <w:rFonts w:ascii="BRH Malayalam Extra" w:hAnsi="BRH Malayalam Extra" w:cs="BRH Malayalam Extra"/>
+                <w:color w:val="000000"/>
+                <w:sz w:val="32"/>
+                <w:szCs w:val="40"/>
+                <w:highlight w:val="green"/>
+                <w:lang w:val="it-IT"/>
+              </w:rPr>
+              <w:t>d</w:t>
+            </w:r>
+            <w:r>
+              <w:rPr>
+                <w:rFonts w:ascii="BRH Malayalam Extra" w:hAnsi="BRH Malayalam Extra" w:cs="BRH Malayalam Extra"/>
+                <w:color w:val="000000"/>
+                <w:sz w:val="25"/>
+                <w:szCs w:val="40"/>
+                <w:lang w:val="it-IT"/>
+              </w:rPr>
+              <w:t>–</w:t>
+            </w:r>
+            <w:r>
+              <w:rPr>
+                <w:rFonts w:ascii="BRH Malayalam Extra" w:hAnsi="BRH Malayalam Extra" w:cs="BRH Malayalam Extra"/>
+                <w:color w:val="000000"/>
+                <w:sz w:val="32"/>
+                <w:szCs w:val="40"/>
+                <w:lang w:val="it-IT"/>
+              </w:rPr>
+              <w:t>j</w:t>
+            </w:r>
+            <w:r>
+              <w:rPr>
+                <w:rFonts w:ascii="BRH Malayalam Extra" w:hAnsi="BRH Malayalam Extra" w:cs="BRH Malayalam Extra"/>
+                <w:color w:val="000000"/>
+                <w:sz w:val="25"/>
+                <w:szCs w:val="40"/>
+                <w:lang w:val="it-IT"/>
+              </w:rPr>
+              <w:t>–</w:t>
+            </w:r>
+            <w:r>
+              <w:rPr>
+                <w:rFonts w:ascii="BRH Malayalam Extra" w:hAnsi="BRH Malayalam Extra" w:cs="BRH Malayalam Extra"/>
+                <w:color w:val="000000"/>
+                <w:sz w:val="32"/>
+                <w:szCs w:val="40"/>
+                <w:lang w:val="it-IT"/>
+              </w:rPr>
+              <w:t>©</w:t>
+            </w:r>
+            <w:r>
+              <w:rPr>
+                <w:rFonts w:ascii="BRH Malayalam Extra" w:hAnsi="BRH Malayalam Extra" w:cs="BRH Malayalam Extra"/>
+                <w:color w:val="000000"/>
+                <w:sz w:val="25"/>
+                <w:szCs w:val="40"/>
+                <w:lang w:val="it-IT"/>
+              </w:rPr>
+              <w:t>–</w:t>
+            </w:r>
+            <w:r>
+              <w:rPr>
+                <w:rFonts w:ascii="BRH Malayalam Extra" w:hAnsi="BRH Malayalam Extra" w:cs="BRH Malayalam Extra"/>
+                <w:color w:val="000000"/>
+                <w:sz w:val="32"/>
+                <w:szCs w:val="40"/>
+                <w:lang w:val="it-IT"/>
+              </w:rPr>
+              <w:t>. ¥j ¥j— „</w:t>
+            </w:r>
+            <w:r>
+              <w:rPr>
+                <w:rFonts w:ascii="BRH Malayalam Extra" w:hAnsi="BRH Malayalam Extra" w:cs="BRH Malayalam Extra"/>
+                <w:color w:val="000000"/>
+                <w:sz w:val="32"/>
+                <w:szCs w:val="40"/>
+                <w:highlight w:val="green"/>
+                <w:lang w:val="it-IT"/>
+              </w:rPr>
+              <w:t>Rdj©</w:t>
+            </w:r>
+            <w:r>
+              <w:rPr>
+                <w:rFonts w:ascii="BRH Malayalam Extra" w:hAnsi="BRH Malayalam Extra" w:cs="BRH Malayalam Extra"/>
+                <w:color w:val="000000"/>
+                <w:sz w:val="32"/>
+                <w:szCs w:val="40"/>
+                <w:lang w:val="it-IT"/>
+              </w:rPr>
+              <w:t xml:space="preserve"> </w:t>
+            </w:r>
+            <w:r>
+              <w:rPr>
+                <w:rFonts w:ascii="BRH Malayalam Extra" w:hAnsi="BRH Malayalam Extra" w:cs="BRH Malayalam Extra"/>
+                <w:color w:val="000000"/>
+                <w:sz w:val="32"/>
+                <w:szCs w:val="40"/>
+                <w:highlight w:val="green"/>
+                <w:lang w:val="it-IT"/>
+              </w:rPr>
+              <w:t>dRd</w:t>
+            </w:r>
+            <w:r>
+              <w:rPr>
+                <w:rFonts w:ascii="BRH Malayalam Extra" w:hAnsi="BRH Malayalam Extra" w:cs="BRH Malayalam Extra"/>
+                <w:color w:val="000000"/>
+                <w:sz w:val="32"/>
+                <w:szCs w:val="40"/>
+                <w:lang w:val="it-IT"/>
+              </w:rPr>
+              <w:t>j</w:t>
+            </w:r>
+            <w:r>
+              <w:rPr>
+                <w:rFonts w:ascii="BRH Malayalam Extra" w:hAnsi="BRH Malayalam Extra" w:cs="BRH Malayalam Extra"/>
+                <w:color w:val="000000"/>
+                <w:sz w:val="25"/>
+                <w:szCs w:val="40"/>
+                <w:lang w:val="it-IT"/>
+              </w:rPr>
+              <w:t>–</w:t>
+            </w:r>
+            <w:r>
+              <w:rPr>
+                <w:rFonts w:ascii="BRH Malayalam Extra" w:hAnsi="BRH Malayalam Extra" w:cs="BRH Malayalam Extra"/>
+                <w:color w:val="000000"/>
+                <w:sz w:val="32"/>
+                <w:szCs w:val="40"/>
+                <w:lang w:val="it-IT"/>
+              </w:rPr>
+              <w:t>©</w:t>
+            </w:r>
+            <w:r>
+              <w:rPr>
+                <w:rFonts w:ascii="BRH Malayalam Extra" w:hAnsi="BRH Malayalam Extra" w:cs="BRH Malayalam Extra"/>
+                <w:color w:val="000000"/>
+                <w:sz w:val="25"/>
+                <w:szCs w:val="40"/>
+                <w:lang w:val="it-IT"/>
+              </w:rPr>
+              <w:t>–</w:t>
+            </w:r>
+            <w:r>
+              <w:rPr>
+                <w:rFonts w:ascii="BRH Malayalam Extra" w:hAnsi="BRH Malayalam Extra" w:cs="BRH Malayalam Extra"/>
+                <w:color w:val="000000"/>
+                <w:sz w:val="32"/>
+                <w:szCs w:val="40"/>
+                <w:lang w:val="it-IT"/>
+              </w:rPr>
+              <w:t xml:space="preserve">. </w:t>
+            </w:r>
+            <w:r>
+              <w:rPr>
+                <w:rFonts w:ascii="BRH Malayalam Extra" w:hAnsi="BRH Malayalam Extra" w:cs="BRH Malayalam Extra"/>
+                <w:color w:val="000000"/>
+                <w:sz w:val="32"/>
+                <w:szCs w:val="40"/>
+                <w:lang w:val="it-IT"/>
+              </w:rPr>
+              <w:t xml:space="preserve">¥j </w:t>
+            </w:r>
+          </w:p>
+          <w:p>
+            <w:pPr>
+              <w:widowControl w:val="0"/>
+              <w:autoSpaceDE w:val="0"/>
+              <w:autoSpaceDN w:val="0"/>
+              <w:adjustRightInd w:val="0"/>
+              <w:spacing w:before="0" w:line="240" w:lineRule="auto"/>
+              <w:rPr>
+                <w:rFonts w:cs="BRH Malayalam Extra"/>
+                <w:color w:val="000000"/>
+                <w:szCs w:val="40"/>
+                <w:lang w:val="it-IT"/>
+              </w:rPr>
+            </w:pPr>
+            <w:r>
+              <w:rPr>
+                <w:rFonts w:ascii="BRH Malayalam Extra" w:hAnsi="BRH Malayalam Extra" w:cs="BRH Malayalam Extra"/>
+                <w:color w:val="000000"/>
+                <w:sz w:val="32"/>
+                <w:szCs w:val="40"/>
+                <w:lang w:val="it-IT"/>
+              </w:rPr>
+              <w:t>jRx—i¥t</w:t>
+            </w:r>
+            <w:r>
+              <w:rPr>
+                <w:rFonts w:ascii="BRH Malayalam Extra" w:hAnsi="BRH Malayalam Extra" w:cs="BRH Malayalam Extra"/>
+                <w:color w:val="000000"/>
+                <w:sz w:val="25"/>
+                <w:szCs w:val="40"/>
+                <w:lang w:val="it-IT"/>
+              </w:rPr>
+              <w:t>–</w:t>
+            </w:r>
+            <w:r>
+              <w:rPr>
+                <w:rFonts w:ascii="BRH Malayalam Extra" w:hAnsi="BRH Malayalam Extra" w:cs="BRH Malayalam Extra"/>
+                <w:color w:val="000000"/>
+                <w:sz w:val="32"/>
+                <w:szCs w:val="40"/>
+                <w:lang w:val="it-IT"/>
+              </w:rPr>
+              <w:t xml:space="preserve"> jRx—i¥t ¥j— „</w:t>
+            </w:r>
+            <w:r>
+              <w:rPr>
+                <w:rFonts w:ascii="BRH Malayalam Extra" w:hAnsi="BRH Malayalam Extra" w:cs="BRH Malayalam Extra"/>
+                <w:color w:val="000000"/>
+                <w:sz w:val="32"/>
+                <w:szCs w:val="40"/>
+                <w:highlight w:val="green"/>
+                <w:lang w:val="it-IT"/>
+              </w:rPr>
+              <w:t>Rdj© dRd</w:t>
+            </w:r>
+            <w:r>
+              <w:rPr>
+                <w:rFonts w:ascii="BRH Malayalam Extra" w:hAnsi="BRH Malayalam Extra" w:cs="BRH Malayalam Extra"/>
+                <w:color w:val="000000"/>
+                <w:sz w:val="32"/>
+                <w:szCs w:val="40"/>
+                <w:lang w:val="it-IT"/>
+              </w:rPr>
+              <w:t>j</w:t>
+            </w:r>
+            <w:r>
+              <w:rPr>
+                <w:rFonts w:ascii="BRH Malayalam Extra" w:hAnsi="BRH Malayalam Extra" w:cs="BRH Malayalam Extra"/>
+                <w:color w:val="000000"/>
+                <w:sz w:val="25"/>
+                <w:szCs w:val="40"/>
+                <w:lang w:val="it-IT"/>
+              </w:rPr>
+              <w:t>–</w:t>
+            </w:r>
+            <w:r>
+              <w:rPr>
+                <w:rFonts w:ascii="BRH Malayalam Extra" w:hAnsi="BRH Malayalam Extra" w:cs="BRH Malayalam Extra"/>
+                <w:color w:val="000000"/>
+                <w:sz w:val="32"/>
+                <w:szCs w:val="40"/>
+                <w:lang w:val="it-IT"/>
+              </w:rPr>
+              <w:t>©</w:t>
+            </w:r>
+            <w:r>
+              <w:rPr>
+                <w:rFonts w:ascii="BRH Malayalam Extra" w:hAnsi="BRH Malayalam Extra" w:cs="BRH Malayalam Extra"/>
+                <w:color w:val="000000"/>
+                <w:sz w:val="25"/>
+                <w:szCs w:val="40"/>
+                <w:lang w:val="it-IT"/>
+              </w:rPr>
+              <w:t>–</w:t>
+            </w:r>
+            <w:r>
+              <w:rPr>
+                <w:rFonts w:ascii="BRH Malayalam Extra" w:hAnsi="BRH Malayalam Extra" w:cs="BRH Malayalam Extra"/>
+                <w:color w:val="000000"/>
+                <w:sz w:val="32"/>
+                <w:szCs w:val="40"/>
+                <w:lang w:val="it-IT"/>
+              </w:rPr>
+              <w:t xml:space="preserve">. ¥j jRx—i¥t | </w:t>
             </w:r>
           </w:p>
         </w:tc>
@@ -20105,10 +21291,135 @@
               <w:adjustRightInd w:val="0"/>
               <w:spacing w:before="0" w:line="240" w:lineRule="auto"/>
               <w:rPr>
-                <w:rFonts w:cs="BRH Malayalam Extra"/>
+                <w:rFonts w:ascii="BRH Malayalam Extra" w:hAnsi="BRH Malayalam Extra" w:cs="BRH Malayalam Extra"/>
+                <w:sz w:val="32"/>
                 <w:szCs w:val="40"/>
               </w:rPr>
             </w:pPr>
+            <w:r>
+              <w:rPr>
+                <w:rFonts w:cs="BRH Malayalam Extra"/>
+                <w:szCs w:val="40"/>
+              </w:rPr>
+              <w:t>46</w:t>
+            </w:r>
+            <w:r>
+              <w:rPr>
+                <w:rFonts w:ascii="BRH Malayalam Extra" w:hAnsi="BRH Malayalam Extra" w:cs="BRH Malayalam Extra"/>
+                <w:sz w:val="32"/>
+                <w:szCs w:val="40"/>
+              </w:rPr>
+              <w:t>)</w:t>
+            </w:r>
+            <w:r>
+              <w:rPr>
+                <w:rFonts w:ascii="BRH Malayalam Extra" w:hAnsi="BRH Malayalam Extra" w:cs="BRH Malayalam Extra"/>
+                <w:sz w:val="32"/>
+                <w:szCs w:val="40"/>
+              </w:rPr>
+              <w:tab/>
+            </w:r>
+            <w:r>
+              <w:rPr>
+                <w:rFonts w:cs="BRH Malayalam Extra"/>
+                <w:szCs w:val="40"/>
+              </w:rPr>
+              <w:t>1</w:t>
+            </w:r>
+            <w:r>
+              <w:rPr>
+                <w:rFonts w:ascii="BRH Malayalam Extra" w:hAnsi="BRH Malayalam Extra" w:cs="BRH Malayalam Extra"/>
+                <w:sz w:val="32"/>
+                <w:szCs w:val="40"/>
+              </w:rPr>
+              <w:t>.</w:t>
+            </w:r>
+            <w:r>
+              <w:rPr>
+                <w:rFonts w:cs="BRH Malayalam Extra"/>
+                <w:szCs w:val="40"/>
+              </w:rPr>
+              <w:t>6</w:t>
+            </w:r>
+            <w:r>
+              <w:rPr>
+                <w:rFonts w:ascii="BRH Malayalam Extra" w:hAnsi="BRH Malayalam Extra" w:cs="BRH Malayalam Extra"/>
+                <w:sz w:val="32"/>
+                <w:szCs w:val="40"/>
+              </w:rPr>
+              <w:t>.</w:t>
+            </w:r>
+            <w:r>
+              <w:rPr>
+                <w:rFonts w:cs="BRH Malayalam Extra"/>
+                <w:szCs w:val="40"/>
+              </w:rPr>
+              <w:t>7</w:t>
+            </w:r>
+            <w:r>
+              <w:rPr>
+                <w:rFonts w:ascii="BRH Malayalam Extra" w:hAnsi="BRH Malayalam Extra" w:cs="BRH Malayalam Extra"/>
+                <w:sz w:val="32"/>
+                <w:szCs w:val="40"/>
+              </w:rPr>
+              <w:t>.</w:t>
+            </w:r>
+            <w:r>
+              <w:rPr>
+                <w:rFonts w:cs="BRH Malayalam Extra"/>
+                <w:szCs w:val="40"/>
+              </w:rPr>
+              <w:t>1</w:t>
+            </w:r>
+            <w:r>
+              <w:rPr>
+                <w:rFonts w:ascii="BRH Malayalam Extra" w:hAnsi="BRH Malayalam Extra" w:cs="BRH Malayalam Extra"/>
+                <w:sz w:val="32"/>
+                <w:szCs w:val="40"/>
+              </w:rPr>
+              <w:t>(</w:t>
+            </w:r>
+            <w:r>
+              <w:rPr>
+                <w:rFonts w:cs="BRH Malayalam Extra"/>
+                <w:szCs w:val="40"/>
+              </w:rPr>
+              <w:t>38</w:t>
+            </w:r>
+            <w:r>
+              <w:rPr>
+                <w:rFonts w:ascii="BRH Malayalam Extra" w:hAnsi="BRH Malayalam Extra" w:cs="BRH Malayalam Extra"/>
+                <w:sz w:val="32"/>
+                <w:szCs w:val="40"/>
+              </w:rPr>
+              <w:t>)</w:t>
+            </w:r>
+            <w:proofErr w:type="gramStart"/>
+            <w:r>
+              <w:rPr>
+                <w:rFonts w:ascii="BRH Malayalam Extra" w:hAnsi="BRH Malayalam Extra" w:cs="BRH Malayalam Extra"/>
+                <w:sz w:val="32"/>
+                <w:szCs w:val="40"/>
+              </w:rPr>
+              <w:t>-  A</w:t>
+            </w:r>
+            <w:proofErr w:type="gramEnd"/>
+            <w:r>
+              <w:rPr>
+                <w:rFonts w:ascii="BRH Malayalam Extra" w:hAnsi="BRH Malayalam Extra" w:cs="BRH Malayalam Extra"/>
+                <w:sz w:val="25"/>
+                <w:szCs w:val="40"/>
+              </w:rPr>
+              <w:t>–</w:t>
+            </w:r>
+            <w:r>
+              <w:rPr>
+                <w:rFonts w:ascii="BRH Malayalam Extra" w:hAnsi="BRH Malayalam Extra" w:cs="BRH Malayalam Extra"/>
+                <w:sz w:val="32"/>
+                <w:szCs w:val="40"/>
+              </w:rPr>
+              <w:t xml:space="preserve">²z | </w:t>
+            </w:r>
           </w:p>
           <w:p>
             <w:pPr>
@@ -20118,184 +21429,6 @@
               <w:adjustRightInd w:val="0"/>
               <w:spacing w:before="0" w:line="240" w:lineRule="auto"/>
               <w:rPr>
-                <w:rFonts w:cs="BRH Malayalam Extra"/>
-                <w:szCs w:val="40"/>
-              </w:rPr>
-            </w:pPr>
-          </w:p>
-          <w:p>
-            <w:pPr>
-              <w:widowControl w:val="0"/>
-              <w:autoSpaceDE w:val="0"/>
-              <w:autoSpaceDN w:val="0"/>
-              <w:adjustRightInd w:val="0"/>
-              <w:spacing w:before="0" w:line="240" w:lineRule="auto"/>
-              <w:rPr>
-                <w:rFonts w:cs="BRH Malayalam Extra"/>
-                <w:szCs w:val="40"/>
-              </w:rPr>
-            </w:pPr>
-          </w:p>
-          <w:p>
-            <w:pPr>
-              <w:widowControl w:val="0"/>
-              <w:autoSpaceDE w:val="0"/>
-              <w:autoSpaceDN w:val="0"/>
-              <w:adjustRightInd w:val="0"/>
-              <w:spacing w:before="0" w:line="240" w:lineRule="auto"/>
-              <w:rPr>
-                <w:rFonts w:cs="BRH Malayalam Extra"/>
-                <w:szCs w:val="40"/>
-              </w:rPr>
-            </w:pPr>
-          </w:p>
-          <w:p>
-            <w:pPr>
-              <w:widowControl w:val="0"/>
-              <w:autoSpaceDE w:val="0"/>
-              <w:autoSpaceDN w:val="0"/>
-              <w:adjustRightInd w:val="0"/>
-              <w:spacing w:before="0" w:line="240" w:lineRule="auto"/>
-              <w:rPr>
-                <w:rFonts w:ascii="BRH Malayalam Extra" w:hAnsi="BRH Malayalam Extra" w:cs="BRH Malayalam Extra"/>
-                <w:sz w:val="32"/>
-                <w:szCs w:val="40"/>
-              </w:rPr>
-            </w:pPr>
-            <w:r>
-              <w:rPr>
-                <w:rFonts w:cs="BRH Malayalam Extra"/>
-                <w:szCs w:val="40"/>
-              </w:rPr>
-              <w:lastRenderedPageBreak/>
-              <w:t>46</w:t>
-            </w:r>
-            <w:r>
-              <w:rPr>
-                <w:rFonts w:ascii="BRH Malayalam Extra" w:hAnsi="BRH Malayalam Extra" w:cs="BRH Malayalam Extra"/>
-                <w:sz w:val="32"/>
-                <w:szCs w:val="40"/>
-              </w:rPr>
-              <w:t>)</w:t>
-            </w:r>
-            <w:r>
-              <w:rPr>
-                <w:rFonts w:ascii="BRH Malayalam Extra" w:hAnsi="BRH Malayalam Extra" w:cs="BRH Malayalam Extra"/>
-                <w:sz w:val="32"/>
-                <w:szCs w:val="40"/>
-              </w:rPr>
-              <w:tab/>
-            </w:r>
-            <w:r>
-              <w:rPr>
-                <w:rFonts w:cs="BRH Malayalam Extra"/>
-                <w:szCs w:val="40"/>
-              </w:rPr>
-              <w:t>1</w:t>
-            </w:r>
-            <w:r>
-              <w:rPr>
-                <w:rFonts w:ascii="BRH Malayalam Extra" w:hAnsi="BRH Malayalam Extra" w:cs="BRH Malayalam Extra"/>
-                <w:sz w:val="32"/>
-                <w:szCs w:val="40"/>
-              </w:rPr>
-              <w:t>.</w:t>
-            </w:r>
-            <w:r>
-              <w:rPr>
-                <w:rFonts w:cs="BRH Malayalam Extra"/>
-                <w:szCs w:val="40"/>
-              </w:rPr>
-              <w:t>6</w:t>
-            </w:r>
-            <w:r>
-              <w:rPr>
-                <w:rFonts w:ascii="BRH Malayalam Extra" w:hAnsi="BRH Malayalam Extra" w:cs="BRH Malayalam Extra"/>
-                <w:sz w:val="32"/>
-                <w:szCs w:val="40"/>
-              </w:rPr>
-              <w:t>.</w:t>
-            </w:r>
-            <w:r>
-              <w:rPr>
-                <w:rFonts w:cs="BRH Malayalam Extra"/>
-                <w:szCs w:val="40"/>
-              </w:rPr>
-              <w:t>7</w:t>
-            </w:r>
-            <w:r>
-              <w:rPr>
-                <w:rFonts w:ascii="BRH Malayalam Extra" w:hAnsi="BRH Malayalam Extra" w:cs="BRH Malayalam Extra"/>
-                <w:sz w:val="32"/>
-                <w:szCs w:val="40"/>
-              </w:rPr>
-              <w:t>.</w:t>
-            </w:r>
-            <w:r>
-              <w:rPr>
-                <w:rFonts w:cs="BRH Malayalam Extra"/>
-                <w:szCs w:val="40"/>
-              </w:rPr>
-              <w:t>1</w:t>
-            </w:r>
-            <w:r>
-              <w:rPr>
-                <w:rFonts w:ascii="BRH Malayalam Extra" w:hAnsi="BRH Malayalam Extra" w:cs="BRH Malayalam Extra"/>
-                <w:sz w:val="32"/>
-                <w:szCs w:val="40"/>
-              </w:rPr>
-              <w:t>(</w:t>
-            </w:r>
-            <w:r>
-              <w:rPr>
-                <w:rFonts w:cs="BRH Malayalam Extra"/>
-                <w:szCs w:val="40"/>
-              </w:rPr>
-              <w:t>38</w:t>
-            </w:r>
-            <w:r>
-              <w:rPr>
-                <w:rFonts w:ascii="BRH Malayalam Extra" w:hAnsi="BRH Malayalam Extra" w:cs="BRH Malayalam Extra"/>
-                <w:sz w:val="32"/>
-                <w:szCs w:val="40"/>
-              </w:rPr>
-              <w:t>)</w:t>
-            </w:r>
-            <w:proofErr w:type="gramStart"/>
-            <w:r>
-              <w:rPr>
-                <w:rFonts w:ascii="BRH Malayalam Extra" w:hAnsi="BRH Malayalam Extra" w:cs="BRH Malayalam Extra"/>
-                <w:sz w:val="32"/>
-                <w:szCs w:val="40"/>
-              </w:rPr>
-              <w:t>-  A</w:t>
-            </w:r>
-            <w:proofErr w:type="gramEnd"/>
-            <w:r>
-              <w:rPr>
-                <w:rFonts w:ascii="BRH Malayalam Extra" w:hAnsi="BRH Malayalam Extra" w:cs="BRH Malayalam Extra"/>
-                <w:sz w:val="25"/>
-                <w:szCs w:val="40"/>
-              </w:rPr>
-              <w:t>–</w:t>
-            </w:r>
-            <w:r>
-              <w:rPr>
-                <w:rFonts w:ascii="BRH Malayalam Extra" w:hAnsi="BRH Malayalam Extra" w:cs="BRH Malayalam Extra"/>
-                <w:sz w:val="32"/>
-                <w:szCs w:val="40"/>
-              </w:rPr>
-              <w:t xml:space="preserve">²z | </w:t>
-            </w:r>
-          </w:p>
-          <w:p>
-            <w:pPr>
-              <w:widowControl w:val="0"/>
-              <w:autoSpaceDE w:val="0"/>
-              <w:autoSpaceDN w:val="0"/>
-              <w:adjustRightInd w:val="0"/>
-              <w:spacing w:before="0" w:line="240" w:lineRule="auto"/>
-              <w:rPr>
                 <w:rFonts w:cs="Latha"/>
                 <w:b/>
                 <w:bCs/>
@@ -20326,7 +21459,24 @@
                 <w:sz w:val="32"/>
                 <w:szCs w:val="40"/>
               </w:rPr>
-              <w:t>²z CZy— A</w:t>
+              <w:t>²z C</w:t>
+            </w:r>
+            <w:r>
+              <w:rPr>
+                <w:rFonts w:ascii="BRH Malayalam Extra" w:hAnsi="BRH Malayalam Extra" w:cs="BRH Malayalam Extra"/>
+                <w:sz w:val="32"/>
+                <w:szCs w:val="40"/>
+                <w:highlight w:val="yellow"/>
+              </w:rPr>
+              <w:t>Zy</w:t>
+            </w:r>
+            <w:r>
+              <w:rPr>
+                <w:rFonts w:ascii="BRH Malayalam Extra" w:hAnsi="BRH Malayalam Extra" w:cs="BRH Malayalam Extra"/>
+                <w:sz w:val="32"/>
+                <w:szCs w:val="40"/>
+              </w:rPr>
+              <w:t>— A</w:t>
             </w:r>
             <w:r>
               <w:rPr>
@@ -20364,69 +21514,16 @@
               <w:adjustRightInd w:val="0"/>
               <w:spacing w:before="0" w:line="240" w:lineRule="auto"/>
               <w:rPr>
-                <w:rFonts w:cs="BRH Malayalam Extra"/>
+                <w:rFonts w:ascii="BRH Malayalam Extra" w:hAnsi="BRH Malayalam Extra" w:cs="BRH Malayalam Extra"/>
+                <w:sz w:val="32"/>
                 <w:szCs w:val="40"/>
               </w:rPr>
             </w:pPr>
-          </w:p>
-          <w:p>
-            <w:pPr>
-              <w:widowControl w:val="0"/>
-              <w:autoSpaceDE w:val="0"/>
-              <w:autoSpaceDN w:val="0"/>
-              <w:adjustRightInd w:val="0"/>
-              <w:spacing w:before="0" w:line="240" w:lineRule="auto"/>
-              <w:rPr>
-                <w:rFonts w:cs="BRH Malayalam Extra"/>
-                <w:szCs w:val="40"/>
-              </w:rPr>
-            </w:pPr>
-          </w:p>
-          <w:p>
-            <w:pPr>
-              <w:widowControl w:val="0"/>
-              <w:autoSpaceDE w:val="0"/>
-              <w:autoSpaceDN w:val="0"/>
-              <w:adjustRightInd w:val="0"/>
-              <w:spacing w:before="0" w:line="240" w:lineRule="auto"/>
-              <w:rPr>
-                <w:rFonts w:cs="BRH Malayalam Extra"/>
-                <w:szCs w:val="40"/>
-              </w:rPr>
-            </w:pPr>
-          </w:p>
-          <w:p>
-            <w:pPr>
-              <w:widowControl w:val="0"/>
-              <w:autoSpaceDE w:val="0"/>
-              <w:autoSpaceDN w:val="0"/>
-              <w:adjustRightInd w:val="0"/>
-              <w:spacing w:before="0" w:line="240" w:lineRule="auto"/>
-              <w:rPr>
-                <w:rFonts w:cs="BRH Malayalam Extra"/>
-                <w:szCs w:val="40"/>
-              </w:rPr>
-            </w:pPr>
-          </w:p>
-          <w:p>
-            <w:pPr>
-              <w:widowControl w:val="0"/>
-              <w:autoSpaceDE w:val="0"/>
-              <w:autoSpaceDN w:val="0"/>
-              <w:adjustRightInd w:val="0"/>
-              <w:spacing w:before="0" w:line="240" w:lineRule="auto"/>
-              <w:rPr>
-                <w:rFonts w:ascii="BRH Malayalam Extra" w:hAnsi="BRH Malayalam Extra" w:cs="BRH Malayalam Extra"/>
-                <w:sz w:val="32"/>
-                <w:szCs w:val="40"/>
-              </w:rPr>
-            </w:pPr>
-            <w:r>
-              <w:rPr>
-                <w:rFonts w:cs="BRH Malayalam Extra"/>
-                <w:szCs w:val="40"/>
-              </w:rPr>
-              <w:lastRenderedPageBreak/>
+            <w:r>
+              <w:rPr>
+                <w:rFonts w:cs="BRH Malayalam Extra"/>
+                <w:szCs w:val="40"/>
+              </w:rPr>
               <w:t>46</w:t>
             </w:r>
             <w:r>
@@ -22670,16 +23767,7 @@
                 <w:sz w:val="32"/>
                 <w:szCs w:val="40"/>
               </w:rPr>
-              <w:t xml:space="preserve">hõ </w:t>
-            </w:r>
-            <w:r>
-              <w:rPr>
-                <w:rFonts w:ascii="BRH Malayalam Extra" w:hAnsi="BRH Malayalam Extra" w:cs="BRH Malayalam Extra"/>
-                <w:sz w:val="32"/>
-                <w:szCs w:val="40"/>
-              </w:rPr>
-              <w:lastRenderedPageBreak/>
-              <w:t>j</w:t>
+              <w:t>hõ j</w:t>
             </w:r>
             <w:r>
               <w:rPr>
@@ -22971,7 +24059,6 @@
                 <w:rFonts w:cs="BRH Malayalam Extra"/>
                 <w:szCs w:val="40"/>
               </w:rPr>
-              <w:lastRenderedPageBreak/>
               <w:t>2</w:t>
             </w:r>
             <w:r>
@@ -24183,16 +25270,7 @@
                 <w:sz w:val="32"/>
                 <w:szCs w:val="40"/>
               </w:rPr>
-              <w:t xml:space="preserve">hõ </w:t>
-            </w:r>
-            <w:r>
-              <w:rPr>
-                <w:rFonts w:ascii="BRH Malayalam Extra" w:hAnsi="BRH Malayalam Extra" w:cs="BRH Malayalam Extra"/>
-                <w:sz w:val="32"/>
-                <w:szCs w:val="40"/>
-              </w:rPr>
-              <w:lastRenderedPageBreak/>
-              <w:t>j</w:t>
+              <w:t>hõ j</w:t>
             </w:r>
             <w:r>
               <w:rPr>
@@ -27161,7 +28239,6 @@
                 <w:rFonts w:cs="BRH Malayalam Extra"/>
                 <w:szCs w:val="40"/>
               </w:rPr>
-              <w:lastRenderedPageBreak/>
               <w:t>31</w:t>
             </w:r>
             <w:r>
@@ -27513,7 +28590,16 @@
                 <w:sz w:val="32"/>
                 <w:szCs w:val="40"/>
               </w:rPr>
-              <w:t xml:space="preserve"> Zax˜ ögxÖ</w:t>
+              <w:t xml:space="preserve"> Zax˜ </w:t>
+            </w:r>
+            <w:r>
+              <w:rPr>
+                <w:rFonts w:ascii="BRH Malayalam Extra" w:hAnsi="BRH Malayalam Extra" w:cs="BRH Malayalam Extra"/>
+                <w:sz w:val="32"/>
+                <w:szCs w:val="40"/>
+              </w:rPr>
+              <w:lastRenderedPageBreak/>
+              <w:t>ögxÖ</w:t>
             </w:r>
             <w:r>
               <w:rPr>
@@ -28611,40 +29697,11 @@
                 <w:szCs w:val="40"/>
               </w:rPr>
             </w:pPr>
-          </w:p>
-          <w:p>
-            <w:pPr>
-              <w:widowControl w:val="0"/>
-              <w:autoSpaceDE w:val="0"/>
-              <w:autoSpaceDN w:val="0"/>
-              <w:adjustRightInd w:val="0"/>
-              <w:spacing w:before="0" w:line="240" w:lineRule="auto"/>
-              <w:rPr>
-                <w:rFonts w:ascii="BRH Malayalam Extra" w:hAnsi="BRH Malayalam Extra" w:cs="BRH Malayalam Extra"/>
-                <w:sz w:val="32"/>
-                <w:szCs w:val="40"/>
-              </w:rPr>
-            </w:pPr>
-          </w:p>
-          <w:p>
-            <w:pPr>
-              <w:widowControl w:val="0"/>
-              <w:autoSpaceDE w:val="0"/>
-              <w:autoSpaceDN w:val="0"/>
-              <w:adjustRightInd w:val="0"/>
-              <w:spacing w:before="0" w:line="240" w:lineRule="auto"/>
-              <w:rPr>
-                <w:rFonts w:ascii="BRH Malayalam Extra" w:hAnsi="BRH Malayalam Extra" w:cs="BRH Malayalam Extra"/>
-                <w:sz w:val="32"/>
-                <w:szCs w:val="40"/>
-              </w:rPr>
-            </w:pPr>
-            <w:r>
-              <w:rPr>
-                <w:rFonts w:cs="BRH Malayalam Extra"/>
-                <w:szCs w:val="40"/>
-              </w:rPr>
-              <w:lastRenderedPageBreak/>
+            <w:r>
+              <w:rPr>
+                <w:rFonts w:cs="BRH Malayalam Extra"/>
+                <w:szCs w:val="40"/>
+              </w:rPr>
               <w:t>34</w:t>
             </w:r>
             <w:r>
@@ -29276,7 +30333,16 @@
                 <w:sz w:val="32"/>
                 <w:szCs w:val="40"/>
               </w:rPr>
-              <w:t xml:space="preserve"> Zax˜ ögxÖ</w:t>
+              <w:t xml:space="preserve"> Zax˜ </w:t>
+            </w:r>
+            <w:r>
+              <w:rPr>
+                <w:rFonts w:ascii="BRH Malayalam Extra" w:hAnsi="BRH Malayalam Extra" w:cs="BRH Malayalam Extra"/>
+                <w:sz w:val="32"/>
+                <w:szCs w:val="40"/>
+              </w:rPr>
+              <w:lastRenderedPageBreak/>
+              <w:t>ögxÖ</w:t>
             </w:r>
             <w:r>
               <w:rPr>
@@ -30290,56 +31356,16 @@
               <w:adjustRightInd w:val="0"/>
               <w:spacing w:before="0" w:line="240" w:lineRule="auto"/>
               <w:rPr>
-                <w:rFonts w:cs="BRH Malayalam Extra"/>
+                <w:rFonts w:ascii="BRH Malayalam Extra" w:hAnsi="BRH Malayalam Extra" w:cs="BRH Malayalam Extra"/>
+                <w:sz w:val="32"/>
                 <w:szCs w:val="40"/>
               </w:rPr>
             </w:pPr>
-          </w:p>
-          <w:p>
-            <w:pPr>
-              <w:widowControl w:val="0"/>
-              <w:autoSpaceDE w:val="0"/>
-              <w:autoSpaceDN w:val="0"/>
-              <w:adjustRightInd w:val="0"/>
-              <w:spacing w:before="0" w:line="240" w:lineRule="auto"/>
-              <w:rPr>
-                <w:rFonts w:cs="BRH Malayalam Extra"/>
-                <w:szCs w:val="40"/>
-              </w:rPr>
-            </w:pPr>
-          </w:p>
-          <w:p>
-            <w:pPr>
-              <w:widowControl w:val="0"/>
-              <w:autoSpaceDE w:val="0"/>
-              <w:autoSpaceDN w:val="0"/>
-              <w:adjustRightInd w:val="0"/>
-              <w:spacing w:before="0" w:line="240" w:lineRule="auto"/>
-              <w:rPr>
-                <w:rFonts w:cs="BRH Malayalam Extra"/>
-                <w:szCs w:val="40"/>
-              </w:rPr>
-            </w:pPr>
-          </w:p>
-          <w:p>
-            <w:pPr>
-              <w:widowControl w:val="0"/>
-              <w:autoSpaceDE w:val="0"/>
-              <w:autoSpaceDN w:val="0"/>
-              <w:adjustRightInd w:val="0"/>
-              <w:spacing w:before="0" w:line="240" w:lineRule="auto"/>
-              <w:rPr>
-                <w:rFonts w:ascii="BRH Malayalam Extra" w:hAnsi="BRH Malayalam Extra" w:cs="BRH Malayalam Extra"/>
-                <w:sz w:val="32"/>
-                <w:szCs w:val="40"/>
-              </w:rPr>
-            </w:pPr>
-            <w:r>
-              <w:rPr>
-                <w:rFonts w:cs="BRH Malayalam Extra"/>
-                <w:szCs w:val="40"/>
-              </w:rPr>
-              <w:lastRenderedPageBreak/>
+            <w:r>
+              <w:rPr>
+                <w:rFonts w:cs="BRH Malayalam Extra"/>
+                <w:szCs w:val="40"/>
+              </w:rPr>
               <w:t>34</w:t>
             </w:r>
             <w:r>
@@ -30623,7 +31649,6 @@
                 <w:szCs w:val="40"/>
                 <w:lang w:val="it-IT"/>
               </w:rPr>
-              <w:lastRenderedPageBreak/>
               <w:t>21</w:t>
             </w:r>
             <w:r>
@@ -31191,6 +32216,7 @@
                 <w:szCs w:val="40"/>
                 <w:lang w:val="it-IT"/>
               </w:rPr>
+              <w:lastRenderedPageBreak/>
               <w:t>28</w:t>
             </w:r>
             <w:r>
@@ -34396,7 +35422,6 @@
                 <w:color w:val="000000"/>
                 <w:szCs w:val="40"/>
               </w:rPr>
-              <w:lastRenderedPageBreak/>
               <w:t>53</w:t>
             </w:r>
             <w:r>
@@ -35745,6 +36770,7 @@
                 <w:rFonts w:cs="BRH Malayalam Extra"/>
                 <w:szCs w:val="40"/>
               </w:rPr>
+              <w:lastRenderedPageBreak/>
               <w:t>39</w:t>
             </w:r>
             <w:r>
@@ -38826,7 +39852,6 @@
                 <w:rFonts w:cs="BRH Malayalam Extra"/>
                 <w:szCs w:val="40"/>
               </w:rPr>
-              <w:lastRenderedPageBreak/>
               <w:t>53</w:t>
             </w:r>
             <w:r>
@@ -39300,6 +40325,7 @@
           <w:szCs w:val="32"/>
           <w:u w:val="single"/>
         </w:rPr>
+        <w:lastRenderedPageBreak/>
         <w:t>TS Ghanam – TS 1.</w:t>
       </w:r>
       <w:r>
@@ -40084,6 +41110,7 @@
     <w:pPr>
       <w:pStyle w:val="Header"/>
       <w:pBdr>
+        <w:top w:val="single" w:sz="4" w:space="1" w:color="auto"/>
         <w:bottom w:val="single" w:sz="4" w:space="1" w:color="auto"/>
       </w:pBdr>
     </w:pPr>
@@ -40092,6 +41119,7 @@
     <w:pPr>
       <w:pStyle w:val="Header"/>
       <w:pBdr>
+        <w:top w:val="single" w:sz="4" w:space="1" w:color="auto"/>
         <w:bottom w:val="single" w:sz="4" w:space="1" w:color="auto"/>
       </w:pBdr>
     </w:pPr>

</xml_diff>